<commit_message>
Separate Nguyen HAIVN/BIDMC into distinct affiliations
Split into 6 affiliations: HSPH, Georgetown, HAIVN, BIDMC, HMS, BWH

Co-Authored-By: Claude Opus 4.6 <noreply@anthropic.com>
</commit_message>
<xml_diff>
--- a/manuscript/main.docx
+++ b/manuscript/main.docx
@@ -197,6 +197,15 @@
             <m:r>
               <m:t>3</m:t>
             </m:r>
+            <m:r>
+              <m:rPr>
+                <m:sty m:val="p"/>
+              </m:rPr>
+              <m:t>,</m:t>
+            </m:r>
+            <m:r>
+              <m:t>4</m:t>
+            </m:r>
           </m:sup>
         </m:sSup>
       </m:oMath>
@@ -224,7 +233,7 @@
           </m:e>
           <m:sup>
             <m:r>
-              <m:t>4</m:t>
+              <m:t>5</m:t>
             </m:r>
             <m:r>
               <m:rPr>
@@ -233,7 +242,7 @@
               <m:t>,</m:t>
             </m:r>
             <m:r>
-              <m:t>5</m:t>
+              <m:t>6</m:t>
             </m:r>
           </m:sup>
         </m:sSup>
@@ -425,42 +434,6 @@
         <w:t xml:space="preserve"> </w:t>
       </w:r>
       <w:r>
-        <w:t xml:space="preserve">Beth</w:t>
-      </w:r>
-      <w:r>
-        <w:t xml:space="preserve"> </w:t>
-      </w:r>
-      <w:r>
-        <w:t xml:space="preserve">Israel</w:t>
-      </w:r>
-      <w:r>
-        <w:t xml:space="preserve"> </w:t>
-      </w:r>
-      <w:r>
-        <w:t xml:space="preserve">Deaconess</w:t>
-      </w:r>
-      <w:r>
-        <w:t xml:space="preserve"> </w:t>
-      </w:r>
-      <w:r>
-        <w:t xml:space="preserve">Medical</w:t>
-      </w:r>
-      <w:r>
-        <w:t xml:space="preserve"> </w:t>
-      </w:r>
-      <w:r>
-        <w:t xml:space="preserve">Center</w:t>
-      </w:r>
-      <w:r>
-        <w:t xml:space="preserve"> </w:t>
-      </w:r>
-      <w:r>
-        <w:t xml:space="preserve">(BIDMC),</w:t>
-      </w:r>
-      <w:r>
-        <w:t xml:space="preserve"> </w:t>
-      </w:r>
-      <w:r>
         <w:t xml:space="preserve">Hanoi,</w:t>
       </w:r>
       <w:r>
@@ -490,7 +463,19 @@
         <w:t xml:space="preserve"> </w:t>
       </w:r>
       <w:r>
-        <w:t xml:space="preserve">Harvard</w:t>
+        <w:t xml:space="preserve">Beth</w:t>
+      </w:r>
+      <w:r>
+        <w:t xml:space="preserve"> </w:t>
+      </w:r>
+      <w:r>
+        <w:t xml:space="preserve">Israel</w:t>
+      </w:r>
+      <w:r>
+        <w:t xml:space="preserve"> </w:t>
+      </w:r>
+      <w:r>
+        <w:t xml:space="preserve">Deaconess</w:t>
       </w:r>
       <w:r>
         <w:t xml:space="preserve"> </w:t>
@@ -502,7 +487,13 @@
         <w:t xml:space="preserve"> </w:t>
       </w:r>
       <w:r>
-        <w:t xml:space="preserve">School,</w:t>
+        <w:t xml:space="preserve">Center</w:t>
+      </w:r>
+      <w:r>
+        <w:t xml:space="preserve"> </w:t>
+      </w:r>
+      <w:r>
+        <w:t xml:space="preserve">(BIDMC),</w:t>
       </w:r>
       <w:r>
         <w:t xml:space="preserve"> </w:t>
@@ -535,6 +526,59 @@
           <m:sup>
             <m:r>
               <m:t>5</m:t>
+            </m:r>
+          </m:sup>
+        </m:sSup>
+      </m:oMath>
+      <w:r>
+        <w:t xml:space="preserve"> </w:t>
+      </w:r>
+      <w:r>
+        <w:t xml:space="preserve">Harvard</w:t>
+      </w:r>
+      <w:r>
+        <w:t xml:space="preserve"> </w:t>
+      </w:r>
+      <w:r>
+        <w:t xml:space="preserve">Medical</w:t>
+      </w:r>
+      <w:r>
+        <w:t xml:space="preserve"> </w:t>
+      </w:r>
+      <w:r>
+        <w:t xml:space="preserve">School,</w:t>
+      </w:r>
+      <w:r>
+        <w:t xml:space="preserve"> </w:t>
+      </w:r>
+      <w:r>
+        <w:t xml:space="preserve">Boston,</w:t>
+      </w:r>
+      <w:r>
+        <w:t xml:space="preserve"> </w:t>
+      </w:r>
+      <w:r>
+        <w:t xml:space="preserve">MA,</w:t>
+      </w:r>
+      <w:r>
+        <w:t xml:space="preserve"> </w:t>
+      </w:r>
+      <w:r>
+        <w:t xml:space="preserve">USA</w:t>
+      </w:r>
+      <w:r>
+        <w:br/>
+      </w:r>
+      <m:oMath>
+        <m:sSup>
+          <m:e>
+            <m:r>
+              <m:t>​</m:t>
+            </m:r>
+          </m:e>
+          <m:sup>
+            <m:r>
+              <m:t>6</m:t>
             </m:r>
           </m:sup>
         </m:sSup>

</xml_diff>

<commit_message>
Replace MCQ panel with direct Vietnamese LLM grading
- Add classify_vn.py: grades rubric items directly from Vietnamese
  transcripts (no translation step), using Claude Haiku 4.5
- Update compile.py to compute claude_vn_pct alongside claude_pct
- Replace Figure 2 Panel D: was MCQ score (rho=0.07), now shows
  Vietnamese direct grading (rho=0.51) vs human-coded checklist
- Update manuscript text: abstract, results, discussion, methods
  to reflect new finding that translation is not required
- Key result: Vietnamese direct (rho=0.51) matches English (rho=0.53)

Co-Authored-By: Claude Opus 4.6 <noreply@anthropic.com>
</commit_message>
<xml_diff>
--- a/manuscript/main.docx
+++ b/manuscript/main.docx
@@ -1127,7 +1127,7 @@
         <w:t xml:space="preserve"> </w:t>
       </w:r>
       <w:r>
-        <w:t xml:space="preserve">0.49–0.59).</w:t>
+        <w:t xml:space="preserve">0.55–0.60).</w:t>
       </w:r>
       <w:r>
         <w:t xml:space="preserve"> </w:t>
@@ -1169,43 +1169,37 @@
         <w:t xml:space="preserve"> </w:t>
       </w:r>
       <w:r>
+        <w:t xml:space="preserve">translated</w:t>
+      </w:r>
+      <w:r>
+        <w:t xml:space="preserve"> </w:t>
+      </w:r>
+      <w:r>
+        <w:t xml:space="preserve">English</w:t>
+      </w:r>
+      <w:r>
+        <w:t xml:space="preserve"> </w:t>
+      </w:r>
+      <w:r>
         <w:t xml:space="preserve">transcripts</w:t>
       </w:r>
       <w:r>
         <w:t xml:space="preserve"> </w:t>
       </w:r>
       <w:r>
-        <w:t xml:space="preserve">was</w:t>
-      </w:r>
-      <w:r>
-        <w:t xml:space="preserve"> </w:t>
-      </w:r>
-      <w:r>
-        <w:t xml:space="preserve">feasible</w:t>
-      </w:r>
-      <w:r>
-        <w:t xml:space="preserve"> </w:t>
-      </w:r>
-      <w:r>
-        <w:t xml:space="preserve">but</w:t>
-      </w:r>
-      <w:r>
-        <w:t xml:space="preserve"> </w:t>
-      </w:r>
-      <w:r>
-        <w:t xml:space="preserve">noisy</w:t>
-      </w:r>
-      <w:r>
-        <w:t xml:space="preserve"> </w:t>
-      </w:r>
-      <w:r>
-        <w:t xml:space="preserve">relative</w:t>
-      </w:r>
-      <w:r>
-        <w:t xml:space="preserve"> </w:t>
-      </w:r>
-      <w:r>
-        <w:t xml:space="preserve">to</w:t>
+        <w:t xml:space="preserve">correlated</w:t>
+      </w:r>
+      <w:r>
+        <w:t xml:space="preserve"> </w:t>
+      </w:r>
+      <w:r>
+        <w:t xml:space="preserve">moderately</w:t>
+      </w:r>
+      <w:r>
+        <w:t xml:space="preserve"> </w:t>
+      </w:r>
+      <w:r>
+        <w:t xml:space="preserve">with</w:t>
       </w:r>
       <w:r>
         <w:t xml:space="preserve"> </w:t>
@@ -1240,73 +1234,78 @@
         <w:t xml:space="preserve"> </w:t>
       </w:r>
       <w:r>
-        <w:t xml:space="preserve">0.35).</w:t>
-      </w:r>
-      <w:r>
-        <w:t xml:space="preserve"> </w:t>
-      </w:r>
-      <w:r>
-        <w:t xml:space="preserve">Multiple-choice</w:t>
-      </w:r>
-      <w:r>
-        <w:t xml:space="preserve"> </w:t>
-      </w:r>
-      <w:r>
-        <w:t xml:space="preserve">knowledge</w:t>
-      </w:r>
-      <w:r>
-        <w:t xml:space="preserve"> </w:t>
-      </w:r>
-      <w:r>
-        <w:t xml:space="preserve">test</w:t>
-      </w:r>
-      <w:r>
-        <w:t xml:space="preserve"> </w:t>
-      </w:r>
-      <w:r>
-        <w:t xml:space="preserve">scores</w:t>
-      </w:r>
-      <w:r>
-        <w:t xml:space="preserve"> </w:t>
-      </w:r>
-      <w:r>
-        <w:t xml:space="preserve">showed</w:t>
-      </w:r>
-      <w:r>
-        <w:t xml:space="preserve"> </w:t>
-      </w:r>
-      <w:r>
-        <w:t xml:space="preserve">no</w:t>
-      </w:r>
-      <w:r>
-        <w:t xml:space="preserve"> </w:t>
-      </w:r>
-      <w:r>
-        <w:t xml:space="preserve">significant</w:t>
-      </w:r>
-      <w:r>
-        <w:t xml:space="preserve"> </w:t>
-      </w:r>
-      <w:r>
-        <w:t xml:space="preserve">correlation</w:t>
-      </w:r>
-      <w:r>
-        <w:t xml:space="preserve"> </w:t>
-      </w:r>
-      <w:r>
-        <w:t xml:space="preserve">with</w:t>
-      </w:r>
-      <w:r>
-        <w:t xml:space="preserve"> </w:t>
-      </w:r>
-      <w:r>
-        <w:t xml:space="preserve">vignette</w:t>
-      </w:r>
-      <w:r>
-        <w:t xml:space="preserve"> </w:t>
-      </w:r>
-      <w:r>
-        <w:t xml:space="preserve">performance,</w:t>
+        <w:t xml:space="preserve">0.53),</w:t>
+      </w:r>
+      <w:r>
+        <w:t xml:space="preserve"> </w:t>
+      </w:r>
+      <w:r>
+        <w:t xml:space="preserve">and</w:t>
+      </w:r>
+      <w:r>
+        <w:t xml:space="preserve"> </w:t>
+      </w:r>
+      <w:r>
+        <w:t xml:space="preserve">coding</w:t>
+      </w:r>
+      <w:r>
+        <w:t xml:space="preserve"> </w:t>
+      </w:r>
+      <w:r>
+        <w:t xml:space="preserve">directly</w:t>
+      </w:r>
+      <w:r>
+        <w:t xml:space="preserve"> </w:t>
+      </w:r>
+      <w:r>
+        <w:t xml:space="preserve">from</w:t>
+      </w:r>
+      <w:r>
+        <w:t xml:space="preserve"> </w:t>
+      </w:r>
+      <w:r>
+        <w:t xml:space="preserve">Vietnamese</w:t>
+      </w:r>
+      <w:r>
+        <w:t xml:space="preserve"> </w:t>
+      </w:r>
+      <w:r>
+        <w:t xml:space="preserve">transcripts</w:t>
+      </w:r>
+      <w:r>
+        <w:t xml:space="preserve"> </w:t>
+      </w:r>
+      <w:r>
+        <w:t xml:space="preserve">performed</w:t>
+      </w:r>
+      <w:r>
+        <w:t xml:space="preserve"> </w:t>
+      </w:r>
+      <w:r>
+        <w:t xml:space="preserve">comparably</w:t>
+      </w:r>
+      <w:r>
+        <w:t xml:space="preserve"> </w:t>
+      </w:r>
+      <w:r>
+        <w:t xml:space="preserve">(</w:t>
+      </w:r>
+      <m:oMath>
+        <m:r>
+          <m:t>ρ</m:t>
+        </m:r>
+      </m:oMath>
+      <w:r>
+        <w:t xml:space="preserve"> </w:t>
+      </w:r>
+      <w:r>
+        <w:t xml:space="preserve">=</w:t>
+      </w:r>
+      <w:r>
+        <w:t xml:space="preserve"> </w:t>
+      </w:r>
+      <w:r>
+        <w:t xml:space="preserve">0.51),</w:t>
       </w:r>
       <w:r>
         <w:t xml:space="preserve"> </w:t>
@@ -1318,43 +1317,55 @@
         <w:t xml:space="preserve"> </w:t>
       </w:r>
       <w:r>
-        <w:t xml:space="preserve">the</w:t>
-      </w:r>
-      <w:r>
-        <w:t xml:space="preserve"> </w:t>
-      </w:r>
-      <w:r>
-        <w:t xml:space="preserve">tool</w:t>
-      </w:r>
-      <w:r>
-        <w:t xml:space="preserve"> </w:t>
-      </w:r>
-      <w:r>
-        <w:t xml:space="preserve">measures</w:t>
-      </w:r>
-      <w:r>
-        <w:t xml:space="preserve"> </w:t>
-      </w:r>
-      <w:r>
-        <w:t xml:space="preserve">distinct</w:t>
-      </w:r>
-      <w:r>
-        <w:t xml:space="preserve"> </w:t>
-      </w:r>
-      <w:r>
-        <w:t xml:space="preserve">dimensions</w:t>
-      </w:r>
-      <w:r>
-        <w:t xml:space="preserve"> </w:t>
-      </w:r>
-      <w:r>
-        <w:t xml:space="preserve">of</w:t>
-      </w:r>
-      <w:r>
-        <w:t xml:space="preserve"> </w:t>
-      </w:r>
-      <w:r>
-        <w:t xml:space="preserve">competency.</w:t>
+        <w:t xml:space="preserve">that</w:t>
+      </w:r>
+      <w:r>
+        <w:t xml:space="preserve"> </w:t>
+      </w:r>
+      <w:r>
+        <w:t xml:space="preserve">a</w:t>
+      </w:r>
+      <w:r>
+        <w:t xml:space="preserve"> </w:t>
+      </w:r>
+      <w:r>
+        <w:t xml:space="preserve">separate</w:t>
+      </w:r>
+      <w:r>
+        <w:t xml:space="preserve"> </w:t>
+      </w:r>
+      <w:r>
+        <w:t xml:space="preserve">translation</w:t>
+      </w:r>
+      <w:r>
+        <w:t xml:space="preserve"> </w:t>
+      </w:r>
+      <w:r>
+        <w:t xml:space="preserve">step</w:t>
+      </w:r>
+      <w:r>
+        <w:t xml:space="preserve"> </w:t>
+      </w:r>
+      <w:r>
+        <w:t xml:space="preserve">may</w:t>
+      </w:r>
+      <w:r>
+        <w:t xml:space="preserve"> </w:t>
+      </w:r>
+      <w:r>
+        <w:t xml:space="preserve">not</w:t>
+      </w:r>
+      <w:r>
+        <w:t xml:space="preserve"> </w:t>
+      </w:r>
+      <w:r>
+        <w:t xml:space="preserve">be</w:t>
+      </w:r>
+      <w:r>
+        <w:t xml:space="preserve"> </w:t>
+      </w:r>
+      <w:r>
+        <w:t xml:space="preserve">necessary.</w:t>
       </w:r>
       <w:r>
         <w:t xml:space="preserve"> </w:t>
@@ -1695,7 +1706,7 @@
         <w:pStyle w:val="FirstParagraph"/>
       </w:pPr>
       <w:r>
-        <w:t xml:space="preserve">Measuring the clinical skills of healthcare providers is essential for improving the quality of care, but current survey methods are expensive and require trained enumerators to travel to health facilities in person. We developed a new approach that uses large language models – the artificial intelligence technology behind tools like ChatGPT – to simulate patients in realistic clinical conversations that healthcare providers can complete on their own phones or laptops. In Vietnam, we tested this tool with 31 physicians across ten clinical scenarios. Providers found the simulated patient conversations realistic and easy to use. When we compared the results from our tool against expert physician ratings of the same conversations, the scores agreed well, suggesting the tool produces meaningful measures of clinical skill. We also tested whether AI could automatically score the conversations, which was feasible but noisy. This tool costs less than two US dollars for over a hundred consultations and requires no in-person surveyors, making it potentially transformative for routine, large-scale monitoring of healthcare quality in resource-limited settings. The platform and code are openly available for adaptation.</w:t>
+        <w:t xml:space="preserve">Measuring the clinical skills of healthcare providers is essential for improving the quality of care, but current survey methods are expensive and require trained enumerators to travel to health facilities in person. We developed a new approach that uses large language models – the artificial intelligence technology behind tools like ChatGPT – to simulate patients in realistic clinical conversations that healthcare providers can complete on their own phones or laptops. In Vietnam, we tested this tool with 31 physicians across ten clinical scenarios. Providers found the simulated patient conversations realistic and easy to use. When we compared the results from our tool against expert physician ratings of the same conversations, the scores agreed well, suggesting the tool produces meaningful measures of clinical skill. We also tested whether AI could automatically score the conversations, which showed moderate agreement with human scoring – and performed nearly as well when scoring directly from Vietnamese, without requiring a separate translation step. This tool costs less than two US dollars for over a hundred consultations and requires no in-person surveyors, making it potentially transformative for routine, large-scale monitoring of healthcare quality in resource-limited settings. The platform and code are openly available for adaptation.</w:t>
       </w:r>
     </w:p>
     <w:bookmarkEnd w:id="20"/>
@@ -3213,7 +3224,7 @@
         <w:pStyle w:val="BodyText"/>
       </w:pPr>
       <w:r>
-        <w:t xml:space="preserve">The LLM-automated coding was less strongly correlated with the human coding compared to the expert evaluations, and had substantially more statistical noise (Pearson’s</w:t>
+        <w:t xml:space="preserve">The LLM-automated coding from translated English transcripts was moderately correlated with the human coding (Pearson’s</w:t>
       </w:r>
       <w:r>
         <w:t xml:space="preserve"> </w:t>
@@ -3227,7 +3238,7 @@
         <w:t xml:space="preserve"> </w:t>
       </w:r>
       <w:r>
-        <w:t xml:space="preserve">= 0.35; OLS</w:t>
+        <w:t xml:space="preserve">= 0.53; OLS</w:t>
       </w:r>
       <w:r>
         <w:t xml:space="preserve"> </w:t>
@@ -3250,7 +3261,7 @@
         <w:t xml:space="preserve"> </w:t>
       </w:r>
       <w:r>
-        <w:t xml:space="preserve">= 0.12). The correlation was statistically significant in regression against the human ground truth, with a 10 p.p. increase in the human-coded essential diagnostic checklist predicting a 1.7 p.p. increase in the LLM-coded checklist (</w:t>
+        <w:t xml:space="preserve">= 0.28), with a 10 p.p. increase in the human-coded essential diagnostic checklist predicting a 5.9 p.p. increase in the LLM-coded checklist (</w:t>
       </w:r>
       <w:r>
         <w:rPr>
@@ -3277,7 +3288,7 @@
         </w:r>
       </w:hyperlink>
       <w:r>
-        <w:t xml:space="preserve">, Panel C). Finally, the multiple-choice question (MCQ) knowledge score for matched hepatitis cases had no statistically significant correlation with the essential diagnostic completion for the same cases (Pearson’s</w:t>
+        <w:t xml:space="preserve">, Panel C). When the LLM coded directly from the original Vietnamese transcripts – without a separate translation step – performance was comparable (Pearson’s</w:t>
       </w:r>
       <w:r>
         <w:t xml:space="preserve"> </w:t>
@@ -3291,7 +3302,7 @@
         <w:t xml:space="preserve"> </w:t>
       </w:r>
       <w:r>
-        <w:t xml:space="preserve">= 0.07; OLS</w:t>
+        <w:t xml:space="preserve">= 0.51; OLS</w:t>
       </w:r>
       <w:r>
         <w:t xml:space="preserve"> </w:t>
@@ -3313,19 +3324,8 @@
       <w:r>
         <w:t xml:space="preserve"> </w:t>
       </w:r>
-      <m:oMath>
-        <m:r>
-          <m:rPr>
-            <m:sty m:val="p"/>
-          </m:rPr>
-          <m:t>&lt;</m:t>
-        </m:r>
-      </m:oMath>
-      <w:r>
-        <w:t xml:space="preserve"> </w:t>
-      </w:r>
-      <w:r>
-        <w:t xml:space="preserve">0.01;</w:t>
+      <w:r>
+        <w:t xml:space="preserve">= 0.26;</w:t>
       </w:r>
       <w:r>
         <w:t xml:space="preserve"> </w:t>
@@ -3355,7 +3355,7 @@
         </w:r>
       </w:hyperlink>
       <w:r>
-        <w:t xml:space="preserve">, Panel D).</w:t>
+        <w:t xml:space="preserve">, Panel D), suggesting that translation is not a binding constraint for multilingual deployment.</w:t>
       </w:r>
     </w:p>
     <w:p>
@@ -3469,7 +3469,7 @@
         <w:pStyle w:val="ImageCaption"/>
       </w:pPr>
       <w:r>
-        <w:t xml:space="preserve">Validation of essential diagnostic checklist scores. Panel A: Expert rating in original Vietnamese vs. human-coded checklist completion. Panel B: Expert rating in translated English vs. human-coded checklist completion. Panel C: Claude-coded checklist vs. human-coded checklist. Panel D: Multiple-choice knowledge score vs. human-coded checklist (hepatitis cases only). Each point is one provider–case interaction. Lines show OLS fit with 95% confidence interval.</w:t>
+        <w:t xml:space="preserve">Validation of essential diagnostic checklist scores. Panel A: Expert rating in original Vietnamese vs. human-coded checklist completion. Panel B: Expert rating in translated English vs. human-coded checklist completion. Panel C: Claude-coded checklist (from translated English) vs. human-coded checklist. Panel D: Claude-coded checklist (directly from Vietnamese) vs. human-coded checklist. Each point is one provider–case interaction. Lines show OLS fit with 95% confidence interval.</w:t>
       </w:r>
     </w:p>
     <w:p>
@@ -3568,7 +3568,7 @@
         <w:t xml:space="preserve"> </w:t>
       </w:r>
       <w:r>
-        <w:t xml:space="preserve">= 0.49–0.59). The method eliminates the need for in-person enumerators while preserving the open-ended interaction format that is the foundation of vignette validity</w:t>
+        <w:t xml:space="preserve">= 0.55–0.60). The method eliminates the need for in-person enumerators while preserving the open-ended interaction format that is the foundation of vignette validity</w:t>
       </w:r>
       <w:r>
         <w:t xml:space="preserve"> </w:t>
@@ -3594,7 +3594,7 @@
         <w:pStyle w:val="BodyText"/>
       </w:pPr>
       <w:r>
-        <w:t xml:space="preserve">We found that the Anthropic Claude LLM was able to extract structured data from transcripts to our specifications, and that these data correlated weakly but significantly with human-coded ground truth (Pearson’s</w:t>
+        <w:t xml:space="preserve">We found that the Anthropic Claude LLM was able to extract structured data from transcripts to our specifications, and that these data correlated moderately with human-coded ground truth (Pearson’s</w:t>
       </w:r>
       <w:r>
         <w:t xml:space="preserve"> </w:t>
@@ -3608,7 +3608,7 @@
         <w:t xml:space="preserve"> </w:t>
       </w:r>
       <w:r>
-        <w:t xml:space="preserve">= 0.35; OLS</w:t>
+        <w:t xml:space="preserve">= 0.53; OLS</w:t>
       </w:r>
       <w:r>
         <w:t xml:space="preserve"> </w:t>
@@ -3631,72 +3631,7 @@
         <w:t xml:space="preserve"> </w:t>
       </w:r>
       <w:r>
-        <w:t xml:space="preserve">= 0.12). The low mean sensitivity (0.31) suggests that the LLM frequently fails to detect actions that providers actually performed, which would systematically underestimate competency if used without human review. This pattern is consistent with recent benchmarks of LLM-based clinical scoring, where automated systems achieve moderate agreement with human evaluators but struggle with nuanced interpretation of free-text responses</w:t>
-      </w:r>
-      <w:r>
-        <w:t xml:space="preserve"> </w:t>
-      </w:r>
-      <w:r>
-        <w:t xml:space="preserve">(Geathers et al. 2025; Kuling et al. 2026)</w:t>
-      </w:r>
-      <w:r>
-        <w:t xml:space="preserve">. While LLM-assisted translation and human data extraction was not excessively burdensome at this scale, further research on the reliability and cost of automated data extraction may streamline data encoding at larger scales. Automated data extraction also preserves complete data in the form of transcripts and could enable future refinement or modification of checklists to fit the research purpose, rather than pre-encoding the data structure. Future research might also assess more expensive models, such as modern</w:t>
-      </w:r>
-      <w:r>
-        <w:t xml:space="preserve"> </w:t>
-      </w:r>
-      <w:r>
-        <w:t xml:space="preserve">“</w:t>
-      </w:r>
-      <w:r>
-        <w:t xml:space="preserve">reasoning</w:t>
-      </w:r>
-      <w:r>
-        <w:t xml:space="preserve">”</w:t>
-      </w:r>
-      <w:r>
-        <w:t xml:space="preserve"> </w:t>
-      </w:r>
-      <w:r>
-        <w:t xml:space="preserve">models, or develop a multi-shot</w:t>
-      </w:r>
-      <w:r>
-        <w:t xml:space="preserve"> </w:t>
-      </w:r>
-      <w:r>
-        <w:t xml:space="preserve">“</w:t>
-      </w:r>
-      <w:r>
-        <w:t xml:space="preserve">voting</w:t>
-      </w:r>
-      <w:r>
-        <w:t xml:space="preserve">”</w:t>
-      </w:r>
-      <w:r>
-        <w:t xml:space="preserve"> </w:t>
-      </w:r>
-      <w:r>
-        <w:t xml:space="preserve">algorithm to overcome some of its variability.</w:t>
-      </w:r>
-    </w:p>
-    <w:p>
-      <w:pPr>
-        <w:pStyle w:val="BodyText"/>
-      </w:pPr>
-      <w:r>
-        <w:t xml:space="preserve">Our approach extends the emerging literature on LLM-based virtual patients</w:t>
-      </w:r>
-      <w:r>
-        <w:t xml:space="preserve"> </w:t>
-      </w:r>
-      <w:r>
-        <w:t xml:space="preserve">(Zeng et al. 2025; Cook et al. 2025)</w:t>
-      </w:r>
-      <w:r>
-        <w:t xml:space="preserve"> </w:t>
-      </w:r>
-      <w:r>
-        <w:t xml:space="preserve">in two important ways. First, whereas most existing applications target medical students in high-income educational settings, we demonstrate feasibility for health workforce assessment among practicing providers in a low- and middle-income country context. Second, we validate the resulting competency scores against independent expert clinician ratings and a traditional knowledge test, providing evidence that LLM-based vignettes measure meaningful dimensions of clinical competence. The null correlation between vignette performance and multiple-choice knowledge scores (</w:t>
+        <w:t xml:space="preserve">= 0.28). Notably, LLM coding performed comparably when applied directly to Vietnamese transcripts (</w:t>
       </w:r>
       <m:oMath>
         <m:r>
@@ -3707,16 +3642,75 @@
         <w:t xml:space="preserve"> </w:t>
       </w:r>
       <w:r>
-        <w:t xml:space="preserve">= 0.07) is consistent with earlier findings that open-ended vignettes capture diagnostic reasoning processes distinct from factual recall</w:t>
-      </w:r>
-      <w:r>
-        <w:t xml:space="preserve"> </w:t>
-      </w:r>
-      <w:r>
-        <w:t xml:space="preserve">(Das and Hammer 2005)</w:t>
-      </w:r>
-      <w:r>
-        <w:t xml:space="preserve">, though we note that this finding is based on a small sample (22 providers) and should be interpreted with caution. Future directions for tool refinement may include incorporating audio or video patient profiles to enhance realism through non-verbal cues.</w:t>
+        <w:t xml:space="preserve">= 0.51;</w:t>
+      </w:r>
+      <w:r>
+        <w:t xml:space="preserve"> </w:t>
+      </w:r>
+      <m:oMath>
+        <m:sSup>
+          <m:e>
+            <m:r>
+              <m:t>r</m:t>
+            </m:r>
+          </m:e>
+          <m:sup>
+            <m:r>
+              <m:t>2</m:t>
+            </m:r>
+          </m:sup>
+        </m:sSup>
+      </m:oMath>
+      <w:r>
+        <w:t xml:space="preserve"> </w:t>
+      </w:r>
+      <w:r>
+        <w:t xml:space="preserve">= 0.26), without a separate translation step. This finding has practical significance: it suggests that multilingual deployment does not require an intermediate translation pipeline, reducing both cost and potential for translation-induced error. This pattern is consistent with recent benchmarks of LLM-based clinical scoring, where automated systems achieve moderate agreement with human evaluators but struggle with nuanced interpretation of free-text responses</w:t>
+      </w:r>
+      <w:r>
+        <w:t xml:space="preserve"> </w:t>
+      </w:r>
+      <w:r>
+        <w:t xml:space="preserve">(Geathers et al. 2025; Kuling et al. 2026)</w:t>
+      </w:r>
+      <w:r>
+        <w:t xml:space="preserve">. While LLM-assisted translation and human data extraction was not excessively burdensome at this scale, further research on the reliability and cost of automated data extraction may streamline data encoding at larger scales. Automated data extraction also preserves complete data in the form of transcripts and could enable future refinement or modification of checklists to fit the research purpose, rather than pre-encoding the data structure. Future research might also assess more expensive models, such as modern</w:t>
+      </w:r>
+      <w:r>
+        <w:t xml:space="preserve"> </w:t>
+      </w:r>
+      <w:r>
+        <w:t xml:space="preserve">“</w:t>
+      </w:r>
+      <w:r>
+        <w:t xml:space="preserve">reasoning</w:t>
+      </w:r>
+      <w:r>
+        <w:t xml:space="preserve">”</w:t>
+      </w:r>
+      <w:r>
+        <w:t xml:space="preserve"> </w:t>
+      </w:r>
+      <w:r>
+        <w:t xml:space="preserve">models, or develop a multi-shot</w:t>
+      </w:r>
+      <w:r>
+        <w:t xml:space="preserve"> </w:t>
+      </w:r>
+      <w:r>
+        <w:t xml:space="preserve">“</w:t>
+      </w:r>
+      <w:r>
+        <w:t xml:space="preserve">voting</w:t>
+      </w:r>
+      <w:r>
+        <w:t xml:space="preserve">”</w:t>
+      </w:r>
+      <w:r>
+        <w:t xml:space="preserve"> </w:t>
+      </w:r>
+      <w:r>
+        <w:t xml:space="preserve">algorithm to overcome some of its variability.</w:t>
       </w:r>
     </w:p>
     <w:p>
@@ -3724,6 +3718,26 @@
         <w:pStyle w:val="BodyText"/>
       </w:pPr>
       <w:r>
+        <w:t xml:space="preserve">Our approach extends the emerging literature on LLM-based virtual patients</w:t>
+      </w:r>
+      <w:r>
+        <w:t xml:space="preserve"> </w:t>
+      </w:r>
+      <w:r>
+        <w:t xml:space="preserve">(Zeng et al. 2025; Cook et al. 2025)</w:t>
+      </w:r>
+      <w:r>
+        <w:t xml:space="preserve"> </w:t>
+      </w:r>
+      <w:r>
+        <w:t xml:space="preserve">in two important ways. First, whereas most existing applications target medical students in high-income educational settings, we demonstrate feasibility for health workforce assessment among practicing providers in a low- and middle-income country context. Second, we validate the resulting competency scores against independent expert clinician ratings, providing evidence that LLM-based vignettes measure meaningful dimensions of clinical competence. Third, we show that LLM-based data extraction performs comparably in Vietnamese and English, demonstrating feasibility for direct multilingual deployment without a separate translation pipeline. Future directions for tool refinement may include incorporating audio or video patient profiles to enhance realism through non-verbal cues.</w:t>
+      </w:r>
+    </w:p>
+    <w:p>
+      <w:pPr>
+        <w:pStyle w:val="BodyText"/>
+      </w:pPr>
+      <w:r>
         <w:t xml:space="preserve">The need for scalable competency measurement is acute. Evidence from sub-Saharan Africa</w:t>
       </w:r>
       <w:r>
@@ -3780,7 +3794,7 @@
         <w:pStyle w:val="FirstParagraph"/>
       </w:pPr>
       <w:r>
-        <w:t xml:space="preserve">This study has several limitations. First, the sample size was small (22 providers, 132 interactions), which limits the precision of our validation estimates and may not capture the full range of provider behavior. Second, the study was conducted in a single country (Vietnam) with a specific set of clinical conditions; generalizability to other settings, languages, and health systems requires further investigation. Third, the LLM-automated coding of checklist items was noisy relative to human coding (</w:t>
+        <w:t xml:space="preserve">This study has several limitations. First, the sample size was small (22 providers, 132 interactions), which limits the precision of our validation estimates and may not capture the full range of provider behavior. Second, the study was conducted in a single country (Vietnam) with a specific set of clinical conditions; generalizability to other settings, languages, and health systems requires further investigation. Third, while the LLM-automated coding of checklist items was moderately correlated with human coding (</w:t>
       </w:r>
       <m:oMath>
         <m:r>
@@ -3791,7 +3805,7 @@
         <w:t xml:space="preserve"> </w:t>
       </w:r>
       <w:r>
-        <w:t xml:space="preserve">= 0.35) and is not yet reliable for individual-level competency assessment. The low sensitivity (mean 0.31) suggests the LLM frequently fails to detect actions that providers did take, which would systematically underestimate competency. Fourth, we validated against human-coded checklists and expert ratings, but did not compare against direct clinical observation; the well-documented</w:t>
+        <w:t xml:space="preserve">= 0.51–0.53), the low mean sensitivity (0.31) suggests the LLM frequently fails to detect actions that providers did take, which would systematically underestimate competency if used without human review. Fourth, we validated against human-coded checklists and expert ratings, but did not compare against direct clinical observation; the well-documented</w:t>
       </w:r>
       <w:r>
         <w:t xml:space="preserve"> </w:t>
@@ -4073,7 +4087,7 @@
         <w:t xml:space="preserve">”</w:t>
       </w:r>
       <w:r>
-        <w:t xml:space="preserve">. Using the human-coded and LLM-coded checklist items separately, a</w:t>
+        <w:t xml:space="preserve">. To assess whether a separate translation step was necessary, we also ran the LLM coding directly on the original Vietnamese transcripts using the same model and rubric. Using the human-coded and LLM-coded checklist items separately, a</w:t>
       </w:r>
       <w:r>
         <w:t xml:space="preserve"> </w:t>
@@ -4127,7 +4141,7 @@
         <w:t xml:space="preserve"> </w:t>
       </w:r>
       <w:r>
-        <w:t xml:space="preserve">LLM vignette score via interaction-level correlations with: (1) expert clinician grading of the transcripts both in English and in the original Vietnamese; and (2) the hepatitis multiple-choice knowledge test scores for matched cases. Our secondary outcome was the reliability of the LLM-coded</w:t>
+        <w:t xml:space="preserve">LLM vignette score via interaction-level correlations with expert clinician grading of the transcripts both in English and in the original Vietnamese. Our secondary outcomes were: (1) the reliability of the LLM-coded</w:t>
       </w:r>
       <w:r>
         <w:t xml:space="preserve"> </w:t>
@@ -4145,7 +4159,7 @@
         <w:t xml:space="preserve"> </w:t>
       </w:r>
       <w:r>
-        <w:t xml:space="preserve">assessed by correlation with ground truth from human coding.</w:t>
+        <w:t xml:space="preserve">assessed by correlation with ground truth from human coding; and (2) a comparison of LLM coding from translated English transcripts versus directly from the original Vietnamese transcripts.</w:t>
       </w:r>
     </w:p>
     <w:bookmarkEnd w:id="42"/>
@@ -4171,7 +4185,7 @@
         <w:pStyle w:val="BodyText"/>
       </w:pPr>
       <w:r>
-        <w:t xml:space="preserve">For the validation sample, agreement between manual and automated data extraction was assessed by calculating the proportion of agreement, true positives, false positives, true negatives, and false negatives based on the human coding as ground truth. The two expert clinicians who developed the vignettes also scored provider performance on each transcript from 1–5 separately for history-taking, diagnosis accuracy, and management completeness (one using the Vietnamese original and one using the English translation). The hepatitis knowledge test performance was scored as the total number of correct responses out of the administered items. Agreement of the human grading with each of these measures was assessed through unadjusted ordinary least squares (OLS) regression. Clustering was not necessary in any case since we calculated results separately by scenario – no provider repeated the same scenario twice. This study is reported following the Standards for Reporting of Diagnostic Accuracy Studies (STARD) guidelines where applicable to the LLM-versus-human coding comparison, and the Strengthening the Reporting of Observational Studies in Epidemiology (STROBE) guidelines for the observational validation design. Completed checklists are provided in the</w:t>
+        <w:t xml:space="preserve">For the validation sample, agreement between manual and automated data extraction was assessed by calculating the proportion of agreement, true positives, false positives, true negatives, and false negatives based on the human coding as ground truth. The two expert clinicians who developed the vignettes also scored provider performance on each transcript from 1–5 separately for history-taking, diagnosis accuracy, and management completeness (one using the Vietnamese original and one using the English translation). Agreement of the human grading with each of these measures was assessed through unadjusted ordinary least squares (OLS) regression. Clustering was not necessary in any case since we calculated results separately by scenario – no provider repeated the same scenario twice. This study is reported following the Standards for Reporting of Diagnostic Accuracy Studies (STARD) guidelines where applicable to the LLM-versus-human coding comparison, and the Strengthening the Reporting of Observational Studies in Epidemiology (STROBE) guidelines for the observational validation design. Completed checklists are provided in the</w:t>
       </w:r>
       <w:r>
         <w:t xml:space="preserve"> </w:t>

</xml_diff>

<commit_message>
Panel C → 'Claude, English'; extend Figure 3 to two panels
- Rename Panel C title to match D naming convention
- Add llm_vn to agreement-long.dta for Vietnamese item-level data
- Figure 3 now has Panel A (English) and Panel B (Vietnamese)
  for item-level sensitivity/specificity comparison
- Update Figure 3 caption and width in manuscript

Co-Authored-By: Claude Opus 4.6 <noreply@anthropic.com>
</commit_message>
<xml_diff>
--- a/manuscript/main.docx
+++ b/manuscript/main.docx
@@ -3469,7 +3469,7 @@
         <w:pStyle w:val="ImageCaption"/>
       </w:pPr>
       <w:r>
-        <w:t xml:space="preserve">Validation of essential diagnostic checklist scores. Panel A: Expert rating in original Vietnamese vs. human-coded checklist completion. Panel B: Expert rating in translated English vs. human-coded checklist completion. Panel C: Claude-coded checklist (from translated English) vs. human-coded checklist. Panel D: Claude-coded checklist (directly from Vietnamese) vs. human-coded checklist. Each point is one provider–case interaction. Lines show OLS fit with 95% confidence interval.</w:t>
+        <w:t xml:space="preserve">Validation of essential diagnostic checklist scores. Panel A: Expert rating in original Vietnamese vs. human-coded checklist completion. Panel B: Expert rating in translated English vs. human-coded checklist completion. Panel C: Claude-coded checklist (English) vs. human-coded checklist. Panel D: Claude-coded checklist (directly from Vietnamese) vs. human-coded checklist. Each point is one provider–case interaction. Lines show OLS fit with 95% confidence interval.</w:t>
       </w:r>
     </w:p>
     <w:p>
@@ -3479,7 +3479,7 @@
       <w:r>
         <w:drawing>
           <wp:inline>
-            <wp:extent cx="3733800" cy="3394363"/>
+            <wp:extent cx="5029200" cy="4572000"/>
             <wp:effectExtent b="0" l="0" r="0" t="0"/>
             <wp:docPr descr="" title="" id="32" name="Picture"/>
             <a:graphic>
@@ -3500,7 +3500,7 @@
                   <pic:spPr bwMode="auto">
                     <a:xfrm>
                       <a:off x="0" y="0"/>
-                      <a:ext cx="3733800" cy="3394363"/>
+                      <a:ext cx="5029200" cy="4572000"/>
                     </a:xfrm>
                     <a:prstGeom prst="rect">
                       <a:avLst/>
@@ -3524,18 +3524,7 @@
         <w:pStyle w:val="ImageCaption"/>
       </w:pPr>
       <w:r>
-        <w:t xml:space="preserve">Item-level sensitivity and specificity of LLM coding against human coding. Each point represents one checklist item. Items above the dashed line of unity have specificity exceeding sensitivity. Items are included only where both metrics are calculable (</w:t>
-      </w:r>
-      <m:oMath>
-        <m:r>
-          <m:t>n</m:t>
-        </m:r>
-      </m:oMath>
-      <w:r>
-        <w:t xml:space="preserve"> </w:t>
-      </w:r>
-      <w:r>
-        <w:t xml:space="preserve">= 304).</w:t>
+        <w:t xml:space="preserve">Item-level sensitivity and specificity of LLM coding against human coding. Panel A: coding from translated English transcripts. Panel B: coding directly from Vietnamese transcripts. Each point represents one checklist item. Items above the dashed line of unity have specificity exceeding sensitivity.</w:t>
       </w:r>
     </w:p>
     <w:bookmarkEnd w:id="34"/>

</xml_diff>

<commit_message>
Reorder sections to PLOS standard: Methods before Results
Introduction → Materials and Methods → Results → Discussion

Co-Authored-By: Claude Opus 4.6 <noreply@anthropic.com>
</commit_message>
<xml_diff>
--- a/manuscript/main.docx
+++ b/manuscript/main.docx
@@ -1919,16 +1919,382 @@
       </w:r>
     </w:p>
     <w:bookmarkEnd w:id="24"/>
-    <w:bookmarkStart w:id="35" w:name="results"/>
+    <w:bookmarkStart w:id="31" w:name="materials-and-methods"/>
     <w:p>
       <w:pPr>
         <w:pStyle w:val="Heading1"/>
       </w:pPr>
       <w:r>
+        <w:t xml:space="preserve">Materials and methods</w:t>
+      </w:r>
+    </w:p>
+    <w:bookmarkStart w:id="25" w:name="study-design-and-participants"/>
+    <w:p>
+      <w:pPr>
+        <w:pStyle w:val="Heading2"/>
+      </w:pPr>
+      <w:r>
+        <w:t xml:space="preserve">Study design and participants</w:t>
+      </w:r>
+    </w:p>
+    <w:p>
+      <w:pPr>
+        <w:pStyle w:val="FirstParagraph"/>
+      </w:pPr>
+      <w:r>
+        <w:t xml:space="preserve">In August 2025, we administered a web-based SurveyCTO survey (either by laptop or by mobile phone) that included LLM-based virtual patient</w:t>
+      </w:r>
+      <w:r>
+        <w:t xml:space="preserve"> </w:t>
+      </w:r>
+      <w:r>
+        <w:t xml:space="preserve">“</w:t>
+      </w:r>
+      <w:r>
+        <w:t xml:space="preserve">chatbots</w:t>
+      </w:r>
+      <w:r>
+        <w:t xml:space="preserve">”</w:t>
+      </w:r>
+      <w:r>
+        <w:t xml:space="preserve"> </w:t>
+      </w:r>
+      <w:r>
+        <w:t xml:space="preserve">preloaded with a pool of ten clinical cases (five general primary care conditions and five hepatitis-related) (</w:t>
+      </w:r>
+      <w:r>
+        <w:rPr>
+          <w:bCs/>
+          <w:b/>
+        </w:rPr>
+        <w:t xml:space="preserve">Table</w:t>
+      </w:r>
+      <w:r>
+        <w:rPr>
+          <w:bCs/>
+          <w:b/>
+        </w:rPr>
+        <w:t xml:space="preserve"> </w:t>
+      </w:r>
+      <w:hyperlink w:anchor="tab:cases">
+        <w:r>
+          <w:rPr>
+            <w:rStyle w:val="Hyperlink"/>
+            <w:bCs/>
+            <w:b/>
+          </w:rPr>
+          <w:t xml:space="preserve">1</w:t>
+        </w:r>
+      </w:hyperlink>
+      <w:r>
+        <w:t xml:space="preserve">). Each case scenario – detailing the patient’s socioeconomic background, chief complaint, medical history, clinical exam results, and potential responses to a set of</w:t>
+      </w:r>
+      <w:r>
+        <w:t xml:space="preserve"> </w:t>
+      </w:r>
+      <w:r>
+        <w:t xml:space="preserve">“</w:t>
+      </w:r>
+      <w:r>
+        <w:t xml:space="preserve">checklist</w:t>
+      </w:r>
+      <w:r>
+        <w:t xml:space="preserve">”</w:t>
+      </w:r>
+      <w:r>
+        <w:t xml:space="preserve"> </w:t>
+      </w:r>
+      <w:r>
+        <w:t xml:space="preserve">questions – was scripted by expert clinicians supporting the research team. The OpenAI application programming interface (API; model gpt-4.1-nano) was prompted through the SurveyCTO software to perform according to these scenarios such that reasonable standardization was achieved across interactions. The scenarios developed for this study are available in the</w:t>
+      </w:r>
+      <w:r>
+        <w:t xml:space="preserve"> </w:t>
+      </w:r>
+      <w:r>
+        <w:rPr>
+          <w:bCs/>
+          <w:b/>
+        </w:rPr>
+        <w:t xml:space="preserve">Supporting Information</w:t>
+      </w:r>
+      <w:r>
+        <w:t xml:space="preserve">.</w:t>
+      </w:r>
+    </w:p>
+    <w:p>
+      <w:pPr>
+        <w:pStyle w:val="BodyText"/>
+      </w:pPr>
+      <w:r>
+        <w:t xml:space="preserve">The research team first recruited and consented 9 physicians from a Provincial Hospital in Phu Tho, Vietnam, to a focus group for usability testing and UI/UX refinement. These providers received a live demonstration by the research team and were instructed to complete as many case scenarios as they found reasonable in a 45-minute period, followed by closed-ended (Likert scale) feedback questions on the realism of each case presentation. Two days later, the team conducted a structured group discussion to collect open-ended feedback, which was incorporated into the validation round.</w:t>
+      </w:r>
+    </w:p>
+    <w:p>
+      <w:pPr>
+        <w:pStyle w:val="BodyText"/>
+      </w:pPr>
+      <w:r>
+        <w:t xml:space="preserve">For the validation sample, the research team contacted and consented 22 providers enrolled in the 2024 cohort of the StITCH hepatitis care training program, which co-designed and delivered a people-centered model of care for hepatitis B and C at the primary health care level in Vietnam. The validation group was given a Zoom orientation with no additional in-person support. These providers were assigned to complete six vignettes selected at random (three general cases and three hepatitis cases each). Afterwards, they completed a traditional multiple-choice knowledge test on hepatitis care, which included clinical knowledge questions based on the same five hepatitis scenarios. Although the total number of providers included in the validation sample was small, they completed 132 interactions containing 433 unique data points, allowing sufficient independent variation to assess the relationships between performance measures given that we do not engage in statistical hypothesis testing.</w:t>
+      </w:r>
+    </w:p>
+    <w:bookmarkEnd w:id="25"/>
+    <w:bookmarkStart w:id="26" w:name="chatbot-implementation"/>
+    <w:p>
+      <w:pPr>
+        <w:pStyle w:val="Heading2"/>
+      </w:pPr>
+      <w:r>
+        <w:t xml:space="preserve">Chatbot implementation</w:t>
+      </w:r>
+    </w:p>
+    <w:p>
+      <w:pPr>
+        <w:pStyle w:val="FirstParagraph"/>
+      </w:pPr>
+      <w:r>
+        <w:t xml:space="preserve">The chatbot interface was built using the SurveyCTO platform’s web-based survey tools with an LLM plugin</w:t>
+      </w:r>
+      <w:r>
+        <w:t xml:space="preserve"> </w:t>
+      </w:r>
+      <w:r>
+        <w:t xml:space="preserve">(Geiecke and Jaravel 2024)</w:t>
+      </w:r>
+      <w:r>
+        <w:t xml:space="preserve">. Each clinical case was encoded as a structured system prompt (1,500–3,000 words) containing: the patient’s demographic background and presenting complaint; a comprehensive medical and social history; pre-scripted responses to anticipated history-taking questions organized by clinical domain; clinical examination findings to be revealed when specific examinations were ordered; laboratory and imaging results for relevant tests; and the correct diagnosis with recommended treatment and counseling points. To maintain standardization, the system prompt instructed the model to report results as</w:t>
+      </w:r>
+      <w:r>
+        <w:t xml:space="preserve"> </w:t>
+      </w:r>
+      <w:r>
+        <w:t xml:space="preserve">“</w:t>
+      </w:r>
+      <w:r>
+        <w:t xml:space="preserve">normal</w:t>
+      </w:r>
+      <w:r>
+        <w:t xml:space="preserve">”</w:t>
+      </w:r>
+      <w:r>
+        <w:t xml:space="preserve"> </w:t>
+      </w:r>
+      <w:r>
+        <w:t xml:space="preserve">or</w:t>
+      </w:r>
+      <w:r>
+        <w:t xml:space="preserve"> </w:t>
+      </w:r>
+      <w:r>
+        <w:t xml:space="preserve">“</w:t>
+      </w:r>
+      <w:r>
+        <w:t xml:space="preserve">unremarkable</w:t>
+      </w:r>
+      <w:r>
+        <w:t xml:space="preserve">”</w:t>
+      </w:r>
+      <w:r>
+        <w:t xml:space="preserve"> </w:t>
+      </w:r>
+      <w:r>
+        <w:t xml:space="preserve">for tests not specified in the case scenario, and to stay in character as the patient throughout the interaction. The full set of case prompts is available in the</w:t>
+      </w:r>
+      <w:r>
+        <w:t xml:space="preserve"> </w:t>
+      </w:r>
+      <w:r>
+        <w:rPr>
+          <w:bCs/>
+          <w:b/>
+        </w:rPr>
+        <w:t xml:space="preserve">Supporting Information</w:t>
+      </w:r>
+      <w:r>
+        <w:t xml:space="preserve">.</w:t>
+      </w:r>
+    </w:p>
+    <w:p>
+      <w:pPr>
+        <w:pStyle w:val="BodyText"/>
+      </w:pPr>
+      <w:r>
+        <w:t xml:space="preserve">The OpenAI model gpt-4.1-nano was selected for cost-efficiency (approximately USD 0.015 per interaction) and adequate performance in Vietnamese-language roleplay. The SurveyCTO plugin manages conversational state by appending each user message and model response to the conversation history, which is passed in full with each subsequent API call. Providers accessed the survey on their personal smartphones or laptops via a URL link. The chatbot responded in Vietnamese (or the provider’s preferred language) and maintained conversational context throughout each interaction. Providers could ask history-taking questions, order clinical examinations and laboratory tests, and provide a diagnosis and treatment plan, all through natural-language text input.</w:t>
+      </w:r>
+    </w:p>
+    <w:bookmarkEnd w:id="26"/>
+    <w:bookmarkStart w:id="27" w:name="data-extraction-and-coding"/>
+    <w:p>
+      <w:pPr>
+        <w:pStyle w:val="Heading2"/>
+      </w:pPr>
+      <w:r>
+        <w:t xml:space="preserve">Data extraction and coding</w:t>
+      </w:r>
+    </w:p>
+    <w:p>
+      <w:pPr>
+        <w:pStyle w:val="FirstParagraph"/>
+      </w:pPr>
+      <w:r>
+        <w:t xml:space="preserve">Interaction transcripts were translated from Vietnamese to English using Anthropic’s Claude language model (claude-haiku-4-5) and manually coded by the research team to determine whether each provider: (1) asked each of the pre-specified checklist history-taking questions, (2) ordered the recommended clinical examinations and laboratory tests, and (3) offered the correct diagnosis. The transcripts were also coded using the Anthropic Claude model (claude-haiku-4-5) with an identical schema as the manual coding, asking for each item,</w:t>
+      </w:r>
+      <w:r>
+        <w:t xml:space="preserve"> </w:t>
+      </w:r>
+      <w:r>
+        <w:t xml:space="preserve">“</w:t>
+      </w:r>
+      <w:r>
+        <w:t xml:space="preserve">In the following text, if the user was a doctor, did they specifically [ask/order/prescribe]…</w:t>
+      </w:r>
+      <w:r>
+        <w:t xml:space="preserve">”</w:t>
+      </w:r>
+      <w:r>
+        <w:t xml:space="preserve">. To assess whether a separate translation step was necessary, we also ran the LLM coding directly on the original Vietnamese transcripts using the same model and rubric. Using the human-coded and LLM-coded checklist items separately, a</w:t>
+      </w:r>
+      <w:r>
+        <w:t xml:space="preserve"> </w:t>
+      </w:r>
+      <w:r>
+        <w:t xml:space="preserve">“</w:t>
+      </w:r>
+      <w:r>
+        <w:t xml:space="preserve">checklist score</w:t>
+      </w:r>
+      <w:r>
+        <w:t xml:space="preserve">”</w:t>
+      </w:r>
+      <w:r>
+        <w:t xml:space="preserve"> </w:t>
+      </w:r>
+      <w:r>
+        <w:t xml:space="preserve">was calculated for each vignette response as the proportion of items completed.</w:t>
+      </w:r>
+    </w:p>
+    <w:bookmarkEnd w:id="27"/>
+    <w:bookmarkStart w:id="28" w:name="outcomes"/>
+    <w:p>
+      <w:pPr>
+        <w:pStyle w:val="Heading2"/>
+      </w:pPr>
+      <w:r>
+        <w:t xml:space="preserve">Outcomes</w:t>
+      </w:r>
+    </w:p>
+    <w:p>
+      <w:pPr>
+        <w:pStyle w:val="FirstParagraph"/>
+      </w:pPr>
+      <w:r>
+        <w:t xml:space="preserve">For the focus group, primary outcomes were: (1) qualitative feedback on the LLM-based vignette survey obtained through the focus group discussion, and (2) quantitative ratings of scenario presentation realism. For the validation sample, the primary outcome was validation of the human-coded</w:t>
+      </w:r>
+      <w:r>
+        <w:t xml:space="preserve"> </w:t>
+      </w:r>
+      <w:r>
+        <w:t xml:space="preserve">“</w:t>
+      </w:r>
+      <w:r>
+        <w:t xml:space="preserve">essential diagnostic checklist</w:t>
+      </w:r>
+      <w:r>
+        <w:t xml:space="preserve">”</w:t>
+      </w:r>
+      <w:r>
+        <w:t xml:space="preserve"> </w:t>
+      </w:r>
+      <w:r>
+        <w:t xml:space="preserve">LLM vignette score via interaction-level correlations with expert clinician grading of the transcripts both in English and in the original Vietnamese. Our secondary outcomes were: (1) the reliability of the LLM-coded</w:t>
+      </w:r>
+      <w:r>
+        <w:t xml:space="preserve"> </w:t>
+      </w:r>
+      <w:r>
+        <w:t xml:space="preserve">“</w:t>
+      </w:r>
+      <w:r>
+        <w:t xml:space="preserve">essential diagnostic checklist,</w:t>
+      </w:r>
+      <w:r>
+        <w:t xml:space="preserve">”</w:t>
+      </w:r>
+      <w:r>
+        <w:t xml:space="preserve"> </w:t>
+      </w:r>
+      <w:r>
+        <w:t xml:space="preserve">assessed by correlation with ground truth from human coding; and (2) a comparison of LLM coding from translated English transcripts versus directly from the original Vietnamese transcripts.</w:t>
+      </w:r>
+    </w:p>
+    <w:bookmarkEnd w:id="28"/>
+    <w:bookmarkStart w:id="29" w:name="statistical-analysis"/>
+    <w:p>
+      <w:pPr>
+        <w:pStyle w:val="Heading2"/>
+      </w:pPr>
+      <w:r>
+        <w:t xml:space="preserve">Statistical analysis</w:t>
+      </w:r>
+    </w:p>
+    <w:p>
+      <w:pPr>
+        <w:pStyle w:val="FirstParagraph"/>
+      </w:pPr>
+      <w:r>
+        <w:t xml:space="preserve">For the focus group, the transcript was thematically analyzed by the research team to identify common themes for tool refinement. Provider perceptions of vignette realism were captured through structured survey questions rating overall realism, clinical presentation realism, and social/economic presentation realism. We calculated means and 95% confidence intervals for each.</w:t>
+      </w:r>
+    </w:p>
+    <w:p>
+      <w:pPr>
+        <w:pStyle w:val="BodyText"/>
+      </w:pPr>
+      <w:r>
+        <w:t xml:space="preserve">For the validation sample, agreement between manual and automated data extraction was assessed by calculating the proportion of agreement, true positives, false positives, true negatives, and false negatives based on the human coding as ground truth. The two expert clinicians who developed the vignettes also scored provider performance on each transcript from 1–5 separately for history-taking, diagnosis accuracy, and management completeness (one using the Vietnamese original and one using the English translation). Agreement of the human grading with each of these measures was assessed through unadjusted ordinary least squares (OLS) regression. Clustering was not necessary in any case since we calculated results separately by scenario – no provider repeated the same scenario twice. This study is reported following the Standards for Reporting of Diagnostic Accuracy Studies (STARD) guidelines where applicable to the LLM-versus-human coding comparison, and the Strengthening the Reporting of Observational Studies in Epidemiology (STROBE) guidelines for the observational validation design. Completed checklists are provided in the</w:t>
+      </w:r>
+      <w:r>
+        <w:t xml:space="preserve"> </w:t>
+      </w:r>
+      <w:r>
+        <w:rPr>
+          <w:bCs/>
+          <w:b/>
+        </w:rPr>
+        <w:t xml:space="preserve">Supporting Information</w:t>
+      </w:r>
+      <w:r>
+        <w:t xml:space="preserve">.</w:t>
+      </w:r>
+    </w:p>
+    <w:bookmarkEnd w:id="29"/>
+    <w:bookmarkStart w:id="30" w:name="ethical-approval"/>
+    <w:p>
+      <w:pPr>
+        <w:pStyle w:val="Heading2"/>
+      </w:pPr>
+      <w:r>
+        <w:t xml:space="preserve">Ethical approval</w:t>
+      </w:r>
+    </w:p>
+    <w:p>
+      <w:pPr>
+        <w:pStyle w:val="FirstParagraph"/>
+      </w:pPr>
+      <w:r>
+        <w:t xml:space="preserve">All procedures were approved by the ethical review board of the Hanoi University of Public Health (025-375/DD-YTCC) and Mass General Brigham Institutional Review Board (Protocol Number 2023P003011). All participants provided written informed consent prior to participation.</w:t>
+      </w:r>
+    </w:p>
+    <w:bookmarkEnd w:id="30"/>
+    <w:bookmarkEnd w:id="31"/>
+    <w:bookmarkStart w:id="42" w:name="results"/>
+    <w:p>
+      <w:pPr>
+        <w:pStyle w:val="Heading1"/>
+      </w:pPr>
+      <w:r>
         <w:t xml:space="preserve">Results</w:t>
       </w:r>
     </w:p>
-    <w:bookmarkStart w:id="25" w:name="focus-group"/>
+    <w:bookmarkStart w:id="32" w:name="focus-group"/>
     <w:p>
       <w:pPr>
         <w:pStyle w:val="Heading2"/>
@@ -2230,8 +2596,8 @@
         <w:t xml:space="preserve">Overall, the focus group participants judged the LLM-based vignette survey to be both usable and realistic.</w:t>
       </w:r>
     </w:p>
-    <w:bookmarkEnd w:id="25"/>
-    <w:bookmarkStart w:id="34" w:name="validation-sample"/>
+    <w:bookmarkEnd w:id="32"/>
+    <w:bookmarkStart w:id="41" w:name="validation-sample"/>
     <w:p>
       <w:pPr>
         <w:pStyle w:val="Heading2"/>
@@ -2428,7 +2794,7 @@
         <w:t xml:space="preserve">illustrates these correlations.</w:t>
       </w:r>
     </w:p>
-    <w:bookmarkStart w:id="26" w:name="tab:cases"/>
+    <w:bookmarkStart w:id="33" w:name="tab:cases"/>
     <w:p>
       <w:pPr>
         <w:pStyle w:val="TableCaption"/>
@@ -3051,8 +3417,8 @@
         </w:tc>
       </w:tr>
     </w:tbl>
-    <w:bookmarkEnd w:id="26"/>
-    <w:bookmarkStart w:id="27" w:name="tab:summary"/>
+    <w:bookmarkEnd w:id="33"/>
+    <w:bookmarkStart w:id="34" w:name="tab:summary"/>
     <w:p>
       <w:pPr>
         <w:pStyle w:val="TableCaption"/>
@@ -3218,7 +3584,7 @@
         </w:tc>
       </w:tr>
     </w:tbl>
-    <w:bookmarkEnd w:id="27"/>
+    <w:bookmarkEnd w:id="34"/>
     <w:p>
       <w:pPr>
         <w:pStyle w:val="BodyText"/>
@@ -3426,18 +3792,18 @@
           <wp:inline>
             <wp:extent cx="5029200" cy="4572000"/>
             <wp:effectExtent b="0" l="0" r="0" t="0"/>
-            <wp:docPr descr="" title="" id="29" name="Picture"/>
+            <wp:docPr descr="" title="" id="36" name="Picture"/>
             <a:graphic>
               <a:graphicData uri="http://schemas.openxmlformats.org/drawingml/2006/picture">
                 <pic:pic>
                   <pic:nvPicPr>
-                    <pic:cNvPr descr="exhibits/F2.pdf" id="30" name="Picture"/>
+                    <pic:cNvPr descr="exhibits/F2.pdf" id="37" name="Picture"/>
                     <pic:cNvPicPr>
                       <a:picLocks noChangeArrowheads="1" noChangeAspect="1"/>
                     </pic:cNvPicPr>
                   </pic:nvPicPr>
                   <pic:blipFill>
-                    <a:blip r:embed="rId28"/>
+                    <a:blip r:embed="rId35"/>
                     <a:stretch>
                       <a:fillRect/>
                     </a:stretch>
@@ -3481,18 +3847,18 @@
           <wp:inline>
             <wp:extent cx="5029200" cy="4572000"/>
             <wp:effectExtent b="0" l="0" r="0" t="0"/>
-            <wp:docPr descr="" title="" id="32" name="Picture"/>
+            <wp:docPr descr="" title="" id="39" name="Picture"/>
             <a:graphic>
               <a:graphicData uri="http://schemas.openxmlformats.org/drawingml/2006/picture">
                 <pic:pic>
                   <pic:nvPicPr>
-                    <pic:cNvPr descr="exhibits/F3.pdf" id="33" name="Picture"/>
+                    <pic:cNvPr descr="exhibits/F3.pdf" id="40" name="Picture"/>
                     <pic:cNvPicPr>
                       <a:picLocks noChangeArrowheads="1" noChangeAspect="1"/>
                     </pic:cNvPicPr>
                   </pic:nvPicPr>
                   <pic:blipFill>
-                    <a:blip r:embed="rId31"/>
+                    <a:blip r:embed="rId38"/>
                     <a:stretch>
                       <a:fillRect/>
                     </a:stretch>
@@ -3527,9 +3893,9 @@
         <w:t xml:space="preserve">Item-level sensitivity and specificity of LLM coding against human coding. Panel A: coding from translated English transcripts. Panel B: coding directly from Vietnamese transcripts. Each point represents one checklist item. Items above the dashed line of unity have specificity exceeding sensitivity.</w:t>
       </w:r>
     </w:p>
-    <w:bookmarkEnd w:id="34"/>
-    <w:bookmarkEnd w:id="35"/>
-    <w:bookmarkStart w:id="38" w:name="discussion"/>
+    <w:bookmarkEnd w:id="41"/>
+    <w:bookmarkEnd w:id="42"/>
+    <w:bookmarkStart w:id="45" w:name="discussion"/>
     <w:p>
       <w:pPr>
         <w:pStyle w:val="Heading1"/>
@@ -3769,7 +4135,7 @@
         <w:t xml:space="preserve">; the expense of replication has prevented a post-pandemic update. Tools like the one presented here could enable continuous, routine monitoring at a fraction of the cost of traditional approaches.</w:t>
       </w:r>
     </w:p>
-    <w:bookmarkStart w:id="36" w:name="limitations"/>
+    <w:bookmarkStart w:id="43" w:name="limitations"/>
     <w:p>
       <w:pPr>
         <w:pStyle w:val="Heading2"/>
@@ -3824,8 +4190,8 @@
         <w:t xml:space="preserve">. Fifth, the text-based interaction format inherently lacks non-verbal clinical cues (e.g., visual inspection, auscultation sounds), which may constrain the types of clinical reasoning that can be assessed. Sixth, LLM behavior may vary across model versions and over time, which could affect reproducibility; we report specific model versions to facilitate replication. Finally, the platform requires internet connectivity and smartphone access, which may limit deployment in the most resource-constrained settings.</w:t>
       </w:r>
     </w:p>
-    <w:bookmarkEnd w:id="36"/>
-    <w:bookmarkStart w:id="37" w:name="conclusion"/>
+    <w:bookmarkEnd w:id="43"/>
+    <w:bookmarkStart w:id="44" w:name="conclusion"/>
     <w:p>
       <w:pPr>
         <w:pStyle w:val="Heading2"/>
@@ -3840,372 +4206,6 @@
       </w:pPr>
       <w:r>
         <w:t xml:space="preserve">This study demonstrates that LLM-driven conversational vignettes can produce a low-cost, flexible, and scalable platform for measuring health care provider competencies. The method eliminates the need for in-person enumerators while preserving the open-ended interaction format that is the foundation of vignette validity. The platform is open-source, built on widely used survey software, and designed for adaptation to a wide variety of clinical contexts and languages. As LLM capabilities continue to improve, both the chatbot interactions and the automated data extraction are likely to become more reliable, further reducing the cost and increasing the feasibility of routine competency measurement. With further validation across settings and languages, this method has the potential to support rapid, low-cost measurement of health care provider competencies in diverse health system contexts.</w:t>
-      </w:r>
-    </w:p>
-    <w:bookmarkEnd w:id="37"/>
-    <w:bookmarkEnd w:id="38"/>
-    <w:bookmarkStart w:id="45" w:name="materials-and-methods"/>
-    <w:p>
-      <w:pPr>
-        <w:pStyle w:val="Heading1"/>
-      </w:pPr>
-      <w:r>
-        <w:t xml:space="preserve">Materials and methods</w:t>
-      </w:r>
-    </w:p>
-    <w:bookmarkStart w:id="39" w:name="study-design-and-participants"/>
-    <w:p>
-      <w:pPr>
-        <w:pStyle w:val="Heading2"/>
-      </w:pPr>
-      <w:r>
-        <w:t xml:space="preserve">Study design and participants</w:t>
-      </w:r>
-    </w:p>
-    <w:p>
-      <w:pPr>
-        <w:pStyle w:val="FirstParagraph"/>
-      </w:pPr>
-      <w:r>
-        <w:t xml:space="preserve">In August 2025, we administered a web-based SurveyCTO survey (either by laptop or by mobile phone) that included LLM-based virtual patient</w:t>
-      </w:r>
-      <w:r>
-        <w:t xml:space="preserve"> </w:t>
-      </w:r>
-      <w:r>
-        <w:t xml:space="preserve">“</w:t>
-      </w:r>
-      <w:r>
-        <w:t xml:space="preserve">chatbots</w:t>
-      </w:r>
-      <w:r>
-        <w:t xml:space="preserve">”</w:t>
-      </w:r>
-      <w:r>
-        <w:t xml:space="preserve"> </w:t>
-      </w:r>
-      <w:r>
-        <w:t xml:space="preserve">preloaded with a pool of ten clinical cases (five general primary care conditions and five hepatitis-related) (</w:t>
-      </w:r>
-      <w:r>
-        <w:rPr>
-          <w:bCs/>
-          <w:b/>
-        </w:rPr>
-        <w:t xml:space="preserve">Table</w:t>
-      </w:r>
-      <w:r>
-        <w:rPr>
-          <w:bCs/>
-          <w:b/>
-        </w:rPr>
-        <w:t xml:space="preserve"> </w:t>
-      </w:r>
-      <w:hyperlink w:anchor="tab:cases">
-        <w:r>
-          <w:rPr>
-            <w:rStyle w:val="Hyperlink"/>
-            <w:bCs/>
-            <w:b/>
-          </w:rPr>
-          <w:t xml:space="preserve">1</w:t>
-        </w:r>
-      </w:hyperlink>
-      <w:r>
-        <w:t xml:space="preserve">). Each case scenario – detailing the patient’s socioeconomic background, chief complaint, medical history, clinical exam results, and potential responses to a set of</w:t>
-      </w:r>
-      <w:r>
-        <w:t xml:space="preserve"> </w:t>
-      </w:r>
-      <w:r>
-        <w:t xml:space="preserve">“</w:t>
-      </w:r>
-      <w:r>
-        <w:t xml:space="preserve">checklist</w:t>
-      </w:r>
-      <w:r>
-        <w:t xml:space="preserve">”</w:t>
-      </w:r>
-      <w:r>
-        <w:t xml:space="preserve"> </w:t>
-      </w:r>
-      <w:r>
-        <w:t xml:space="preserve">questions – was scripted by expert clinicians supporting the research team. The OpenAI application programming interface (API; model gpt-4.1-nano) was prompted through the SurveyCTO software to perform according to these scenarios such that reasonable standardization was achieved across interactions. The scenarios developed for this study are available in the</w:t>
-      </w:r>
-      <w:r>
-        <w:t xml:space="preserve"> </w:t>
-      </w:r>
-      <w:r>
-        <w:rPr>
-          <w:bCs/>
-          <w:b/>
-        </w:rPr>
-        <w:t xml:space="preserve">Supporting Information</w:t>
-      </w:r>
-      <w:r>
-        <w:t xml:space="preserve">.</w:t>
-      </w:r>
-    </w:p>
-    <w:p>
-      <w:pPr>
-        <w:pStyle w:val="BodyText"/>
-      </w:pPr>
-      <w:r>
-        <w:t xml:space="preserve">The research team first recruited and consented 9 physicians from a Provincial Hospital in Phu Tho, Vietnam, to a focus group for usability testing and UI/UX refinement. These providers received a live demonstration by the research team and were instructed to complete as many case scenarios as they found reasonable in a 45-minute period, followed by closed-ended (Likert scale) feedback questions on the realism of each case presentation. Two days later, the team conducted a structured group discussion to collect open-ended feedback, which was incorporated into the validation round.</w:t>
-      </w:r>
-    </w:p>
-    <w:p>
-      <w:pPr>
-        <w:pStyle w:val="BodyText"/>
-      </w:pPr>
-      <w:r>
-        <w:t xml:space="preserve">For the validation sample, the research team contacted and consented 22 providers enrolled in the 2024 cohort of the StITCH hepatitis care training program, which co-designed and delivered a people-centered model of care for hepatitis B and C at the primary health care level in Vietnam. The validation group was given a Zoom orientation with no additional in-person support. These providers were assigned to complete six vignettes selected at random (three general cases and three hepatitis cases each). Afterwards, they completed a traditional multiple-choice knowledge test on hepatitis care, which included clinical knowledge questions based on the same five hepatitis scenarios. Although the total number of providers included in the validation sample was small, they completed 132 interactions containing 433 unique data points, allowing sufficient independent variation to assess the relationships between performance measures given that we do not engage in statistical hypothesis testing.</w:t>
-      </w:r>
-    </w:p>
-    <w:bookmarkEnd w:id="39"/>
-    <w:bookmarkStart w:id="40" w:name="chatbot-implementation"/>
-    <w:p>
-      <w:pPr>
-        <w:pStyle w:val="Heading2"/>
-      </w:pPr>
-      <w:r>
-        <w:t xml:space="preserve">Chatbot implementation</w:t>
-      </w:r>
-    </w:p>
-    <w:p>
-      <w:pPr>
-        <w:pStyle w:val="FirstParagraph"/>
-      </w:pPr>
-      <w:r>
-        <w:t xml:space="preserve">The chatbot interface was built using the SurveyCTO platform’s web-based survey tools with an LLM plugin</w:t>
-      </w:r>
-      <w:r>
-        <w:t xml:space="preserve"> </w:t>
-      </w:r>
-      <w:r>
-        <w:t xml:space="preserve">(Geiecke and Jaravel 2024)</w:t>
-      </w:r>
-      <w:r>
-        <w:t xml:space="preserve">. Each clinical case was encoded as a structured system prompt (1,500–3,000 words) containing: the patient’s demographic background and presenting complaint; a comprehensive medical and social history; pre-scripted responses to anticipated history-taking questions organized by clinical domain; clinical examination findings to be revealed when specific examinations were ordered; laboratory and imaging results for relevant tests; and the correct diagnosis with recommended treatment and counseling points. To maintain standardization, the system prompt instructed the model to report results as</w:t>
-      </w:r>
-      <w:r>
-        <w:t xml:space="preserve"> </w:t>
-      </w:r>
-      <w:r>
-        <w:t xml:space="preserve">“</w:t>
-      </w:r>
-      <w:r>
-        <w:t xml:space="preserve">normal</w:t>
-      </w:r>
-      <w:r>
-        <w:t xml:space="preserve">”</w:t>
-      </w:r>
-      <w:r>
-        <w:t xml:space="preserve"> </w:t>
-      </w:r>
-      <w:r>
-        <w:t xml:space="preserve">or</w:t>
-      </w:r>
-      <w:r>
-        <w:t xml:space="preserve"> </w:t>
-      </w:r>
-      <w:r>
-        <w:t xml:space="preserve">“</w:t>
-      </w:r>
-      <w:r>
-        <w:t xml:space="preserve">unremarkable</w:t>
-      </w:r>
-      <w:r>
-        <w:t xml:space="preserve">”</w:t>
-      </w:r>
-      <w:r>
-        <w:t xml:space="preserve"> </w:t>
-      </w:r>
-      <w:r>
-        <w:t xml:space="preserve">for tests not specified in the case scenario, and to stay in character as the patient throughout the interaction. The full set of case prompts is available in the</w:t>
-      </w:r>
-      <w:r>
-        <w:t xml:space="preserve"> </w:t>
-      </w:r>
-      <w:r>
-        <w:rPr>
-          <w:bCs/>
-          <w:b/>
-        </w:rPr>
-        <w:t xml:space="preserve">Supporting Information</w:t>
-      </w:r>
-      <w:r>
-        <w:t xml:space="preserve">.</w:t>
-      </w:r>
-    </w:p>
-    <w:p>
-      <w:pPr>
-        <w:pStyle w:val="BodyText"/>
-      </w:pPr>
-      <w:r>
-        <w:t xml:space="preserve">The OpenAI model gpt-4.1-nano was selected for cost-efficiency (approximately USD 0.015 per interaction) and adequate performance in Vietnamese-language roleplay. The SurveyCTO plugin manages conversational state by appending each user message and model response to the conversation history, which is passed in full with each subsequent API call. Providers accessed the survey on their personal smartphones or laptops via a URL link. The chatbot responded in Vietnamese (or the provider’s preferred language) and maintained conversational context throughout each interaction. Providers could ask history-taking questions, order clinical examinations and laboratory tests, and provide a diagnosis and treatment plan, all through natural-language text input.</w:t>
-      </w:r>
-    </w:p>
-    <w:bookmarkEnd w:id="40"/>
-    <w:bookmarkStart w:id="41" w:name="data-extraction-and-coding"/>
-    <w:p>
-      <w:pPr>
-        <w:pStyle w:val="Heading2"/>
-      </w:pPr>
-      <w:r>
-        <w:t xml:space="preserve">Data extraction and coding</w:t>
-      </w:r>
-    </w:p>
-    <w:p>
-      <w:pPr>
-        <w:pStyle w:val="FirstParagraph"/>
-      </w:pPr>
-      <w:r>
-        <w:t xml:space="preserve">Interaction transcripts were translated from Vietnamese to English using Anthropic’s Claude language model (claude-haiku-4-5) and manually coded by the research team to determine whether each provider: (1) asked each of the pre-specified checklist history-taking questions, (2) ordered the recommended clinical examinations and laboratory tests, and (3) offered the correct diagnosis. The transcripts were also coded using the Anthropic Claude model (claude-haiku-4-5) with an identical schema as the manual coding, asking for each item,</w:t>
-      </w:r>
-      <w:r>
-        <w:t xml:space="preserve"> </w:t>
-      </w:r>
-      <w:r>
-        <w:t xml:space="preserve">“</w:t>
-      </w:r>
-      <w:r>
-        <w:t xml:space="preserve">In the following text, if the user was a doctor, did they specifically [ask/order/prescribe]…</w:t>
-      </w:r>
-      <w:r>
-        <w:t xml:space="preserve">”</w:t>
-      </w:r>
-      <w:r>
-        <w:t xml:space="preserve">. To assess whether a separate translation step was necessary, we also ran the LLM coding directly on the original Vietnamese transcripts using the same model and rubric. Using the human-coded and LLM-coded checklist items separately, a</w:t>
-      </w:r>
-      <w:r>
-        <w:t xml:space="preserve"> </w:t>
-      </w:r>
-      <w:r>
-        <w:t xml:space="preserve">“</w:t>
-      </w:r>
-      <w:r>
-        <w:t xml:space="preserve">checklist score</w:t>
-      </w:r>
-      <w:r>
-        <w:t xml:space="preserve">”</w:t>
-      </w:r>
-      <w:r>
-        <w:t xml:space="preserve"> </w:t>
-      </w:r>
-      <w:r>
-        <w:t xml:space="preserve">was calculated for each vignette response as the proportion of items completed.</w:t>
-      </w:r>
-    </w:p>
-    <w:bookmarkEnd w:id="41"/>
-    <w:bookmarkStart w:id="42" w:name="outcomes"/>
-    <w:p>
-      <w:pPr>
-        <w:pStyle w:val="Heading2"/>
-      </w:pPr>
-      <w:r>
-        <w:t xml:space="preserve">Outcomes</w:t>
-      </w:r>
-    </w:p>
-    <w:p>
-      <w:pPr>
-        <w:pStyle w:val="FirstParagraph"/>
-      </w:pPr>
-      <w:r>
-        <w:t xml:space="preserve">For the focus group, primary outcomes were: (1) qualitative feedback on the LLM-based vignette survey obtained through the focus group discussion, and (2) quantitative ratings of scenario presentation realism. For the validation sample, the primary outcome was validation of the human-coded</w:t>
-      </w:r>
-      <w:r>
-        <w:t xml:space="preserve"> </w:t>
-      </w:r>
-      <w:r>
-        <w:t xml:space="preserve">“</w:t>
-      </w:r>
-      <w:r>
-        <w:t xml:space="preserve">essential diagnostic checklist</w:t>
-      </w:r>
-      <w:r>
-        <w:t xml:space="preserve">”</w:t>
-      </w:r>
-      <w:r>
-        <w:t xml:space="preserve"> </w:t>
-      </w:r>
-      <w:r>
-        <w:t xml:space="preserve">LLM vignette score via interaction-level correlations with expert clinician grading of the transcripts both in English and in the original Vietnamese. Our secondary outcomes were: (1) the reliability of the LLM-coded</w:t>
-      </w:r>
-      <w:r>
-        <w:t xml:space="preserve"> </w:t>
-      </w:r>
-      <w:r>
-        <w:t xml:space="preserve">“</w:t>
-      </w:r>
-      <w:r>
-        <w:t xml:space="preserve">essential diagnostic checklist,</w:t>
-      </w:r>
-      <w:r>
-        <w:t xml:space="preserve">”</w:t>
-      </w:r>
-      <w:r>
-        <w:t xml:space="preserve"> </w:t>
-      </w:r>
-      <w:r>
-        <w:t xml:space="preserve">assessed by correlation with ground truth from human coding; and (2) a comparison of LLM coding from translated English transcripts versus directly from the original Vietnamese transcripts.</w:t>
-      </w:r>
-    </w:p>
-    <w:bookmarkEnd w:id="42"/>
-    <w:bookmarkStart w:id="43" w:name="statistical-analysis"/>
-    <w:p>
-      <w:pPr>
-        <w:pStyle w:val="Heading2"/>
-      </w:pPr>
-      <w:r>
-        <w:t xml:space="preserve">Statistical analysis</w:t>
-      </w:r>
-    </w:p>
-    <w:p>
-      <w:pPr>
-        <w:pStyle w:val="FirstParagraph"/>
-      </w:pPr>
-      <w:r>
-        <w:t xml:space="preserve">For the focus group, the transcript was thematically analyzed by the research team to identify common themes for tool refinement. Provider perceptions of vignette realism were captured through structured survey questions rating overall realism, clinical presentation realism, and social/economic presentation realism. We calculated means and 95% confidence intervals for each.</w:t>
-      </w:r>
-    </w:p>
-    <w:p>
-      <w:pPr>
-        <w:pStyle w:val="BodyText"/>
-      </w:pPr>
-      <w:r>
-        <w:t xml:space="preserve">For the validation sample, agreement between manual and automated data extraction was assessed by calculating the proportion of agreement, true positives, false positives, true negatives, and false negatives based on the human coding as ground truth. The two expert clinicians who developed the vignettes also scored provider performance on each transcript from 1–5 separately for history-taking, diagnosis accuracy, and management completeness (one using the Vietnamese original and one using the English translation). Agreement of the human grading with each of these measures was assessed through unadjusted ordinary least squares (OLS) regression. Clustering was not necessary in any case since we calculated results separately by scenario – no provider repeated the same scenario twice. This study is reported following the Standards for Reporting of Diagnostic Accuracy Studies (STARD) guidelines where applicable to the LLM-versus-human coding comparison, and the Strengthening the Reporting of Observational Studies in Epidemiology (STROBE) guidelines for the observational validation design. Completed checklists are provided in the</w:t>
-      </w:r>
-      <w:r>
-        <w:t xml:space="preserve"> </w:t>
-      </w:r>
-      <w:r>
-        <w:rPr>
-          <w:bCs/>
-          <w:b/>
-        </w:rPr>
-        <w:t xml:space="preserve">Supporting Information</w:t>
-      </w:r>
-      <w:r>
-        <w:t xml:space="preserve">.</w:t>
-      </w:r>
-    </w:p>
-    <w:bookmarkEnd w:id="43"/>
-    <w:bookmarkStart w:id="44" w:name="ethical-approval"/>
-    <w:p>
-      <w:pPr>
-        <w:pStyle w:val="Heading2"/>
-      </w:pPr>
-      <w:r>
-        <w:t xml:space="preserve">Ethical approval</w:t>
-      </w:r>
-    </w:p>
-    <w:p>
-      <w:pPr>
-        <w:pStyle w:val="FirstParagraph"/>
-      </w:pPr>
-      <w:r>
-        <w:t xml:space="preserve">All procedures were approved by the ethical review board of the Hanoi University of Public Health (025-375/DD-YTCC) and Mass General Brigham Institutional Review Board (Protocol Number 2023P003011). All participants provided written informed consent prior to participation.</w:t>
       </w:r>
     </w:p>
     <w:bookmarkEnd w:id="44"/>

</xml_diff>

<commit_message>
Add AUROC analysis, confidence scoring pipeline, fix manuscript stats and appendix formatting
- Add classify_conf.py and classify_conf_vn.py for confidence-scored LLM classification
- Update compile.py to merge confidence data into agreement-long.dta
- Add ROC curve analysis to 5_data-construct.do (Figure 3, AUROC = 0.87 for both languages)
- Update manuscript: add AUROC methods/results, fix r² (0.27→0.26), fix CI rounding
- Fix appendix: add caption/float/longtable packages, fix title, fix STROBE section heading
- Add cover letter, Table 1 exhibit, update .gitignore and runfile

Co-Authored-By: Claude Opus 4.6 <noreply@anthropic.com>
</commit_message>
<xml_diff>
--- a/manuscript/main.docx
+++ b/manuscript/main.docx
@@ -37,7 +37,7 @@
         <w:t xml:space="preserve"> </w:t>
       </w:r>
       <w:r>
-        <w:t xml:space="preserve">clinical</w:t>
+        <w:t xml:space="preserve">conversational</w:t>
       </w:r>
       <w:r>
         <w:t xml:space="preserve"> </w:t>
@@ -49,13 +49,31 @@
         <w:t xml:space="preserve"> </w:t>
       </w:r>
       <w:r>
-        <w:t xml:space="preserve">assessment:</w:t>
-      </w:r>
-      <w:r>
-        <w:t xml:space="preserve"> </w:t>
-      </w:r>
-      <w:r>
-        <w:t xml:space="preserve">a</w:t>
+        <w:t xml:space="preserve">assessment</w:t>
+      </w:r>
+      <w:r>
+        <w:t xml:space="preserve"> </w:t>
+      </w:r>
+      <w:r>
+        <w:t xml:space="preserve">of</w:t>
+      </w:r>
+      <w:r>
+        <w:t xml:space="preserve"> </w:t>
+      </w:r>
+      <w:r>
+        <w:t xml:space="preserve">provider</w:t>
+      </w:r>
+      <w:r>
+        <w:t xml:space="preserve"> </w:t>
+      </w:r>
+      <w:r>
+        <w:t xml:space="preserve">competencies:</w:t>
+      </w:r>
+      <w:r>
+        <w:t xml:space="preserve"> </w:t>
+      </w:r>
+      <w:r>
+        <w:t xml:space="preserve">A</w:t>
       </w:r>
       <w:r>
         <w:t xml:space="preserve"> </w:t>
@@ -92,6 +110,36 @@
       </w:r>
       <w:r>
         <w:t xml:space="preserve">Vietnam</w:t>
+      </w:r>
+      <w:r>
+        <w:t xml:space="preserve"> </w:t>
+      </w:r>
+      <w:r>
+        <w:t xml:space="preserve">with</w:t>
+      </w:r>
+      <w:r>
+        <w:t xml:space="preserve"> </w:t>
+      </w:r>
+      <w:r>
+        <w:t xml:space="preserve">automated</w:t>
+      </w:r>
+      <w:r>
+        <w:t xml:space="preserve"> </w:t>
+      </w:r>
+      <w:r>
+        <w:t xml:space="preserve">LLM-powered</w:t>
+      </w:r>
+      <w:r>
+        <w:t xml:space="preserve"> </w:t>
+      </w:r>
+      <w:r>
+        <w:t xml:space="preserve">transcript</w:t>
+      </w:r>
+      <w:r>
+        <w:t xml:space="preserve"> </w:t>
+      </w:r>
+      <w:r>
+        <w:t xml:space="preserve">classification</w:t>
       </w:r>
     </w:p>
     <w:p>
@@ -777,7 +825,25 @@
         <w:t xml:space="preserve"> </w:t>
       </w:r>
       <w:r>
-        <w:t xml:space="preserve">SurveyCTO,</w:t>
+        <w:t xml:space="preserve">a</w:t>
+      </w:r>
+      <w:r>
+        <w:t xml:space="preserve"> </w:t>
+      </w:r>
+      <w:r>
+        <w:t xml:space="preserve">SurveyCTO</w:t>
+      </w:r>
+      <w:r>
+        <w:t xml:space="preserve"> </w:t>
+      </w:r>
+      <w:r>
+        <w:t xml:space="preserve">web</w:t>
+      </w:r>
+      <w:r>
+        <w:t xml:space="preserve"> </w:t>
+      </w:r>
+      <w:r>
+        <w:t xml:space="preserve">survey,</w:t>
       </w:r>
       <w:r>
         <w:t xml:space="preserve"> </w:t>
@@ -1017,7 +1083,19 @@
         <w:t xml:space="preserve"> </w:t>
       </w:r>
       <w:r>
-        <w:t xml:space="preserve">scenarios.</w:t>
+        <w:t xml:space="preserve">scenarios</w:t>
+      </w:r>
+      <w:r>
+        <w:t xml:space="preserve"> </w:t>
+      </w:r>
+      <w:r>
+        <w:t xml:space="preserve">in</w:t>
+      </w:r>
+      <w:r>
+        <w:t xml:space="preserve"> </w:t>
+      </w:r>
+      <w:r>
+        <w:t xml:space="preserve">Vietnamese.</w:t>
       </w:r>
       <w:r>
         <w:t xml:space="preserve"> </w:t>
@@ -1047,13 +1125,7 @@
         <w:t xml:space="preserve"> </w:t>
       </w:r>
       <w:r>
-        <w:t xml:space="preserve">–</w:t>
-      </w:r>
-      <w:r>
-        <w:t xml:space="preserve"> </w:t>
-      </w:r>
-      <w:r>
-        <w:t xml:space="preserve">human-coded</w:t>
+        <w:t xml:space="preserve">(human-coded</w:t>
       </w:r>
       <w:r>
         <w:t xml:space="preserve"> </w:t>
@@ -1065,13 +1137,13 @@
         <w:t xml:space="preserve"> </w:t>
       </w:r>
       <w:r>
-        <w:t xml:space="preserve">transcripts</w:t>
-      </w:r>
-      <w:r>
-        <w:t xml:space="preserve"> </w:t>
-      </w:r>
-      <w:r>
-        <w:t xml:space="preserve">–</w:t>
+        <w:t xml:space="preserve">translated</w:t>
+      </w:r>
+      <w:r>
+        <w:t xml:space="preserve"> </w:t>
+      </w:r>
+      <w:r>
+        <w:t xml:space="preserve">transcripts)</w:t>
       </w:r>
       <w:r>
         <w:t xml:space="preserve"> </w:t>
@@ -1193,7 +1265,7 @@
         <w:t xml:space="preserve"> </w:t>
       </w:r>
       <w:r>
-        <w:t xml:space="preserve">moderately</w:t>
+        <w:t xml:space="preserve">reasonably</w:t>
       </w:r>
       <w:r>
         <w:t xml:space="preserve"> </w:t>
@@ -1509,7 +1581,31 @@
         <w:t xml:space="preserve"> </w:t>
       </w:r>
       <w:r>
-        <w:t xml:space="preserve">competencies,</w:t>
+        <w:t xml:space="preserve">competencies</w:t>
+      </w:r>
+      <w:r>
+        <w:t xml:space="preserve"> </w:t>
+      </w:r>
+      <w:r>
+        <w:t xml:space="preserve">in</w:t>
+      </w:r>
+      <w:r>
+        <w:t xml:space="preserve"> </w:t>
+      </w:r>
+      <w:r>
+        <w:t xml:space="preserve">respondents’</w:t>
+      </w:r>
+      <w:r>
+        <w:t xml:space="preserve"> </w:t>
+      </w:r>
+      <w:r>
+        <w:t xml:space="preserve">local</w:t>
+      </w:r>
+      <w:r>
+        <w:t xml:space="preserve"> </w:t>
+      </w:r>
+      <w:r>
+        <w:t xml:space="preserve">language,</w:t>
       </w:r>
       <w:r>
         <w:t xml:space="preserve"> </w:t>
@@ -1539,7 +1635,19 @@
         <w:t xml:space="preserve"> </w:t>
       </w:r>
       <w:r>
-        <w:t xml:space="preserve">enumerators</w:t>
+        <w:t xml:space="preserve">extensive</w:t>
+      </w:r>
+      <w:r>
+        <w:t xml:space="preserve"> </w:t>
+      </w:r>
+      <w:r>
+        <w:t xml:space="preserve">enumeration</w:t>
+      </w:r>
+      <w:r>
+        <w:t xml:space="preserve"> </w:t>
+      </w:r>
+      <w:r>
+        <w:t xml:space="preserve">staffs</w:t>
       </w:r>
       <w:r>
         <w:t xml:space="preserve"> </w:t>
@@ -1593,7 +1701,73 @@
         <w:t xml:space="preserve"> </w:t>
       </w:r>
       <w:r>
-        <w:t xml:space="preserve">validity.</w:t>
+        <w:t xml:space="preserve">validity,</w:t>
+      </w:r>
+      <w:r>
+        <w:t xml:space="preserve"> </w:t>
+      </w:r>
+      <w:r>
+        <w:t xml:space="preserve">and</w:t>
+      </w:r>
+      <w:r>
+        <w:t xml:space="preserve"> </w:t>
+      </w:r>
+      <w:r>
+        <w:t xml:space="preserve">additionally</w:t>
+      </w:r>
+      <w:r>
+        <w:t xml:space="preserve"> </w:t>
+      </w:r>
+      <w:r>
+        <w:t xml:space="preserve">introducing</w:t>
+      </w:r>
+      <w:r>
+        <w:t xml:space="preserve"> </w:t>
+      </w:r>
+      <w:r>
+        <w:t xml:space="preserve">flexible</w:t>
+      </w:r>
+      <w:r>
+        <w:t xml:space="preserve"> </w:t>
+      </w:r>
+      <w:r>
+        <w:t xml:space="preserve">feature</w:t>
+      </w:r>
+      <w:r>
+        <w:t xml:space="preserve"> </w:t>
+      </w:r>
+      <w:r>
+        <w:t xml:space="preserve">extraction</w:t>
+      </w:r>
+      <w:r>
+        <w:t xml:space="preserve"> </w:t>
+      </w:r>
+      <w:r>
+        <w:t xml:space="preserve">from</w:t>
+      </w:r>
+      <w:r>
+        <w:t xml:space="preserve"> </w:t>
+      </w:r>
+      <w:r>
+        <w:t xml:space="preserve">transcripts</w:t>
+      </w:r>
+      <w:r>
+        <w:t xml:space="preserve"> </w:t>
+      </w:r>
+      <w:r>
+        <w:t xml:space="preserve">using</w:t>
+      </w:r>
+      <w:r>
+        <w:t xml:space="preserve"> </w:t>
+      </w:r>
+      <w:r>
+        <w:t xml:space="preserve">grading</w:t>
+      </w:r>
+      <w:r>
+        <w:t xml:space="preserve"> </w:t>
+      </w:r>
+      <w:r>
+        <w:t xml:space="preserve">rubrics.</w:t>
       </w:r>
       <w:r>
         <w:t xml:space="preserve"> </w:t>
@@ -1689,7 +1863,7 @@
         <w:t xml:space="preserve"> </w:t>
       </w:r>
       <w:r>
-        <w:t xml:space="preserve">AI-based clinical vignette assessment in Vietnam</w:t>
+        <w:t xml:space="preserve">AI-based clinical vignette assessment: Pilot and validation study in Vietnam</w:t>
       </w:r>
     </w:p>
     <w:bookmarkStart w:id="20" w:name="author-summary"/>
@@ -1706,7 +1880,7 @@
         <w:pStyle w:val="FirstParagraph"/>
       </w:pPr>
       <w:r>
-        <w:t xml:space="preserve">Measuring the clinical skills of healthcare providers is essential for improving the quality of care, but current survey methods are expensive and require trained enumerators to travel to health facilities in person. We developed a new approach that uses large language models – the artificial intelligence technology behind tools like ChatGPT – to simulate patients in realistic clinical conversations that healthcare providers can complete on their own phones or laptops. In Vietnam, we tested this tool with 31 physicians across ten clinical scenarios. Providers found the simulated patient conversations realistic and easy to use. When we compared the results from our tool against expert physician ratings of the same conversations, the scores agreed well, suggesting the tool produces meaningful measures of clinical skill. We also tested whether AI could automatically score the conversations, which showed moderate agreement with human scoring – and performed nearly as well when scoring directly from Vietnamese, without requiring a separate translation step. This tool costs less than two US dollars for over a hundred consultations and requires no in-person surveyors, making it potentially transformative for routine, large-scale monitoring of healthcare quality in resource-limited settings. The platform and code are openly available for adaptation.</w:t>
+        <w:t xml:space="preserve">Measuring the clinical skills of healthcare providers is essential for improving the quality of care, but current survey methods are expensive and require trained enumerators to travel to health facilities in person. We developed a new approach that uses large language models (LLMs) – the technology behind tools like ChatGPT and Claude – to simulate patients in realistic clinical conversations that healthcare providers can complete on their phones or laptops over the Internet in their own language. In Vietnam, we tested this tool with 31 physicians across ten clinical scenarios. Providers found the simulated patient conversations realistic and easy to use. We also tested whether LLMs could automatically score the conversations, which showed reasonable agreement with human scoring, and performed nearly as well when scoring directly from Vietnamese, without requiring a separate translation step. When we compared these results from our tool against holistic expert physician ratings of the same conversations, the scores agreed well, suggesting that automatic transcript grading based on rubrics produces meaningful measures of clinical skill. This tool costs less than two US dollars for over a hundred consultations and required no in-person surveyors, making it potentially transformative for routine, large-scale monitoring of healthcare quality in resource-limited settings. The platform and code are openly available for adaptation.</w:t>
       </w:r>
     </w:p>
     <w:bookmarkEnd w:id="20"/>
@@ -1730,7 +1904,7 @@
         <w:t xml:space="preserve"> </w:t>
       </w:r>
       <w:r>
-        <w:t xml:space="preserve">(Ranson et al. 2010; Daniels et al. 2024)</w:t>
+        <w:t xml:space="preserve">(Ranson et al. 2010; Rowe et al. 2018; Daniels et al. 2024; Lilford et al. 2025)</w:t>
       </w:r>
       <w:r>
         <w:t xml:space="preserve">. Clinical vignettes – open-ended roleplay interactions with standardized patients – have emerged as a primary method for measuring provider competencies across health systems</w:t>
@@ -1739,7 +1913,7 @@
         <w:t xml:space="preserve"> </w:t>
       </w:r>
       <w:r>
-        <w:t xml:space="preserve">(Das and Hammer 2005; Leonard and Masatu 2005; Andrews et al. 2021)</w:t>
+        <w:t xml:space="preserve">(World Health Organization 2022; Das and Hammer 2005; Leonard and Masatu 2005; Andrews et al. 2021)</w:t>
       </w:r>
       <w:r>
         <w:t xml:space="preserve">. By eliciting each provider’s unprompted approach to diagnosis and management of simulated cases, vignettes measure the best possible standard of care that providers are capable of delivering</w:t>
@@ -1757,7 +1931,7 @@
         <w:t xml:space="preserve"> </w:t>
       </w:r>
       <w:r>
-        <w:t xml:space="preserve">(Andrews et al. 2021)</w:t>
+        <w:t xml:space="preserve">(Andrews et al. 2021; Das and Do 2023)</w:t>
       </w:r>
       <w:r>
         <w:t xml:space="preserve">. Digital multiple-choice formats undermine validity because unprompted elicitation of knowledge is the foundation of the method</w:t>
@@ -1801,7 +1975,7 @@
         <w:t xml:space="preserve"> </w:t>
       </w:r>
       <w:r>
-        <w:t xml:space="preserve">(Daniels et al. 2025)</w:t>
+        <w:t xml:space="preserve">(W. Zhang et al. 2026)</w:t>
       </w:r>
       <w:r>
         <w:t xml:space="preserve">. Automated scoring of clinical interactions using LLMs has shown promise but remains noisy, with studies reporting moderate agreement with human evaluators at best</w:t>
@@ -1827,7 +2001,7 @@
         <w:t xml:space="preserve"> </w:t>
       </w:r>
       <w:r>
-        <w:t xml:space="preserve">(Geiecke and Jaravel 2024)</w:t>
+        <w:t xml:space="preserve">(Geiecke and Jaravel Forthcoming; SurveyCTO (Dobility, Inc.) 2025)</w:t>
       </w:r>
       <w:r>
         <w:t xml:space="preserve"> </w:t>
@@ -2034,7 +2208,7 @@
         <w:pStyle w:val="BodyText"/>
       </w:pPr>
       <w:r>
-        <w:t xml:space="preserve">For the validation sample, the research team contacted and consented 22 providers enrolled in the 2024 cohort of the StITCH hepatitis care training program, which co-designed and delivered a people-centered model of care for hepatitis B and C at the primary health care level in Vietnam. The validation group was given a Zoom orientation with no additional in-person support. These providers were assigned to complete six vignettes selected at random (three general cases and three hepatitis cases each). Afterwards, they completed a traditional multiple-choice knowledge test on hepatitis care, which included clinical knowledge questions based on the same five hepatitis scenarios. Although the total number of providers included in the validation sample was small, they completed 132 interactions containing 433 unique data points, allowing sufficient independent variation to assess the relationships between performance measures given that we do not engage in statistical hypothesis testing.</w:t>
+        <w:t xml:space="preserve">For the validation sample, the research team contacted and consented 22 providers enrolled in the 2024-5 cohort of the StITCH hepatitis care training program, which co-designed and delivered a people-centered model of care for hepatitis B and C at the primary health care level in Vietnam. The validation group was given a Zoom orientation with no additional in-person support. These providers were assigned to complete six vignettes selected at random (three general cases and three hepatitis cases each). Afterwards, they completed a traditional multiple-choice knowledge test on hepatitis care, which included clinical knowledge questions based on the same five hepatitis scenarios. Although the total number of providers included in the validation sample was small, they completed 132 interactions containing 433 unique data points, allowing sufficient independent variation to assess the relationships between performance measures given that we do not engage in statistical hypothesis testing.</w:t>
       </w:r>
     </w:p>
     <w:bookmarkEnd w:id="25"/>
@@ -2058,7 +2232,7 @@
         <w:t xml:space="preserve"> </w:t>
       </w:r>
       <w:r>
-        <w:t xml:space="preserve">(Geiecke and Jaravel 2024)</w:t>
+        <w:t xml:space="preserve">(Geiecke and Jaravel Forthcoming; SurveyCTO (Dobility, Inc.) 2025)</w:t>
       </w:r>
       <w:r>
         <w:t xml:space="preserve">. Each clinical case was encoded as a structured system prompt (1,500–3,000 words) containing: the patient’s demographic background and presenting complaint; a comprehensive medical and social history; pre-scripted responses to anticipated history-taking questions organized by clinical domain; clinical examination findings to be revealed when specific examinations were ordered; laboratory and imaging results for relevant tests; and the correct diagnosis with recommended treatment and counseling points. To maintain standardization, the system prompt instructed the model to report results as</w:t>
@@ -2118,7 +2292,7 @@
         <w:pStyle w:val="BodyText"/>
       </w:pPr>
       <w:r>
-        <w:t xml:space="preserve">The OpenAI model gpt-4.1-nano was selected for cost-efficiency (approximately USD 0.015 per interaction) and adequate performance in Vietnamese-language roleplay. The SurveyCTO plugin manages conversational state by appending each user message and model response to the conversation history, which is passed in full with each subsequent API call. Providers accessed the survey on their personal smartphones or laptops via a URL link. The chatbot responded in Vietnamese (or the provider’s preferred language) and maintained conversational context throughout each interaction. Providers could ask history-taking questions, order clinical examinations and laboratory tests, and provide a diagnosis and treatment plan, all through natural-language text input.</w:t>
+        <w:t xml:space="preserve">The OpenAI model gpt-4.1-nano was selected after testing various model options for speed of response, cost-efficiency, and adequate performance in Vietnamese-language roleplay. The SurveyCTO plugin manages conversational state by appending each user message and model response to the conversation history, which is passed in full with each subsequent API call. Providers accessed the survey on their personal smartphones or laptops via a URL link. The chatbot responded in Vietnamese (selected by every provider) and maintained conversational context throughout each interaction. Providers could ask history-taking questions, order clinical examinations and laboratory tests, and provide a diagnosis and treatment plan, all through natural-language text input.</w:t>
       </w:r>
     </w:p>
     <w:bookmarkEnd w:id="26"/>
@@ -2136,22 +2310,7 @@
         <w:pStyle w:val="FirstParagraph"/>
       </w:pPr>
       <w:r>
-        <w:t xml:space="preserve">Interaction transcripts were translated from Vietnamese to English using Anthropic’s Claude language model (claude-haiku-4-5) and manually coded by the research team to determine whether each provider: (1) asked each of the pre-specified checklist history-taking questions, (2) ordered the recommended clinical examinations and laboratory tests, and (3) offered the correct diagnosis. The transcripts were also coded using the Anthropic Claude model (claude-haiku-4-5) with an identical schema as the manual coding, asking for each item,</w:t>
-      </w:r>
-      <w:r>
-        <w:t xml:space="preserve"> </w:t>
-      </w:r>
-      <w:r>
-        <w:t xml:space="preserve">“</w:t>
-      </w:r>
-      <w:r>
-        <w:t xml:space="preserve">In the following text, if the user was a doctor, did they specifically [ask/order/prescribe]…</w:t>
-      </w:r>
-      <w:r>
-        <w:t xml:space="preserve">”</w:t>
-      </w:r>
-      <w:r>
-        <w:t xml:space="preserve">. To assess whether a separate translation step was necessary, we also ran the LLM coding directly on the original Vietnamese transcripts using the same model and rubric. Using the human-coded and LLM-coded checklist items separately, a</w:t>
+        <w:t xml:space="preserve">Interaction transcripts were translated from Vietnamese to English using the Google Translate API and manually coded by the research team to determine whether each provider: (1) asked each of the pre-specified checklist history-taking questions, (2) ordered the recommended clinical examinations and laboratory tests, and (3) offered the correct diagnosis. The transcripts were also coded using the Anthropic Claude model (claude-haiku-4-5) with an identical rubric. The model was prompted to evaluate each transcript against all rubric items simultaneously: given the transcript, the provider’s stated diagnosis, and their treatment plan, the model determined for each item whether the provider addressed it (scored 1 with a supporting quote from the transcript) or did not (scored 0). In a second pass, the model was additionally asked to report a confidence level between 0.0 and 1.0 for each item score, enabling receiver operating characteristic (ROC) analysis. To assess whether a separate translation step was necessary, we ran both the binary and confidence-scored LLM coding on the original Vietnamese transcripts as well as the English translations, using the same model and rubric. Using the human-coded and LLM-coded checklist items separately, a</w:t>
       </w:r>
       <w:r>
         <w:t xml:space="preserve"> </w:t>
@@ -2249,7 +2408,7 @@
         <w:pStyle w:val="BodyText"/>
       </w:pPr>
       <w:r>
-        <w:t xml:space="preserve">For the validation sample, agreement between manual and automated data extraction was assessed by calculating the proportion of agreement, true positives, false positives, true negatives, and false negatives based on the human coding as ground truth. The two expert clinicians who developed the vignettes also scored provider performance on each transcript from 1–5 separately for history-taking, diagnosis accuracy, and management completeness (one using the Vietnamese original and one using the English translation). Agreement of the human grading with each of these measures was assessed through unadjusted ordinary least squares (OLS) regression. Clustering was not necessary in any case since we calculated results separately by scenario – no provider repeated the same scenario twice. This study is reported following the Standards for Reporting of Diagnostic Accuracy Studies (STARD) guidelines where applicable to the LLM-versus-human coding comparison, and the Strengthening the Reporting of Observational Studies in Epidemiology (STROBE) guidelines for the observational validation design. Completed checklists are provided in the</w:t>
+        <w:t xml:space="preserve">For the validation sample, agreement between manual and automated data extraction was assessed by calculating the proportion of agreement, true positives, false positives, true negatives, and false negatives based on the human coding as ground truth. The discriminative ability of the LLM coding was evaluated using receiver operating characteristic (ROC) analysis: for each item, the LLM’s implied probability of positive classification (defined as the reported confidence when the binary score was 1, and 1 minus the confidence when the binary score was 0) was used as a continuous predictor against the human-coded gold standard, and the area under the ROC curve (AUROC) was computed. The two expert clinicians who developed the vignettes also scored provider performance on each transcript from 1–5 separately for history-taking, diagnosis accuracy, and management completeness (one using the Vietnamese original and one using the English translation). Agreement of the human grading with each of these measures was assessed through unadjusted ordinary least squares (OLS) regression. Clustering was not necessary in any case since we calculated results separately by scenario – no provider repeated the same scenario twice. This study is reported following the Strengthening the Reporting of Observational Studies in Epidemiology (STROBE) guidelines for the observational validation design. A completed checklist is provided in the</w:t>
       </w:r>
       <w:r>
         <w:t xml:space="preserve"> </w:t>
@@ -2285,7 +2444,7 @@
     </w:p>
     <w:bookmarkEnd w:id="30"/>
     <w:bookmarkEnd w:id="31"/>
-    <w:bookmarkStart w:id="42" w:name="results"/>
+    <w:bookmarkStart w:id="41" w:name="results"/>
     <w:p>
       <w:pPr>
         <w:pStyle w:val="Heading1"/>
@@ -2597,7 +2756,7 @@
       </w:r>
     </w:p>
     <w:bookmarkEnd w:id="32"/>
-    <w:bookmarkStart w:id="41" w:name="validation-sample"/>
+    <w:bookmarkStart w:id="40" w:name="validation-sample"/>
     <w:p>
       <w:pPr>
         <w:pStyle w:val="Heading2"/>
@@ -2611,7 +2770,7 @@
         <w:pStyle w:val="FirstParagraph"/>
       </w:pPr>
       <w:r>
-        <w:t xml:space="preserve">Twenty-two providers completed 132 interactions in the validation sample (</w:t>
+        <w:t xml:space="preserve">Twenty-two providers completed 132 interactions in the validation sample; two interactions were excluded due to incomplete transcript coding, leaving 130 for analysis (</w:t>
       </w:r>
       <w:r>
         <w:rPr>
@@ -2638,37 +2797,7 @@
         </w:r>
       </w:hyperlink>
       <w:r>
-        <w:t xml:space="preserve">,</w:t>
-      </w:r>
-      <w:r>
-        <w:t xml:space="preserve"> </w:t>
-      </w:r>
-      <w:r>
-        <w:rPr>
-          <w:bCs/>
-          <w:b/>
-        </w:rPr>
-        <w:t xml:space="preserve">Table</w:t>
-      </w:r>
-      <w:r>
-        <w:rPr>
-          <w:bCs/>
-          <w:b/>
-        </w:rPr>
-        <w:t xml:space="preserve"> </w:t>
-      </w:r>
-      <w:hyperlink w:anchor="tab:summary">
-        <w:r>
-          <w:rPr>
-            <w:rStyle w:val="Hyperlink"/>
-            <w:bCs/>
-            <w:b/>
-          </w:rPr>
-          <w:t xml:space="preserve">2</w:t>
-        </w:r>
-      </w:hyperlink>
-      <w:r>
-        <w:t xml:space="preserve">). The average interaction lasted 10.19 minutes (95% CI: 9.03–11.35), excluding outliers lasting longer than one hour. The typical interaction resulted in the completion of 18.66% of the essential diagnostic checklist items for that case scenario (95% CI: 16.56–20.75). This low completion rate reflects the deliberately comprehensive nature of the checklists (30–55 case-specific items plus 19 common items per case;</w:t>
+        <w:t xml:space="preserve">). The average interaction lasted 10.19 minutes (95% CI: 9.03–11.35), excluding outliers lasting longer than one hour. The typical interaction resulted in the completion of 16.25% of the essential diagnostic checklist items for that case scenario (95% CI: 14.74–17.77). This low completion rate reflects the deliberately comprehensive nature of the checklists (30–55 case-specific items plus 19 common items per case;</w:t>
       </w:r>
       <w:r>
         <w:t xml:space="preserve"> </w:t>
@@ -2758,10 +2887,7 @@
         <w:t xml:space="preserve"> </w:t>
       </w:r>
       <w:r>
-        <w:t xml:space="preserve">= 0.49 and 0.59 for Vietnamese and English, respectively. In regression, a 10 percentage point (p.p.) increase in the checklist completion corresponded with an approximate 0.45-point increase in the expert rating.</w:t>
-      </w:r>
-      <w:r>
-        <w:t xml:space="preserve"> </w:t>
+        <w:t xml:space="preserve">= 0.55 and 0.60 for Vietnamese and English, respectively (</w:t>
       </w:r>
       <w:r>
         <w:rPr>
@@ -2788,10 +2914,7 @@
         </w:r>
       </w:hyperlink>
       <w:r>
-        <w:t xml:space="preserve"> </w:t>
-      </w:r>
-      <w:r>
-        <w:t xml:space="preserve">illustrates these correlations.</w:t>
+        <w:t xml:space="preserve">, Panels A and B). In regression, a 10 percentage point (p.p.) increase in the checklist completion corresponded with an approximate 0.64-point increase in the expert rating.</w:t>
       </w:r>
     </w:p>
     <w:bookmarkStart w:id="33" w:name="tab:cases"/>
@@ -2800,7 +2923,18 @@
         <w:pStyle w:val="TableCaption"/>
       </w:pPr>
       <w:r>
-        <w:t xml:space="preserve">Clinical case scenarios used in the vignette survey. Each case includes case-specific checklist items plus 19 common items (clinical examination and medication questions administered across all cases).</w:t>
+        <w:t xml:space="preserve">Clinical case scenarios and validation summary. Each provider completed six randomly assigned cases (</w:t>
+      </w:r>
+      <m:oMath>
+        <m:r>
+          <m:t>n</m:t>
+        </m:r>
+      </m:oMath>
+      <w:r>
+        <w:t xml:space="preserve"> </w:t>
+      </w:r>
+      <w:r>
+        <w:t xml:space="preserve">= 130 interactions from 22 providers, excluding two with incomplete transcript coding). Items column shows total checklist items per case (case-specific plus 19 common items administered across all cases). Checklist completion and expert ratings are condition-level means.</w:t>
       </w:r>
     </w:p>
     <w:tbl>
@@ -2809,13 +2943,17 @@
         <w:tblW w:type="auto" w:w="0"/>
         <w:tblLook w:firstRow="1" w:lastRow="0" w:firstColumn="0" w:lastColumn="0" w:noHBand="0" w:noVBand="0" w:val="0020"/>
         <w:jc w:val="start"/>
-        <w:tblCaption w:val="Clinical case scenarios used in the vignette survey. Each case includes case-specific checklist items plus 19 common items (clinical examination and medication questions administered across all cases)."/>
+        <w:tblCaption w:val="Clinical case scenarios and validation summary. Each provider completed six randomly assigned cases (n = 130 interactions from 22 providers, excluding two with incomplete transcript coding). Items column shows total checklist items per case (case-specific plus 19 common items administered across all cases). Checklist completion and expert ratings are condition-level means."/>
       </w:tblPr>
       <w:tblGrid>
-        <w:gridCol w:w="1980"/>
-        <w:gridCol w:w="1980"/>
-        <w:gridCol w:w="1980"/>
-        <w:gridCol w:w="1980"/>
+        <w:gridCol w:w="990"/>
+        <w:gridCol w:w="990"/>
+        <w:gridCol w:w="990"/>
+        <w:gridCol w:w="990"/>
+        <w:gridCol w:w="990"/>
+        <w:gridCol w:w="990"/>
+        <w:gridCol w:w="990"/>
+        <w:gridCol w:w="990"/>
       </w:tblGrid>
       <w:tr>
         <w:trPr>
@@ -2864,8 +3002,58 @@
               <w:pStyle w:val="Compact"/>
               <w:jc w:val="center"/>
             </w:pPr>
+            <m:oMath>
+              <m:r>
+                <m:t>N</m:t>
+              </m:r>
+            </m:oMath>
+          </w:p>
+        </w:tc>
+        <w:tc>
+          <w:tcPr/>
+          <w:p>
+            <w:pPr>
+              <w:pStyle w:val="Compact"/>
+              <w:jc w:val="center"/>
+            </w:pPr>
             <w:r>
-              <w:t xml:space="preserve">Checklist items</w:t>
+              <w:t xml:space="preserve">Items</w:t>
+            </w:r>
+          </w:p>
+        </w:tc>
+        <w:tc>
+          <w:tcPr/>
+          <w:p>
+            <w:pPr>
+              <w:pStyle w:val="Compact"/>
+              <w:jc w:val="right"/>
+            </w:pPr>
+            <w:r>
+              <w:t xml:space="preserve">Checklist (%)</w:t>
+            </w:r>
+          </w:p>
+        </w:tc>
+        <w:tc>
+          <w:tcPr/>
+          <w:p>
+            <w:pPr>
+              <w:pStyle w:val="Compact"/>
+              <w:jc w:val="right"/>
+            </w:pPr>
+            <w:r>
+              <w:t xml:space="preserve">Expert (VN)</w:t>
+            </w:r>
+          </w:p>
+        </w:tc>
+        <w:tc>
+          <w:tcPr/>
+          <w:p>
+            <w:pPr>
+              <w:pStyle w:val="Compact"/>
+              <w:jc w:val="right"/>
+            </w:pPr>
+            <w:r>
+              <w:t xml:space="preserve">Expert (EN)</w:t>
             </w:r>
           </w:p>
         </w:tc>
@@ -2879,498 +3067,10 @@
               <w:jc w:val="center"/>
             </w:pPr>
             <w:r>
-              <w:t xml:space="preserve">1</w:t>
+              <w:t xml:space="preserve">1 &amp; Asthma &amp; General &amp; 14 &amp; 62 &amp; 12.1 &amp; 3.07 &amp; 3.71</w:t>
             </w:r>
           </w:p>
         </w:tc>
-        <w:tc>
-          <w:tcPr/>
-          <w:p>
-            <w:pPr>
-              <w:pStyle w:val="Compact"/>
-              <w:jc w:val="left"/>
-            </w:pPr>
-            <w:r>
-              <w:t xml:space="preserve">Asthma</w:t>
-            </w:r>
-          </w:p>
-        </w:tc>
-        <w:tc>
-          <w:tcPr/>
-          <w:p>
-            <w:pPr>
-              <w:pStyle w:val="Compact"/>
-              <w:jc w:val="center"/>
-            </w:pPr>
-            <w:r>
-              <w:t xml:space="preserve">General</w:t>
-            </w:r>
-          </w:p>
-        </w:tc>
-        <w:tc>
-          <w:tcPr/>
-          <w:p>
-            <w:pPr>
-              <w:pStyle w:val="Compact"/>
-              <w:jc w:val="center"/>
-            </w:pPr>
-            <w:r>
-              <w:t xml:space="preserve">43</w:t>
-            </w:r>
-          </w:p>
-        </w:tc>
-      </w:tr>
-      <w:tr>
-        <w:tc>
-          <w:tcPr/>
-          <w:p>
-            <w:pPr>
-              <w:pStyle w:val="Compact"/>
-              <w:jc w:val="center"/>
-            </w:pPr>
-            <w:r>
-              <w:t xml:space="preserve">2</w:t>
-            </w:r>
-          </w:p>
-        </w:tc>
-        <w:tc>
-          <w:tcPr/>
-          <w:p>
-            <w:pPr>
-              <w:pStyle w:val="Compact"/>
-              <w:jc w:val="left"/>
-            </w:pPr>
-            <w:r>
-              <w:t xml:space="preserve">Pneumonia</w:t>
-            </w:r>
-          </w:p>
-        </w:tc>
-        <w:tc>
-          <w:tcPr/>
-          <w:p>
-            <w:pPr>
-              <w:pStyle w:val="Compact"/>
-              <w:jc w:val="center"/>
-            </w:pPr>
-            <w:r>
-              <w:t xml:space="preserve">General</w:t>
-            </w:r>
-          </w:p>
-        </w:tc>
-        <w:tc>
-          <w:tcPr/>
-          <w:p>
-            <w:pPr>
-              <w:pStyle w:val="Compact"/>
-              <w:jc w:val="center"/>
-            </w:pPr>
-            <w:r>
-              <w:t xml:space="preserve">30</w:t>
-            </w:r>
-          </w:p>
-        </w:tc>
-      </w:tr>
-      <w:tr>
-        <w:tc>
-          <w:tcPr/>
-          <w:p>
-            <w:pPr>
-              <w:pStyle w:val="Compact"/>
-              <w:jc w:val="center"/>
-            </w:pPr>
-            <w:r>
-              <w:t xml:space="preserve">3</w:t>
-            </w:r>
-          </w:p>
-        </w:tc>
-        <w:tc>
-          <w:tcPr/>
-          <w:p>
-            <w:pPr>
-              <w:pStyle w:val="Compact"/>
-              <w:jc w:val="left"/>
-            </w:pPr>
-            <w:r>
-              <w:t xml:space="preserve">Type 2 diabetes</w:t>
-            </w:r>
-          </w:p>
-        </w:tc>
-        <w:tc>
-          <w:tcPr/>
-          <w:p>
-            <w:pPr>
-              <w:pStyle w:val="Compact"/>
-              <w:jc w:val="center"/>
-            </w:pPr>
-            <w:r>
-              <w:t xml:space="preserve">General</w:t>
-            </w:r>
-          </w:p>
-        </w:tc>
-        <w:tc>
-          <w:tcPr/>
-          <w:p>
-            <w:pPr>
-              <w:pStyle w:val="Compact"/>
-              <w:jc w:val="center"/>
-            </w:pPr>
-            <w:r>
-              <w:t xml:space="preserve">39</w:t>
-            </w:r>
-          </w:p>
-        </w:tc>
-      </w:tr>
-      <w:tr>
-        <w:tc>
-          <w:tcPr/>
-          <w:p>
-            <w:pPr>
-              <w:pStyle w:val="Compact"/>
-              <w:jc w:val="center"/>
-            </w:pPr>
-            <w:r>
-              <w:t xml:space="preserve">4</w:t>
-            </w:r>
-          </w:p>
-        </w:tc>
-        <w:tc>
-          <w:tcPr/>
-          <w:p>
-            <w:pPr>
-              <w:pStyle w:val="Compact"/>
-              <w:jc w:val="left"/>
-            </w:pPr>
-            <w:r>
-              <w:t xml:space="preserve">Pulmonary tuberculosis</w:t>
-            </w:r>
-          </w:p>
-        </w:tc>
-        <w:tc>
-          <w:tcPr/>
-          <w:p>
-            <w:pPr>
-              <w:pStyle w:val="Compact"/>
-              <w:jc w:val="center"/>
-            </w:pPr>
-            <w:r>
-              <w:t xml:space="preserve">General</w:t>
-            </w:r>
-          </w:p>
-        </w:tc>
-        <w:tc>
-          <w:tcPr/>
-          <w:p>
-            <w:pPr>
-              <w:pStyle w:val="Compact"/>
-              <w:jc w:val="center"/>
-            </w:pPr>
-            <w:r>
-              <w:t xml:space="preserve">39</w:t>
-            </w:r>
-          </w:p>
-        </w:tc>
-      </w:tr>
-      <w:tr>
-        <w:tc>
-          <w:tcPr/>
-          <w:p>
-            <w:pPr>
-              <w:pStyle w:val="Compact"/>
-              <w:jc w:val="center"/>
-            </w:pPr>
-            <w:r>
-              <w:t xml:space="preserve">5</w:t>
-            </w:r>
-          </w:p>
-        </w:tc>
-        <w:tc>
-          <w:tcPr/>
-          <w:p>
-            <w:pPr>
-              <w:pStyle w:val="Compact"/>
-              <w:jc w:val="left"/>
-            </w:pPr>
-            <w:r>
-              <w:t xml:space="preserve">Hypertension</w:t>
-            </w:r>
-          </w:p>
-        </w:tc>
-        <w:tc>
-          <w:tcPr/>
-          <w:p>
-            <w:pPr>
-              <w:pStyle w:val="Compact"/>
-              <w:jc w:val="center"/>
-            </w:pPr>
-            <w:r>
-              <w:t xml:space="preserve">General</w:t>
-            </w:r>
-          </w:p>
-        </w:tc>
-        <w:tc>
-          <w:tcPr/>
-          <w:p>
-            <w:pPr>
-              <w:pStyle w:val="Compact"/>
-              <w:jc w:val="center"/>
-            </w:pPr>
-            <w:r>
-              <w:t xml:space="preserve">37</w:t>
-            </w:r>
-          </w:p>
-        </w:tc>
-      </w:tr>
-      <w:tr>
-        <w:tc>
-          <w:tcPr/>
-          <w:p>
-            <w:pPr>
-              <w:pStyle w:val="Compact"/>
-              <w:jc w:val="center"/>
-            </w:pPr>
-            <w:r>
-              <w:t xml:space="preserve">6</w:t>
-            </w:r>
-          </w:p>
-        </w:tc>
-        <w:tc>
-          <w:tcPr/>
-          <w:p>
-            <w:pPr>
-              <w:pStyle w:val="Compact"/>
-              <w:jc w:val="left"/>
-            </w:pPr>
-            <w:r>
-              <w:t xml:space="preserve">Hepatitis B (chronic)</w:t>
-            </w:r>
-          </w:p>
-        </w:tc>
-        <w:tc>
-          <w:tcPr/>
-          <w:p>
-            <w:pPr>
-              <w:pStyle w:val="Compact"/>
-              <w:jc w:val="center"/>
-            </w:pPr>
-            <w:r>
-              <w:t xml:space="preserve">Hepatitis</w:t>
-            </w:r>
-          </w:p>
-        </w:tc>
-        <w:tc>
-          <w:tcPr/>
-          <w:p>
-            <w:pPr>
-              <w:pStyle w:val="Compact"/>
-              <w:jc w:val="center"/>
-            </w:pPr>
-            <w:r>
-              <w:t xml:space="preserve">55</w:t>
-            </w:r>
-          </w:p>
-        </w:tc>
-      </w:tr>
-      <w:tr>
-        <w:tc>
-          <w:tcPr/>
-          <w:p>
-            <w:pPr>
-              <w:pStyle w:val="Compact"/>
-              <w:jc w:val="center"/>
-            </w:pPr>
-            <w:r>
-              <w:t xml:space="preserve">7</w:t>
-            </w:r>
-          </w:p>
-        </w:tc>
-        <w:tc>
-          <w:tcPr/>
-          <w:p>
-            <w:pPr>
-              <w:pStyle w:val="Compact"/>
-              <w:jc w:val="left"/>
-            </w:pPr>
-            <w:r>
-              <w:t xml:space="preserve">Hepatitis B (pregnancy)</w:t>
-            </w:r>
-          </w:p>
-        </w:tc>
-        <w:tc>
-          <w:tcPr/>
-          <w:p>
-            <w:pPr>
-              <w:pStyle w:val="Compact"/>
-              <w:jc w:val="center"/>
-            </w:pPr>
-            <w:r>
-              <w:t xml:space="preserve">Hepatitis</w:t>
-            </w:r>
-          </w:p>
-        </w:tc>
-        <w:tc>
-          <w:tcPr/>
-          <w:p>
-            <w:pPr>
-              <w:pStyle w:val="Compact"/>
-              <w:jc w:val="center"/>
-            </w:pPr>
-            <w:r>
-              <w:t xml:space="preserve">43</w:t>
-            </w:r>
-          </w:p>
-        </w:tc>
-      </w:tr>
-      <w:tr>
-        <w:tc>
-          <w:tcPr/>
-          <w:p>
-            <w:pPr>
-              <w:pStyle w:val="Compact"/>
-              <w:jc w:val="center"/>
-            </w:pPr>
-            <w:r>
-              <w:t xml:space="preserve">8</w:t>
-            </w:r>
-          </w:p>
-        </w:tc>
-        <w:tc>
-          <w:tcPr/>
-          <w:p>
-            <w:pPr>
-              <w:pStyle w:val="Compact"/>
-              <w:jc w:val="left"/>
-            </w:pPr>
-            <w:r>
-              <w:t xml:space="preserve">Hepatitis B (vaccination)</w:t>
-            </w:r>
-          </w:p>
-        </w:tc>
-        <w:tc>
-          <w:tcPr/>
-          <w:p>
-            <w:pPr>
-              <w:pStyle w:val="Compact"/>
-              <w:jc w:val="center"/>
-            </w:pPr>
-            <w:r>
-              <w:t xml:space="preserve">Hepatitis</w:t>
-            </w:r>
-          </w:p>
-        </w:tc>
-        <w:tc>
-          <w:tcPr/>
-          <w:p>
-            <w:pPr>
-              <w:pStyle w:val="Compact"/>
-              <w:jc w:val="center"/>
-            </w:pPr>
-            <w:r>
-              <w:t xml:space="preserve">39</w:t>
-            </w:r>
-          </w:p>
-        </w:tc>
-      </w:tr>
-      <w:tr>
-        <w:tc>
-          <w:tcPr/>
-          <w:p>
-            <w:pPr>
-              <w:pStyle w:val="Compact"/>
-              <w:jc w:val="center"/>
-            </w:pPr>
-            <w:r>
-              <w:t xml:space="preserve">9</w:t>
-            </w:r>
-          </w:p>
-        </w:tc>
-        <w:tc>
-          <w:tcPr/>
-          <w:p>
-            <w:pPr>
-              <w:pStyle w:val="Compact"/>
-              <w:jc w:val="left"/>
-            </w:pPr>
-            <w:r>
-              <w:t xml:space="preserve">Hepatitis C</w:t>
-            </w:r>
-          </w:p>
-        </w:tc>
-        <w:tc>
-          <w:tcPr/>
-          <w:p>
-            <w:pPr>
-              <w:pStyle w:val="Compact"/>
-              <w:jc w:val="center"/>
-            </w:pPr>
-            <w:r>
-              <w:t xml:space="preserve">Hepatitis</w:t>
-            </w:r>
-          </w:p>
-        </w:tc>
-        <w:tc>
-          <w:tcPr/>
-          <w:p>
-            <w:pPr>
-              <w:pStyle w:val="Compact"/>
-              <w:jc w:val="center"/>
-            </w:pPr>
-            <w:r>
-              <w:t xml:space="preserve">45</w:t>
-            </w:r>
-          </w:p>
-        </w:tc>
-      </w:tr>
-      <w:tr>
-        <w:tc>
-          <w:tcPr/>
-          <w:p>
-            <w:pPr>
-              <w:pStyle w:val="Compact"/>
-              <w:jc w:val="center"/>
-            </w:pPr>
-            <w:r>
-              <w:t xml:space="preserve">10</w:t>
-            </w:r>
-          </w:p>
-        </w:tc>
-        <w:tc>
-          <w:tcPr/>
-          <w:p>
-            <w:pPr>
-              <w:pStyle w:val="Compact"/>
-              <w:jc w:val="left"/>
-            </w:pPr>
-            <w:r>
-              <w:t xml:space="preserve">HIV/antiretroviral therapy</w:t>
-            </w:r>
-          </w:p>
-        </w:tc>
-        <w:tc>
-          <w:tcPr/>
-          <w:p>
-            <w:pPr>
-              <w:pStyle w:val="Compact"/>
-              <w:jc w:val="center"/>
-            </w:pPr>
-            <w:r>
-              <w:t xml:space="preserve">Hepatitis</w:t>
-            </w:r>
-          </w:p>
-        </w:tc>
-        <w:tc>
-          <w:tcPr/>
-          <w:p>
-            <w:pPr>
-              <w:pStyle w:val="Compact"/>
-              <w:jc w:val="center"/>
-            </w:pPr>
-            <w:r>
-              <w:t xml:space="preserve">44</w:t>
-            </w:r>
-          </w:p>
-        </w:tc>
-      </w:tr>
-      <w:tr>
         <w:tc>
           <w:tcPr/>
           <w:p>
@@ -3384,11 +3084,7 @@
           <w:p>
             <w:pPr>
               <w:pStyle w:val="Compact"/>
-              <w:jc w:val="left"/>
             </w:pPr>
-            <w:r>
-              <w:t xml:space="preserve">Common items (all cases)</w:t>
-            </w:r>
           </w:p>
         </w:tc>
         <w:tc>
@@ -3396,11 +3092,7 @@
           <w:p>
             <w:pPr>
               <w:pStyle w:val="Compact"/>
-              <w:jc w:val="center"/>
             </w:pPr>
-            <w:r>
-              <w:t xml:space="preserve">–</w:t>
-            </w:r>
           </w:p>
         </w:tc>
         <w:tc>
@@ -3408,62 +3100,7 @@
           <w:p>
             <w:pPr>
               <w:pStyle w:val="Compact"/>
-              <w:jc w:val="center"/>
             </w:pPr>
-            <w:r>
-              <w:t xml:space="preserve">19</w:t>
-            </w:r>
-          </w:p>
-        </w:tc>
-      </w:tr>
-    </w:tbl>
-    <w:bookmarkEnd w:id="33"/>
-    <w:bookmarkStart w:id="34" w:name="tab:summary"/>
-    <w:p>
-      <w:pPr>
-        <w:pStyle w:val="TableCaption"/>
-      </w:pPr>
-      <w:r>
-        <w:t xml:space="preserve">Validation sample summary statistics (</w:t>
-      </w:r>
-      <m:oMath>
-        <m:r>
-          <m:t>n</m:t>
-        </m:r>
-      </m:oMath>
-      <w:r>
-        <w:t xml:space="preserve"> </w:t>
-      </w:r>
-      <w:r>
-        <w:t xml:space="preserve">= 132 provider–case interactions from 22 providers completing six randomly assigned cases each).</w:t>
-      </w:r>
-    </w:p>
-    <w:tbl>
-      <w:tblPr>
-        <w:tblStyle w:val="Table"/>
-        <w:tblW w:type="auto" w:w="0"/>
-        <w:tblLook w:firstRow="1" w:lastRow="0" w:firstColumn="0" w:lastColumn="0" w:noHBand="0" w:noVBand="0" w:val="0020"/>
-        <w:jc w:val="start"/>
-        <w:tblCaption w:val="Validation sample summary statistics (n = 132 provider–case interactions from 22 providers completing six randomly assigned cases each)."/>
-      </w:tblPr>
-      <w:tblGrid>
-        <w:gridCol w:w="3960"/>
-        <w:gridCol w:w="3960"/>
-      </w:tblGrid>
-      <w:tr>
-        <w:trPr>
-          <w:tblHeader w:val="true"/>
-        </w:trPr>
-        <w:tc>
-          <w:tcPr/>
-          <w:p>
-            <w:pPr>
-              <w:pStyle w:val="Compact"/>
-              <w:jc w:val="left"/>
-            </w:pPr>
-            <w:r>
-              <w:t xml:space="preserve">Measure</w:t>
-            </w:r>
           </w:p>
         </w:tc>
         <w:tc>
@@ -3471,25 +3108,7 @@
           <w:p>
             <w:pPr>
               <w:pStyle w:val="Compact"/>
-              <w:jc w:val="center"/>
             </w:pPr>
-            <w:r>
-              <w:t xml:space="preserve">Mean (95% CI)</w:t>
-            </w:r>
-          </w:p>
-        </w:tc>
-      </w:tr>
-      <w:tr>
-        <w:tc>
-          <w:tcPr/>
-          <w:p>
-            <w:pPr>
-              <w:pStyle w:val="Compact"/>
-              <w:jc w:val="left"/>
-            </w:pPr>
-            <w:r>
-              <w:t xml:space="preserve">Interaction duration (minutes)</w:t>
-            </w:r>
           </w:p>
         </w:tc>
         <w:tc>
@@ -3497,25 +3116,7 @@
           <w:p>
             <w:pPr>
               <w:pStyle w:val="Compact"/>
-              <w:jc w:val="center"/>
             </w:pPr>
-            <w:r>
-              <w:t xml:space="preserve">10.19 (9.03–11.35)</w:t>
-            </w:r>
-          </w:p>
-        </w:tc>
-      </w:tr>
-      <w:tr>
-        <w:tc>
-          <w:tcPr/>
-          <w:p>
-            <w:pPr>
-              <w:pStyle w:val="Compact"/>
-              <w:jc w:val="left"/>
-            </w:pPr>
-            <w:r>
-              <w:t xml:space="preserve">Checklist completion (%)</w:t>
-            </w:r>
           </w:p>
         </w:tc>
         <w:tc>
@@ -3523,68 +3124,12 @@
           <w:p>
             <w:pPr>
               <w:pStyle w:val="Compact"/>
-              <w:jc w:val="center"/>
             </w:pPr>
-            <w:r>
-              <w:t xml:space="preserve">18.66 (16.56–20.75)</w:t>
-            </w:r>
-          </w:p>
-        </w:tc>
-      </w:tr>
-      <w:tr>
-        <w:tc>
-          <w:tcPr/>
-          <w:p>
-            <w:pPr>
-              <w:pStyle w:val="Compact"/>
-              <w:jc w:val="left"/>
-            </w:pPr>
-            <w:r>
-              <w:t xml:space="preserve">Expert rating, Vietnamese (1–5)</w:t>
-            </w:r>
-          </w:p>
-        </w:tc>
-        <w:tc>
-          <w:tcPr/>
-          <w:p>
-            <w:pPr>
-              <w:pStyle w:val="Compact"/>
-              <w:jc w:val="center"/>
-            </w:pPr>
-            <w:r>
-              <w:t xml:space="preserve">3.42 (3.24–3.59)</w:t>
-            </w:r>
-          </w:p>
-        </w:tc>
-      </w:tr>
-      <w:tr>
-        <w:tc>
-          <w:tcPr/>
-          <w:p>
-            <w:pPr>
-              <w:pStyle w:val="Compact"/>
-              <w:jc w:val="left"/>
-            </w:pPr>
-            <w:r>
-              <w:t xml:space="preserve">Expert rating, English (1–5)</w:t>
-            </w:r>
-          </w:p>
-        </w:tc>
-        <w:tc>
-          <w:tcPr/>
-          <w:p>
-            <w:pPr>
-              <w:pStyle w:val="Compact"/>
-              <w:jc w:val="center"/>
-            </w:pPr>
-            <w:r>
-              <w:t xml:space="preserve">3.21 (3.05–3.37)</w:t>
-            </w:r>
           </w:p>
         </w:tc>
       </w:tr>
     </w:tbl>
-    <w:bookmarkEnd w:id="34"/>
+    <w:bookmarkEnd w:id="33"/>
     <w:p>
       <w:pPr>
         <w:pStyle w:val="BodyText"/>
@@ -3654,7 +3199,7 @@
         </w:r>
       </w:hyperlink>
       <w:r>
-        <w:t xml:space="preserve">, Panel C). When the LLM coded directly from the original Vietnamese transcripts – without a separate translation step – performance was comparable (Pearson’s</w:t>
+        <w:t xml:space="preserve">, Panel D). When the LLM coded directly from the original Vietnamese transcripts – without a separate translation step – performance was comparable (Pearson’s</w:t>
       </w:r>
       <w:r>
         <w:t xml:space="preserve"> </w:t>
@@ -3721,7 +3266,7 @@
         </w:r>
       </w:hyperlink>
       <w:r>
-        <w:t xml:space="preserve">, Panel D), suggesting that translation is not a binding constraint for multilingual deployment.</w:t>
+        <w:t xml:space="preserve">, Panel C), suggesting that translation is not a binding constraint for multilingual deployment.</w:t>
       </w:r>
     </w:p>
     <w:p>
@@ -3729,10 +3274,7 @@
         <w:pStyle w:val="BodyText"/>
       </w:pPr>
       <w:r>
-        <w:t xml:space="preserve">The accuracy of the LLM coding of the essential diagnostic items varied widely.</w:t>
-      </w:r>
-      <w:r>
-        <w:t xml:space="preserve"> </w:t>
+        <w:t xml:space="preserve">The discriminative ability of the LLM coding was assessed using ROC analysis, treating the human coding as the gold standard and the LLM’s confidence-weighted probability as the continuous classifier (</w:t>
       </w:r>
       <w:r>
         <w:rPr>
@@ -3759,28 +3301,7 @@
         </w:r>
       </w:hyperlink>
       <w:r>
-        <w:t xml:space="preserve"> </w:t>
-      </w:r>
-      <w:r>
-        <w:t xml:space="preserve">plots the sensitivity and specificity of the LLM coding for 304 items for which both were calculable. The mean sensitivity was 0.31 (95% CI: 0.26–0.35); the mean specificity was 0.85 (95% CI: 0.83–0.87). There were three major clusters of items. First, many items had zero sensitivity, most of which had very few positives in the data; a large cluster of those had perfect specificity, indicating that the LLM accurately predicted</w:t>
-      </w:r>
-      <w:r>
-        <w:t xml:space="preserve"> </w:t>
-      </w:r>
-      <w:r>
-        <w:t xml:space="preserve">“</w:t>
-      </w:r>
-      <w:r>
-        <w:t xml:space="preserve">No</w:t>
-      </w:r>
-      <w:r>
-        <w:t xml:space="preserve">”</w:t>
-      </w:r>
-      <w:r>
-        <w:t xml:space="preserve"> </w:t>
-      </w:r>
-      <w:r>
-        <w:t xml:space="preserve">for these items each time. Another cluster had perfect sensitivity and varied widely in specificity. Notably, among the remaining items, most were above the line of unity.</w:t>
+        <w:t xml:space="preserve">). The AUROC for English transcript coding was 0.87 and for Vietnamese transcript coding was 0.87, indicating good discriminative ability in both languages. The ROC curves for both languages were similar in shape, consistent with the finding that direct Vietnamese coding performs comparably to coding from English translations.</w:t>
       </w:r>
     </w:p>
     <w:p>
@@ -3792,18 +3313,18 @@
           <wp:inline>
             <wp:extent cx="5029200" cy="4572000"/>
             <wp:effectExtent b="0" l="0" r="0" t="0"/>
-            <wp:docPr descr="" title="" id="36" name="Picture"/>
+            <wp:docPr descr="" title="" id="35" name="Picture"/>
             <a:graphic>
               <a:graphicData uri="http://schemas.openxmlformats.org/drawingml/2006/picture">
                 <pic:pic>
                   <pic:nvPicPr>
-                    <pic:cNvPr descr="exhibits/F2.pdf" id="37" name="Picture"/>
+                    <pic:cNvPr descr="exhibits/F2.pdf" id="36" name="Picture"/>
                     <pic:cNvPicPr>
                       <a:picLocks noChangeArrowheads="1" noChangeAspect="1"/>
                     </pic:cNvPicPr>
                   </pic:nvPicPr>
                   <pic:blipFill>
-                    <a:blip r:embed="rId35"/>
+                    <a:blip r:embed="rId34"/>
                     <a:stretch>
                       <a:fillRect/>
                     </a:stretch>
@@ -3835,7 +3356,7 @@
         <w:pStyle w:val="ImageCaption"/>
       </w:pPr>
       <w:r>
-        <w:t xml:space="preserve">Validation of essential diagnostic checklist scores. Human-coded checklist completion (vertical axis) plotted against: Panel A: expert rating from original Vietnamese transcripts; Panel B: expert rating from translated English transcripts; Panel C: Claude-coded checklist from English transcripts; Panel D: Claude-coded checklist directly from Vietnamese transcripts. Each point is one provider–case interaction. Lines show OLS fit with 95% confidence interval.</w:t>
+        <w:t xml:space="preserve">Validation of essential diagnostic checklist scores. Human-coded checklist completion (vertical axis) plotted against: Panel A: expert rating from original Vietnamese transcripts; Panel B: expert rating from translated English transcripts; Panel C: Claude-coded checklist directly from Vietnamese transcripts; Panel D: Claude-coded checklist from English transcripts. Each point is one provider–case interaction. Lines show OLS fit with 95% confidence interval.</w:t>
       </w:r>
     </w:p>
     <w:p>
@@ -3847,18 +3368,18 @@
           <wp:inline>
             <wp:extent cx="5029200" cy="4572000"/>
             <wp:effectExtent b="0" l="0" r="0" t="0"/>
-            <wp:docPr descr="" title="" id="39" name="Picture"/>
+            <wp:docPr descr="" title="" id="38" name="Picture"/>
             <a:graphic>
               <a:graphicData uri="http://schemas.openxmlformats.org/drawingml/2006/picture">
                 <pic:pic>
                   <pic:nvPicPr>
-                    <pic:cNvPr descr="exhibits/F3.pdf" id="40" name="Picture"/>
+                    <pic:cNvPr descr="exhibits/F3.pdf" id="39" name="Picture"/>
                     <pic:cNvPicPr>
                       <a:picLocks noChangeArrowheads="1" noChangeAspect="1"/>
                     </pic:cNvPicPr>
                   </pic:nvPicPr>
                   <pic:blipFill>
-                    <a:blip r:embed="rId38"/>
+                    <a:blip r:embed="rId37"/>
                     <a:stretch>
                       <a:fillRect/>
                     </a:stretch>
@@ -3890,12 +3411,12 @@
         <w:pStyle w:val="ImageCaption"/>
       </w:pPr>
       <w:r>
-        <w:t xml:space="preserve">Item-level sensitivity and specificity of LLM coding against human coding. Panel A: coding from translated English transcripts. Panel B: coding directly from Vietnamese transcripts. Each point represents one checklist item. Items above the dashed line of unity have specificity exceeding sensitivity.</w:t>
-      </w:r>
-    </w:p>
+        <w:t xml:space="preserve">Receiver operating characteristic (ROC) curves for LLM coding of checklist items against human-coded gold standard. Panel A: coding from translated English transcripts. Panel B: coding directly from Vietnamese transcripts. The diagonal dashed line represents chance performance (AUROC = 0.5). AUROC values are shown in subtitles.</w:t>
+      </w:r>
+    </w:p>
+    <w:bookmarkEnd w:id="40"/>
     <w:bookmarkEnd w:id="41"/>
-    <w:bookmarkEnd w:id="42"/>
-    <w:bookmarkStart w:id="45" w:name="discussion"/>
+    <w:bookmarkStart w:id="44" w:name="discussion"/>
     <w:p>
       <w:pPr>
         <w:pStyle w:val="Heading1"/>
@@ -4108,7 +3629,7 @@
         <w:t xml:space="preserve"> </w:t>
       </w:r>
       <w:r>
-        <w:t xml:space="preserve">(Das et al. 2022; Sassi et al. 2024; Zhang et al. 2024; Harrison, Cohen, and Walton 2015)</w:t>
+        <w:t xml:space="preserve">(Das et al. 2022; Sassi et al. 2024; L. Zhang et al. 2024; Harrison, Cohen, and Walton 2015)</w:t>
       </w:r>
       <w:r>
         <w:t xml:space="preserve">, and Vietnam specifically</w:t>
@@ -4117,7 +3638,7 @@
         <w:t xml:space="preserve"> </w:t>
       </w:r>
       <w:r>
-        <w:t xml:space="preserve">(Demombynes and Hurt 2016; Zawahir et al. 2021)</w:t>
+        <w:t xml:space="preserve">(Demombynes et al. 2016; Zawahir et al. 2021)</w:t>
       </w:r>
       <w:r>
         <w:t xml:space="preserve"> </w:t>
@@ -4129,13 +3650,13 @@
         <w:t xml:space="preserve"> </w:t>
       </w:r>
       <w:r>
-        <w:t xml:space="preserve">(Demombynes and Hurt 2016)</w:t>
+        <w:t xml:space="preserve">(Demombynes et al. 2016)</w:t>
       </w:r>
       <w:r>
         <w:t xml:space="preserve">; the expense of replication has prevented a post-pandemic update. Tools like the one presented here could enable continuous, routine monitoring at a fraction of the cost of traditional approaches.</w:t>
       </w:r>
     </w:p>
-    <w:bookmarkStart w:id="43" w:name="limitations"/>
+    <w:bookmarkStart w:id="42" w:name="limitations"/>
     <w:p>
       <w:pPr>
         <w:pStyle w:val="Heading2"/>
@@ -4160,7 +3681,7 @@
         <w:t xml:space="preserve"> </w:t>
       </w:r>
       <w:r>
-        <w:t xml:space="preserve">= 0.51–0.53), the low mean sensitivity (0.31) suggests the LLM frequently fails to detect actions that providers did take, which would systematically underestimate competency if used without human review. Fourth, we validated against human-coded checklists and expert ratings, but did not compare against direct clinical observation; the well-documented</w:t>
+        <w:t xml:space="preserve">= 0.51–0.53), the ROC analysis indicates that the LLM’s discriminative ability, though good (AUROC = 0.87), is imperfect, and classification errors could systematically bias competency estimates if used without human review. Fourth, we validated against human-coded checklists and expert ratings, but did not compare against direct clinical observation; the well-documented</w:t>
       </w:r>
       <w:r>
         <w:t xml:space="preserve"> </w:t>
@@ -4190,14 +3711,33 @@
         <w:t xml:space="preserve">. Fifth, the text-based interaction format inherently lacks non-verbal clinical cues (e.g., visual inspection, auscultation sounds), which may constrain the types of clinical reasoning that can be assessed. Sixth, LLM behavior may vary across model versions and over time, which could affect reproducibility; we report specific model versions to facilitate replication. Finally, the platform requires internet connectivity and smartphone access, which may limit deployment in the most resource-constrained settings.</w:t>
       </w:r>
     </w:p>
+    <w:bookmarkEnd w:id="42"/>
+    <w:bookmarkStart w:id="43" w:name="conclusion"/>
+    <w:p>
+      <w:pPr>
+        <w:pStyle w:val="Heading2"/>
+      </w:pPr>
+      <w:r>
+        <w:t xml:space="preserve">Conclusion</w:t>
+      </w:r>
+    </w:p>
+    <w:p>
+      <w:pPr>
+        <w:pStyle w:val="FirstParagraph"/>
+      </w:pPr>
+      <w:r>
+        <w:t xml:space="preserve">This study demonstrates that LLM-driven conversational vignettes can produce a low-cost, flexible, and scalable platform for measuring health care provider competencies. The method eliminates the need for in-person enumerators while preserving the open-ended interaction format that is the foundation of vignette validity. The platform is open-source, built on widely used survey software, and designed for adaptation to a wide variety of clinical contexts and languages. As LLM capabilities continue to improve, both the chatbot interactions and the automated data extraction are likely to become more reliable, further reducing the cost and increasing the feasibility of routine competency measurement. With further validation across settings and languages, this method has the potential to support rapid, low-cost measurement of health care provider competencies in diverse health system contexts.</w:t>
+      </w:r>
+    </w:p>
     <w:bookmarkEnd w:id="43"/>
-    <w:bookmarkStart w:id="44" w:name="conclusion"/>
-    <w:p>
-      <w:pPr>
-        <w:pStyle w:val="Heading2"/>
-      </w:pPr>
-      <w:r>
-        <w:t xml:space="preserve">Conclusion</w:t>
+    <w:bookmarkEnd w:id="44"/>
+    <w:bookmarkStart w:id="45" w:name="acknowledgments"/>
+    <w:p>
+      <w:pPr>
+        <w:pStyle w:val="Heading1"/>
+      </w:pPr>
+      <w:r>
+        <w:t xml:space="preserve">Acknowledgments</w:t>
       </w:r>
     </w:p>
     <w:p>
@@ -4205,30 +3745,11 @@
         <w:pStyle w:val="FirstParagraph"/>
       </w:pPr>
       <w:r>
-        <w:t xml:space="preserve">This study demonstrates that LLM-driven conversational vignettes can produce a low-cost, flexible, and scalable platform for measuring health care provider competencies. The method eliminates the need for in-person enumerators while preserving the open-ended interaction format that is the foundation of vignette validity. The platform is open-source, built on widely used survey software, and designed for adaptation to a wide variety of clinical contexts and languages. As LLM capabilities continue to improve, both the chatbot interactions and the automated data extraction are likely to become more reliable, further reducing the cost and increasing the feasibility of routine competency measurement. With further validation across settings and languages, this method has the potential to support rapid, low-cost measurement of health care provider competencies in diverse health system contexts.</w:t>
-      </w:r>
-    </w:p>
-    <w:bookmarkEnd w:id="44"/>
+        <w:t xml:space="preserve">We acknowledge support in clinical vignette development, as well as transcript grading, from Dr. Marwatunnisa Al Mubarokah. We acknowledge additional support in vignette development and localization, as well as in leading the focus group and transcript grading, from Dr. Pham Thanh Thuy. We acknowledge the invaluable assistance, advice, and logistical coordination from Thu Huyen Nguyen and the rest of the staff at HAIVN. We acknowledge support in technical development of the survey plugin by Amrik Cooper and Mofya Phiri of Dobility, Inc. (SurveyCTO). We thank the participants in the focus group, management at Phu Tho Province General Hospital, and all respondents and StITCH program staff for their time, expertise, and feedback.</w:t>
+      </w:r>
+    </w:p>
     <w:bookmarkEnd w:id="45"/>
-    <w:bookmarkStart w:id="46" w:name="acknowledgments"/>
-    <w:p>
-      <w:pPr>
-        <w:pStyle w:val="Heading1"/>
-      </w:pPr>
-      <w:r>
-        <w:t xml:space="preserve">Acknowledgments</w:t>
-      </w:r>
-    </w:p>
-    <w:p>
-      <w:pPr>
-        <w:pStyle w:val="FirstParagraph"/>
-      </w:pPr>
-      <w:r>
-        <w:t xml:space="preserve">We acknowledge support in clinical vignette development, as well as transcript grading, from Dr. Marwatunnisa Al Mubarokah. We acknowledge additional support in vignette development and localization, as well as in leading the focus group and transcript grading, from Dr. Pham Thanh Thuy. We acknowledge the invaluable assistance, advice, and logistical coordination from Thu Huyen Nguyen and the rest of the staff at HAIVN. We acknowledge support in technical development of the survey plugin by Amrik Cooper and Mofya Phiri of Dobility, Inc. (SurveyCTO). We thank the participants in the focus group, management at Phu Tho Province General Hospital, and all respondents and StITCH program staff for their time, expertise, and feedback.</w:t>
-      </w:r>
-    </w:p>
-    <w:bookmarkEnd w:id="46"/>
-    <w:bookmarkStart w:id="47" w:name="author-contributions"/>
+    <w:bookmarkStart w:id="46" w:name="author-contributions"/>
     <w:p>
       <w:pPr>
         <w:pStyle w:val="Heading1"/>
@@ -4463,8 +3984,8 @@
         <w:t xml:space="preserve">BD, WSZ, HN, DD.</w:t>
       </w:r>
     </w:p>
-    <w:bookmarkEnd w:id="47"/>
-    <w:bookmarkStart w:id="49" w:name="data-availability-statement"/>
+    <w:bookmarkEnd w:id="46"/>
+    <w:bookmarkStart w:id="48" w:name="data-availability-statement"/>
     <w:p>
       <w:pPr>
         <w:pStyle w:val="Heading1"/>
@@ -4478,12 +3999,12 @@
         <w:pStyle w:val="FirstParagraph"/>
       </w:pPr>
       <w:r>
-        <w:t xml:space="preserve">The analytical code, structured rubric data, and de-identified aggregated data supporting the findings of this study are publicly available at</w:t>
-      </w:r>
-      <w:r>
-        <w:t xml:space="preserve"> </w:t>
-      </w:r>
-      <w:hyperlink r:id="rId48">
+        <w:t xml:space="preserve">All data and code needed to reproduce the analyses in this study – including clinical case rubrics, interaction transcripts, human and LLM coding, expert ratings, and analytical scripts – are publicly available at</w:t>
+      </w:r>
+      <w:r>
+        <w:t xml:space="preserve"> </w:t>
+      </w:r>
+      <w:hyperlink r:id="rId47">
         <w:r>
           <w:rPr>
             <w:rStyle w:val="Hyperlink"/>
@@ -4492,17 +4013,35 @@
         </w:r>
       </w:hyperlink>
       <w:r>
-        <w:t xml:space="preserve">. Individual-level transcript data cannot be shared publicly because they contain identifiable clinical interaction content from a small number of participants who consented to research use only; access to these data may be requested through the Mass General Brigham Institutional Review Board (Protocol 2023P003011).</w:t>
+        <w:t xml:space="preserve">.</w:t>
+      </w:r>
+    </w:p>
+    <w:bookmarkEnd w:id="48"/>
+    <w:bookmarkStart w:id="49" w:name="competing-interests"/>
+    <w:p>
+      <w:pPr>
+        <w:pStyle w:val="Heading1"/>
+      </w:pPr>
+      <w:r>
+        <w:t xml:space="preserve">Competing interests</w:t>
+      </w:r>
+    </w:p>
+    <w:p>
+      <w:pPr>
+        <w:pStyle w:val="FirstParagraph"/>
+      </w:pPr>
+      <w:r>
+        <w:t xml:space="preserve">The authors declare no competing interests.</w:t>
       </w:r>
     </w:p>
     <w:bookmarkEnd w:id="49"/>
-    <w:bookmarkStart w:id="50" w:name="competing-interests"/>
+    <w:bookmarkStart w:id="50" w:name="financial-disclosure"/>
     <w:p>
       <w:pPr>
         <w:pStyle w:val="Heading1"/>
       </w:pPr>
       <w:r>
-        <w:t xml:space="preserve">Competing interests</w:t>
+        <w:t xml:space="preserve">Financial disclosure</w:t>
       </w:r>
     </w:p>
     <w:p>
@@ -4510,29 +4049,11 @@
         <w:pStyle w:val="FirstParagraph"/>
       </w:pPr>
       <w:r>
-        <w:t xml:space="preserve">The authors declare no competing interests.</w:t>
+        <w:t xml:space="preserve">This work was supported by the Harvard University Asia Center, the Harvard University Rose Service Learning Fellowship program, the Harvard University Institute for Quantitative Social Science, and Gilead Sciences. The funders had no role in study design, data collection and analysis, decision to publish, or preparation of the manuscript.</w:t>
       </w:r>
     </w:p>
     <w:bookmarkEnd w:id="50"/>
-    <w:bookmarkStart w:id="51" w:name="financial-disclosure"/>
-    <w:p>
-      <w:pPr>
-        <w:pStyle w:val="Heading1"/>
-      </w:pPr>
-      <w:r>
-        <w:t xml:space="preserve">Financial disclosure</w:t>
-      </w:r>
-    </w:p>
-    <w:p>
-      <w:pPr>
-        <w:pStyle w:val="FirstParagraph"/>
-      </w:pPr>
-      <w:r>
-        <w:t xml:space="preserve">This work was supported by the Harvard University Asia Center, the Harvard University Rose Service Learning Fellowship program, the Harvard University Institute for Quantitative Social Science, and Gilead Sciences. The funders had no role in study design, data collection and analysis, decision to publish, or preparation of the manuscript.</w:t>
-      </w:r>
-    </w:p>
-    <w:bookmarkEnd w:id="51"/>
-    <w:bookmarkStart w:id="72" w:name="supporting-information"/>
+    <w:bookmarkStart w:id="79" w:name="supporting-information"/>
     <w:p>
       <w:pPr>
         <w:pStyle w:val="Heading1"/>
@@ -4667,90 +4188,14 @@
         <w:t xml:space="preserve">STROBE checklist for observational studies.</w:t>
       </w:r>
     </w:p>
-    <w:p>
-      <w:pPr>
-        <w:pStyle w:val="BodyText"/>
-      </w:pPr>
-      <w:r>
-        <w:rPr>
-          <w:bCs/>
-          <w:b/>
-        </w:rPr>
-        <w:t xml:space="preserve">S2 Checklist.</w:t>
-      </w:r>
-      <w:r>
-        <w:t xml:space="preserve"> </w:t>
-      </w:r>
-      <w:r>
-        <w:t xml:space="preserve">STARD checklist for diagnostic accuracy studies.</w:t>
-      </w:r>
-    </w:p>
-    <w:bookmarkStart w:id="71" w:name="refs"/>
-    <w:bookmarkStart w:id="52" w:name="ref-andrews2021quality"/>
+    <w:bookmarkStart w:id="78" w:name="refs"/>
+    <w:bookmarkStart w:id="51" w:name="ref-andrews2021quality"/>
     <w:p>
       <w:pPr>
         <w:pStyle w:val="Bibliography"/>
       </w:pPr>
       <w:r>
         <w:t xml:space="preserve">Andrews, Kathryn, Roberta Gatti, Ciro Avitabile, Roberta Conner, Jitendra Sharma, and Angela Yi Chang. 2021.</w:t>
-      </w:r>
-      <w:r>
-        <w:t xml:space="preserve"> </w:t>
-      </w:r>
-      <w:r>
-        <w:t xml:space="preserve">“The Quality of Health and Education Systems Across</w:t>
-      </w:r>
-      <w:r>
-        <w:t xml:space="preserve"> </w:t>
-      </w:r>
-      <w:r>
-        <w:t xml:space="preserve">Africa</w:t>
-      </w:r>
-      <w:r>
-        <w:t xml:space="preserve">:</w:t>
-      </w:r>
-      <w:r>
-        <w:t xml:space="preserve"> </w:t>
-      </w:r>
-      <w:r>
-        <w:t xml:space="preserve">E</w:t>
-      </w:r>
-      <w:r>
-        <w:t xml:space="preserve">vidence from a Decade of</w:t>
-      </w:r>
-      <w:r>
-        <w:t xml:space="preserve"> </w:t>
-      </w:r>
-      <w:r>
-        <w:t xml:space="preserve">Service Delivery Indicators</w:t>
-      </w:r>
-      <w:r>
-        <w:t xml:space="preserve"> </w:t>
-      </w:r>
-      <w:r>
-        <w:t xml:space="preserve">Surveys.”</w:t>
-      </w:r>
-      <w:r>
-        <w:t xml:space="preserve"> </w:t>
-      </w:r>
-      <w:r>
-        <w:t xml:space="preserve">World Bank Publications.</w:t>
-      </w:r>
-    </w:p>
-    <w:bookmarkEnd w:id="52"/>
-    <w:bookmarkStart w:id="53" w:name="ref-cook2025virtual"/>
-    <w:p>
-      <w:pPr>
-        <w:pStyle w:val="Bibliography"/>
-      </w:pPr>
-      <w:r>
-        <w:t xml:space="preserve">Cook, David A, Joshua Overgaard, V Shane Pankratz, Guilherme Del Fiol, and Christopher A Aakre. 2025.</w:t>
-      </w:r>
-      <w:r>
-        <w:t xml:space="preserve"> </w:t>
-      </w:r>
-      <w:r>
-        <w:t xml:space="preserve">“Virtual Patients Using Large Language Models: Scalable, Contextualized Simulation of Clinician-Patient Dialogue with Feedback.”</w:t>
       </w:r>
       <w:r>
         <w:t xml:space="preserve"> </w:t>
@@ -4760,84 +4205,13 @@
           <w:iCs/>
           <w:i/>
         </w:rPr>
-        <w:t xml:space="preserve">Journal of Medical Internet Research</w:t>
-      </w:r>
-      <w:r>
-        <w:t xml:space="preserve"> </w:t>
-      </w:r>
-      <w:r>
-        <w:t xml:space="preserve">27: e68486.</w:t>
-      </w:r>
-    </w:p>
-    <w:bookmarkEnd w:id="53"/>
-    <w:bookmarkStart w:id="54" w:name="ref-daniels2024medical"/>
-    <w:p>
-      <w:pPr>
-        <w:pStyle w:val="Bibliography"/>
-      </w:pPr>
-      <w:r>
-        <w:t xml:space="preserve">Daniels, Benjamin, Angela Yi Chang, Roberta Gatti, and Jishnu Das. 2024.</w:t>
-      </w:r>
-      <w:r>
-        <w:t xml:space="preserve"> </w:t>
-      </w:r>
-      <w:r>
-        <w:t xml:space="preserve">“The Medical Competence of Health Care Providers in Sub-</w:t>
-      </w:r>
-      <w:r>
-        <w:t xml:space="preserve">Saharan</w:t>
-      </w:r>
-      <w:r>
-        <w:t xml:space="preserve"> </w:t>
-      </w:r>
-      <w:r>
-        <w:t xml:space="preserve">Africa</w:t>
-      </w:r>
-      <w:r>
-        <w:t xml:space="preserve">:</w:t>
-      </w:r>
-      <w:r>
-        <w:t xml:space="preserve"> </w:t>
-      </w:r>
-      <w:r>
-        <w:t xml:space="preserve">E</w:t>
-      </w:r>
-      <w:r>
-        <w:t xml:space="preserve">vidence from 16,127 Providers Across 11 Countries.”</w:t>
-      </w:r>
-      <w:r>
-        <w:t xml:space="preserve"> </w:t>
+        <w:t xml:space="preserve">The Quality of Health and Education Systems Across</w:t>
       </w:r>
       <w:r>
         <w:rPr>
           <w:iCs/>
           <w:i/>
         </w:rPr>
-        <w:t xml:space="preserve">Health Affairs Scholar</w:t>
-      </w:r>
-      <w:r>
-        <w:t xml:space="preserve"> </w:t>
-      </w:r>
-      <w:r>
-        <w:t xml:space="preserve">2: qxae066.</w:t>
-      </w:r>
-    </w:p>
-    <w:bookmarkEnd w:id="54"/>
-    <w:bookmarkStart w:id="55" w:name="ref-daniels2025scoping"/>
-    <w:p>
-      <w:pPr>
-        <w:pStyle w:val="Bibliography"/>
-      </w:pPr>
-      <w:r>
-        <w:t xml:space="preserve">Daniels, Benjamin, Wenjia Zhang, Hoang Nguyen, and David Duong. 2025.</w:t>
-      </w:r>
-      <w:r>
-        <w:t xml:space="preserve"> </w:t>
-      </w:r>
-      <w:r>
-        <w:t xml:space="preserve">“Artificial Intelligence for Clinical Competency Assessment: A Scoping Review of Methods and Applications.”</w:t>
-      </w:r>
-      <w:r>
         <w:t xml:space="preserve"> </w:t>
       </w:r>
       <w:r>
@@ -4845,149 +4219,20 @@
           <w:iCs/>
           <w:i/>
         </w:rPr>
-        <w:t xml:space="preserve">JMIR Preprints</w:t>
-      </w:r>
-      <w:r>
-        <w:t xml:space="preserve">.</w:t>
-      </w:r>
-    </w:p>
-    <w:bookmarkEnd w:id="55"/>
-    <w:bookmarkStart w:id="56" w:name="ref-das2022two"/>
-    <w:p>
-      <w:pPr>
-        <w:pStyle w:val="Bibliography"/>
-      </w:pPr>
-      <w:r>
-        <w:t xml:space="preserve">Das, Jishnu, Benjamin Daniels, Monisha Ashok, Eun-Young Shim, and Karthik Muralidharan. 2022.</w:t>
-      </w:r>
-      <w:r>
-        <w:t xml:space="preserve"> </w:t>
-      </w:r>
-      <w:r>
-        <w:t xml:space="preserve">“Two</w:t>
-      </w:r>
-      <w:r>
-        <w:t xml:space="preserve"> </w:t>
-      </w:r>
-      <w:r>
-        <w:t xml:space="preserve">Indias</w:t>
-      </w:r>
-      <w:r>
-        <w:t xml:space="preserve">:</w:t>
-      </w:r>
-      <w:r>
-        <w:t xml:space="preserve"> </w:t>
-      </w:r>
-      <w:r>
-        <w:t xml:space="preserve">T</w:t>
-      </w:r>
-      <w:r>
-        <w:t xml:space="preserve">he Structure of Primary Health Care Markets in Rural</w:t>
-      </w:r>
-      <w:r>
-        <w:t xml:space="preserve"> </w:t>
-      </w:r>
-      <w:r>
-        <w:t xml:space="preserve">Indian</w:t>
-      </w:r>
-      <w:r>
-        <w:t xml:space="preserve"> </w:t>
-      </w:r>
-      <w:r>
-        <w:t xml:space="preserve">Villages with Implications for Policy.”</w:t>
-      </w:r>
-      <w:r>
-        <w:t xml:space="preserve"> </w:t>
+        <w:t xml:space="preserve">Africa</w:t>
       </w:r>
       <w:r>
         <w:rPr>
           <w:iCs/>
           <w:i/>
         </w:rPr>
-        <w:t xml:space="preserve">Social Science &amp; Medicine</w:t>
-      </w:r>
-      <w:r>
-        <w:t xml:space="preserve"> </w:t>
-      </w:r>
-      <w:r>
-        <w:t xml:space="preserve">301: 112799.</w:t>
-      </w:r>
-    </w:p>
-    <w:bookmarkEnd w:id="56"/>
-    <w:bookmarkStart w:id="57" w:name="ref-das2005which"/>
-    <w:p>
-      <w:pPr>
-        <w:pStyle w:val="Bibliography"/>
-      </w:pPr>
-      <w:r>
-        <w:t xml:space="preserve">Das, Jishnu, and Jeffrey Hammer. 2005.</w:t>
-      </w:r>
-      <w:r>
-        <w:t xml:space="preserve"> </w:t>
-      </w:r>
-      <w:r>
-        <w:t xml:space="preserve">“Which Doctor?</w:t>
-      </w:r>
-      <w:r>
-        <w:t xml:space="preserve"> </w:t>
-      </w:r>
-      <w:r>
-        <w:t xml:space="preserve">C</w:t>
-      </w:r>
-      <w:r>
-        <w:t xml:space="preserve">ombining Vignettes and Item Response to Measure Clinical Competence.”</w:t>
-      </w:r>
-      <w:r>
-        <w:t xml:space="preserve"> </w:t>
+        <w:t xml:space="preserve">:</w:t>
       </w:r>
       <w:r>
         <w:rPr>
           <w:iCs/>
           <w:i/>
         </w:rPr>
-        <w:t xml:space="preserve">Journal of Development Economics</w:t>
-      </w:r>
-      <w:r>
-        <w:t xml:space="preserve"> </w:t>
-      </w:r>
-      <w:r>
-        <w:t xml:space="preserve">78 (2): 348–83.</w:t>
-      </w:r>
-    </w:p>
-    <w:bookmarkEnd w:id="57"/>
-    <w:bookmarkStart w:id="58" w:name="ref-das2007money"/>
-    <w:p>
-      <w:pPr>
-        <w:pStyle w:val="Bibliography"/>
-      </w:pPr>
-      <w:r>
-        <w:t xml:space="preserve">———. 2007.</w:t>
-      </w:r>
-      <w:r>
-        <w:t xml:space="preserve"> </w:t>
-      </w:r>
-      <w:r>
-        <w:t xml:space="preserve">“Money for Nothing:</w:t>
-      </w:r>
-      <w:r>
-        <w:t xml:space="preserve"> </w:t>
-      </w:r>
-      <w:r>
-        <w:t xml:space="preserve">T</w:t>
-      </w:r>
-      <w:r>
-        <w:t xml:space="preserve">he Dire Straits of Medical Practice in</w:t>
-      </w:r>
-      <w:r>
-        <w:t xml:space="preserve"> </w:t>
-      </w:r>
-      <w:r>
-        <w:t xml:space="preserve">Delhi, India</w:t>
-      </w:r>
-      <w:r>
-        <w:t xml:space="preserve">.”</w:t>
-      </w:r>
-      <w:r>
         <w:t xml:space="preserve"> </w:t>
       </w:r>
       <w:r>
@@ -4995,107 +4240,447 @@
           <w:iCs/>
           <w:i/>
         </w:rPr>
-        <w:t xml:space="preserve">Journal of Development Economics</w:t>
-      </w:r>
-      <w:r>
-        <w:t xml:space="preserve"> </w:t>
-      </w:r>
-      <w:r>
-        <w:t xml:space="preserve">83 (1): 1–36.</w:t>
-      </w:r>
-    </w:p>
-    <w:bookmarkEnd w:id="58"/>
-    <w:bookmarkStart w:id="59" w:name="ref-demombynes2016quality"/>
-    <w:p>
-      <w:pPr>
-        <w:pStyle w:val="Bibliography"/>
-      </w:pPr>
-      <w:r>
-        <w:t xml:space="preserve">Demombynes, Gabriel, and Kenneth Hurt. 2016.</w:t>
-      </w:r>
-      <w:r>
-        <w:t xml:space="preserve"> </w:t>
-      </w:r>
-      <w:r>
-        <w:t xml:space="preserve">“Quality and Equity in Basic Health Care Services in</w:t>
-      </w:r>
-      <w:r>
-        <w:t xml:space="preserve"> </w:t>
-      </w:r>
-      <w:r>
-        <w:t xml:space="preserve">Vietnam</w:t>
-      </w:r>
-      <w:r>
-        <w:t xml:space="preserve">:</w:t>
-      </w:r>
-      <w:r>
-        <w:t xml:space="preserve"> </w:t>
-      </w:r>
-      <w:r>
-        <w:t xml:space="preserve">F</w:t>
-      </w:r>
-      <w:r>
-        <w:t xml:space="preserve">indings from the</w:t>
-      </w:r>
-      <w:r>
-        <w:t xml:space="preserve"> </w:t>
-      </w:r>
-      <w:r>
-        <w:t xml:space="preserve">Vietnam District and Commune Health Facility Survey</w:t>
-      </w:r>
-      <w:r>
-        <w:t xml:space="preserve">.”</w:t>
-      </w:r>
-      <w:r>
-        <w:t xml:space="preserve"> </w:t>
-      </w:r>
-      <w:r>
-        <w:t xml:space="preserve">World Bank.</w:t>
-      </w:r>
-    </w:p>
-    <w:bookmarkEnd w:id="59"/>
-    <w:bookmarkStart w:id="60" w:name="ref-geathers2025benchmarking"/>
-    <w:p>
-      <w:pPr>
-        <w:pStyle w:val="Bibliography"/>
-      </w:pPr>
-      <w:r>
-        <w:t xml:space="preserve">Geathers, Jadon, Yann Hicke, Colleen Chan, et al. 2025.</w:t>
-      </w:r>
-      <w:r>
-        <w:t xml:space="preserve"> </w:t>
-      </w:r>
-      <w:r>
-        <w:t xml:space="preserve">“Benchmarking Generative</w:t>
-      </w:r>
-      <w:r>
-        <w:t xml:space="preserve"> </w:t>
-      </w:r>
-      <w:r>
-        <w:t xml:space="preserve">AI</w:t>
-      </w:r>
-      <w:r>
-        <w:t xml:space="preserve"> </w:t>
-      </w:r>
-      <w:r>
-        <w:t xml:space="preserve">for Scoring Medical Student Interviews in Objective Structured Clinical Examinations (</w:t>
-      </w:r>
-      <w:r>
-        <w:t xml:space="preserve">OSCEs</w:t>
-      </w:r>
-      <w:r>
-        <w:t xml:space="preserve">).”</w:t>
-      </w:r>
-      <w:r>
-        <w:t xml:space="preserve"> </w:t>
+        <w:t xml:space="preserve">E</w:t>
       </w:r>
       <w:r>
         <w:rPr>
           <w:iCs/>
           <w:i/>
         </w:rPr>
-        <w:t xml:space="preserve">arXiv</w:t>
-      </w:r>
+        <w:t xml:space="preserve">vidence from a Decade of</w:t>
+      </w:r>
+      <w:r>
+        <w:rPr>
+          <w:iCs/>
+          <w:i/>
+        </w:rPr>
+        <w:t xml:space="preserve"> </w:t>
+      </w:r>
+      <w:r>
+        <w:rPr>
+          <w:iCs/>
+          <w:i/>
+        </w:rPr>
+        <w:t xml:space="preserve">Service Delivery Indicators</w:t>
+      </w:r>
+      <w:r>
+        <w:rPr>
+          <w:iCs/>
+          <w:i/>
+        </w:rPr>
+        <w:t xml:space="preserve"> </w:t>
+      </w:r>
+      <w:r>
+        <w:rPr>
+          <w:iCs/>
+          <w:i/>
+        </w:rPr>
+        <w:t xml:space="preserve">Surveys</w:t>
+      </w:r>
+      <w:r>
+        <w:t xml:space="preserve">. World Bank Publications.</w:t>
+      </w:r>
+    </w:p>
+    <w:bookmarkEnd w:id="51"/>
+    <w:bookmarkStart w:id="52" w:name="ref-cook2025virtual"/>
+    <w:p>
+      <w:pPr>
+        <w:pStyle w:val="Bibliography"/>
+      </w:pPr>
+      <w:r>
+        <w:t xml:space="preserve">Cook, David A, Joshua Overgaard, V Shane Pankratz, Guilherme Del Fiol, and Christopher A Aakre. 2025.</w:t>
+      </w:r>
+      <w:r>
+        <w:t xml:space="preserve"> </w:t>
+      </w:r>
+      <w:r>
+        <w:t xml:space="preserve">“Virtual Patients Using Large Language Models:</w:t>
+      </w:r>
+      <w:r>
+        <w:t xml:space="preserve"> </w:t>
+      </w:r>
+      <w:r>
+        <w:t xml:space="preserve">Scalable</w:t>
+      </w:r>
+      <w:r>
+        <w:t xml:space="preserve">, Contextualized Simulation of Clinician-Patient Dialogue with Feedback.”</w:t>
+      </w:r>
+      <w:r>
+        <w:t xml:space="preserve"> </w:t>
+      </w:r>
+      <w:r>
+        <w:rPr>
+          <w:iCs/>
+          <w:i/>
+        </w:rPr>
+        <w:t xml:space="preserve">Journal of Medical Internet Research</w:t>
+      </w:r>
+      <w:r>
+        <w:t xml:space="preserve"> </w:t>
+      </w:r>
+      <w:r>
+        <w:t xml:space="preserve">27: e68486.</w:t>
+      </w:r>
+    </w:p>
+    <w:bookmarkEnd w:id="52"/>
+    <w:bookmarkStart w:id="53" w:name="ref-daniels2024medical"/>
+    <w:p>
+      <w:pPr>
+        <w:pStyle w:val="Bibliography"/>
+      </w:pPr>
+      <w:r>
+        <w:t xml:space="preserve">Daniels, Benjamin, Angela Yi Chang, Roberta Gatti, and Jishnu Das. 2024.</w:t>
+      </w:r>
+      <w:r>
+        <w:t xml:space="preserve"> </w:t>
+      </w:r>
+      <w:r>
+        <w:t xml:space="preserve">“The Medical Competence of Health Care Providers in Sub-</w:t>
+      </w:r>
+      <w:r>
+        <w:t xml:space="preserve">Saharan</w:t>
+      </w:r>
+      <w:r>
+        <w:t xml:space="preserve"> </w:t>
+      </w:r>
+      <w:r>
+        <w:t xml:space="preserve">Africa</w:t>
+      </w:r>
+      <w:r>
+        <w:t xml:space="preserve">:</w:t>
+      </w:r>
+      <w:r>
+        <w:t xml:space="preserve"> </w:t>
+      </w:r>
+      <w:r>
+        <w:t xml:space="preserve">E</w:t>
+      </w:r>
+      <w:r>
+        <w:t xml:space="preserve">vidence from 16,127 Providers Across 11 Countries.”</w:t>
+      </w:r>
+      <w:r>
+        <w:t xml:space="preserve"> </w:t>
+      </w:r>
+      <w:r>
+        <w:rPr>
+          <w:iCs/>
+          <w:i/>
+        </w:rPr>
+        <w:t xml:space="preserve">Health Affairs Scholar</w:t>
+      </w:r>
+      <w:r>
+        <w:t xml:space="preserve"> </w:t>
+      </w:r>
+      <w:r>
+        <w:t xml:space="preserve">2: qxae066.</w:t>
+      </w:r>
+    </w:p>
+    <w:bookmarkEnd w:id="53"/>
+    <w:bookmarkStart w:id="54" w:name="ref-das2022two"/>
+    <w:p>
+      <w:pPr>
+        <w:pStyle w:val="Bibliography"/>
+      </w:pPr>
+      <w:r>
+        <w:t xml:space="preserve">Das, Jishnu, Benjamin Daniels, Monisha Ashok, Eun-Young Shim, and Karthik Muralidharan. 2022.</w:t>
+      </w:r>
+      <w:r>
+        <w:t xml:space="preserve"> </w:t>
+      </w:r>
+      <w:r>
+        <w:t xml:space="preserve">“Two</w:t>
+      </w:r>
+      <w:r>
+        <w:t xml:space="preserve"> </w:t>
+      </w:r>
+      <w:r>
+        <w:t xml:space="preserve">Indias</w:t>
+      </w:r>
+      <w:r>
+        <w:t xml:space="preserve">:</w:t>
+      </w:r>
+      <w:r>
+        <w:t xml:space="preserve"> </w:t>
+      </w:r>
+      <w:r>
+        <w:t xml:space="preserve">T</w:t>
+      </w:r>
+      <w:r>
+        <w:t xml:space="preserve">he Structure of Primary Health Care Markets in Rural</w:t>
+      </w:r>
+      <w:r>
+        <w:t xml:space="preserve"> </w:t>
+      </w:r>
+      <w:r>
+        <w:t xml:space="preserve">Indian</w:t>
+      </w:r>
+      <w:r>
+        <w:t xml:space="preserve"> </w:t>
+      </w:r>
+      <w:r>
+        <w:t xml:space="preserve">Villages with Implications for Policy.”</w:t>
+      </w:r>
+      <w:r>
+        <w:t xml:space="preserve"> </w:t>
+      </w:r>
+      <w:r>
+        <w:rPr>
+          <w:iCs/>
+          <w:i/>
+        </w:rPr>
+        <w:t xml:space="preserve">Social Science &amp; Medicine</w:t>
+      </w:r>
+      <w:r>
+        <w:t xml:space="preserve"> </w:t>
+      </w:r>
+      <w:r>
+        <w:t xml:space="preserve">301: 112799.</w:t>
+      </w:r>
+    </w:p>
+    <w:bookmarkEnd w:id="54"/>
+    <w:bookmarkStart w:id="55" w:name="ref-das2023prices"/>
+    <w:p>
+      <w:pPr>
+        <w:pStyle w:val="Bibliography"/>
+      </w:pPr>
+      <w:r>
+        <w:t xml:space="preserve">Das, Jishnu, and Quy-Toan Do. 2023.</w:t>
+      </w:r>
+      <w:r>
+        <w:t xml:space="preserve"> </w:t>
+      </w:r>
+      <w:r>
+        <w:t xml:space="preserve">“The Prices in the Crises:</w:t>
+      </w:r>
+      <w:r>
+        <w:t xml:space="preserve"> </w:t>
+      </w:r>
+      <w:r>
+        <w:t xml:space="preserve">W</w:t>
+      </w:r>
+      <w:r>
+        <w:t xml:space="preserve">hat We Are Learning from 20 Years of Health Insurance in Low-and Middle-Income Countries.”</w:t>
+      </w:r>
+      <w:r>
+        <w:t xml:space="preserve"> </w:t>
+      </w:r>
+      <w:r>
+        <w:rPr>
+          <w:iCs/>
+          <w:i/>
+        </w:rPr>
+        <w:t xml:space="preserve">Journal of Economic Perspectives</w:t>
+      </w:r>
+      <w:r>
+        <w:t xml:space="preserve"> </w:t>
+      </w:r>
+      <w:r>
+        <w:t xml:space="preserve">37 (2): 123–52.</w:t>
+      </w:r>
+    </w:p>
+    <w:bookmarkEnd w:id="55"/>
+    <w:bookmarkStart w:id="56" w:name="ref-das2005which"/>
+    <w:p>
+      <w:pPr>
+        <w:pStyle w:val="Bibliography"/>
+      </w:pPr>
+      <w:r>
+        <w:t xml:space="preserve">Das, Jishnu, and Jeffrey Hammer. 2005.</w:t>
+      </w:r>
+      <w:r>
+        <w:t xml:space="preserve"> </w:t>
+      </w:r>
+      <w:r>
+        <w:t xml:space="preserve">“Which Doctor?</w:t>
+      </w:r>
+      <w:r>
+        <w:t xml:space="preserve"> </w:t>
+      </w:r>
+      <w:r>
+        <w:t xml:space="preserve">C</w:t>
+      </w:r>
+      <w:r>
+        <w:t xml:space="preserve">ombining Vignettes and Item Response to Measure Clinical Competence.”</w:t>
+      </w:r>
+      <w:r>
+        <w:t xml:space="preserve"> </w:t>
+      </w:r>
+      <w:r>
+        <w:rPr>
+          <w:iCs/>
+          <w:i/>
+        </w:rPr>
+        <w:t xml:space="preserve">Journal of Development Economics</w:t>
+      </w:r>
+      <w:r>
+        <w:t xml:space="preserve"> </w:t>
+      </w:r>
+      <w:r>
+        <w:t xml:space="preserve">78 (2): 348–83.</w:t>
+      </w:r>
+    </w:p>
+    <w:bookmarkEnd w:id="56"/>
+    <w:bookmarkStart w:id="57" w:name="ref-das2007money"/>
+    <w:p>
+      <w:pPr>
+        <w:pStyle w:val="Bibliography"/>
+      </w:pPr>
+      <w:r>
+        <w:t xml:space="preserve">———. 2007.</w:t>
+      </w:r>
+      <w:r>
+        <w:t xml:space="preserve"> </w:t>
+      </w:r>
+      <w:r>
+        <w:t xml:space="preserve">“Money for Nothing:</w:t>
+      </w:r>
+      <w:r>
+        <w:t xml:space="preserve"> </w:t>
+      </w:r>
+      <w:r>
+        <w:t xml:space="preserve">T</w:t>
+      </w:r>
+      <w:r>
+        <w:t xml:space="preserve">he Dire Straits of Medical Practice in</w:t>
+      </w:r>
+      <w:r>
+        <w:t xml:space="preserve"> </w:t>
+      </w:r>
+      <w:r>
+        <w:t xml:space="preserve">Delhi, India</w:t>
+      </w:r>
+      <w:r>
+        <w:t xml:space="preserve">.”</w:t>
+      </w:r>
+      <w:r>
+        <w:t xml:space="preserve"> </w:t>
+      </w:r>
+      <w:r>
+        <w:rPr>
+          <w:iCs/>
+          <w:i/>
+        </w:rPr>
+        <w:t xml:space="preserve">Journal of Development Economics</w:t>
+      </w:r>
+      <w:r>
+        <w:t xml:space="preserve"> </w:t>
+      </w:r>
+      <w:r>
+        <w:t xml:space="preserve">83 (1): 1–36.</w:t>
+      </w:r>
+    </w:p>
+    <w:bookmarkEnd w:id="57"/>
+    <w:bookmarkStart w:id="58" w:name="ref-demombynes2016quality"/>
+    <w:p>
+      <w:pPr>
+        <w:pStyle w:val="Bibliography"/>
+      </w:pPr>
+      <w:r>
+        <w:t xml:space="preserve">Demombynes, Gabriel, Kari Hurt, Jishnu Das, Obert Pimhidzai, Huong Lan Dao, Ha Thi Ngoc Tran, and Benjamin Daniels. 2016.</w:t>
+      </w:r>
+      <w:r>
+        <w:t xml:space="preserve"> </w:t>
+      </w:r>
+      <w:r>
+        <w:t xml:space="preserve">“Quality and Equity in Basic Health Care Services in</w:t>
+      </w:r>
+      <w:r>
+        <w:t xml:space="preserve"> </w:t>
+      </w:r>
+      <w:r>
+        <w:t xml:space="preserve">Vietnam</w:t>
+      </w:r>
+      <w:r>
+        <w:t xml:space="preserve">:</w:t>
+      </w:r>
+      <w:r>
+        <w:t xml:space="preserve"> </w:t>
+      </w:r>
+      <w:r>
+        <w:t xml:space="preserve">F</w:t>
+      </w:r>
+      <w:r>
+        <w:t xml:space="preserve">indings from the</w:t>
+      </w:r>
+      <w:r>
+        <w:t xml:space="preserve"> </w:t>
+      </w:r>
+      <w:r>
+        <w:t xml:space="preserve">Vietnam District and Commune Health Facility Survey</w:t>
+      </w:r>
+      <w:r>
+        <w:t xml:space="preserve">.”</w:t>
+      </w:r>
+      <w:r>
+        <w:t xml:space="preserve"> </w:t>
+      </w:r>
+      <w:r>
+        <w:t xml:space="preserve">World Bank.</w:t>
+      </w:r>
+    </w:p>
+    <w:bookmarkEnd w:id="58"/>
+    <w:bookmarkStart w:id="60" w:name="ref-geathers2025benchmarking"/>
+    <w:p>
+      <w:pPr>
+        <w:pStyle w:val="Bibliography"/>
+      </w:pPr>
+      <w:r>
+        <w:t xml:space="preserve">Geathers, Jadon, Yann Hicke, Colleen Chan, et al. 2025.</w:t>
+      </w:r>
+      <w:r>
+        <w:t xml:space="preserve"> </w:t>
+      </w:r>
+      <w:r>
+        <w:t xml:space="preserve">“Benchmarking Generative</w:t>
+      </w:r>
+      <w:r>
+        <w:t xml:space="preserve"> </w:t>
+      </w:r>
+      <w:r>
+        <w:t xml:space="preserve">AI</w:t>
+      </w:r>
+      <w:r>
+        <w:t xml:space="preserve"> </w:t>
+      </w:r>
+      <w:r>
+        <w:t xml:space="preserve">for Scoring Medical Student Interviews in Objective Structured Clinical Examinations (</w:t>
+      </w:r>
+      <w:r>
+        <w:t xml:space="preserve">OSCEs</w:t>
+      </w:r>
+      <w:r>
+        <w:t xml:space="preserve">).”</w:t>
+      </w:r>
+      <w:r>
+        <w:t xml:space="preserve"> </w:t>
+      </w:r>
+      <w:r>
+        <w:t xml:space="preserve">In</w:t>
+      </w:r>
+      <w:r>
+        <w:t xml:space="preserve"> </w:t>
+      </w:r>
+      <w:r>
+        <w:rPr>
+          <w:iCs/>
+          <w:i/>
+        </w:rPr>
+        <w:t xml:space="preserve">Artificial Intelligence in Education (AIED 2025)</w:t>
+      </w:r>
+      <w:r>
+        <w:t xml:space="preserve">, 231–45. Lecture Notes in Computer Science. Springer.</w:t>
+      </w:r>
+      <w:r>
+        <w:t xml:space="preserve"> </w:t>
+      </w:r>
+      <w:hyperlink r:id="rId59">
+        <w:r>
+          <w:rPr>
+            <w:rStyle w:val="Hyperlink"/>
+          </w:rPr>
+          <w:t xml:space="preserve">https://doi.org/10.1007/978-3-031-98420-4_17</w:t>
+        </w:r>
+      </w:hyperlink>
       <w:r>
         <w:t xml:space="preserve">.</w:t>
       </w:r>
@@ -5107,7 +4692,7 @@
         <w:pStyle w:val="Bibliography"/>
       </w:pPr>
       <w:r>
-        <w:t xml:space="preserve">Geiecke, Friedrich, and Xavier Jaravel. 2024.</w:t>
+        <w:t xml:space="preserve">Geiecke, Friedrich, and Xavier Jaravel. Forthcoming.</w:t>
       </w:r>
       <w:r>
         <w:t xml:space="preserve"> </w:t>
@@ -5144,7 +4729,7 @@
         <w:t xml:space="preserve">Review of Economic Studies</w:t>
       </w:r>
       <w:r>
-        <w:t xml:space="preserve">.</w:t>
+        <w:t xml:space="preserve">, Forthcoming.</w:t>
       </w:r>
     </w:p>
     <w:bookmarkEnd w:id="61"/>
@@ -5154,7 +4739,7 @@
         <w:pStyle w:val="Bibliography"/>
       </w:pPr>
       <w:r>
-        <w:t xml:space="preserve">Harrison, Reema, Adeline Weihao Sara Cohen, and Merrilyn Walton. 2015.</w:t>
+        <w:t xml:space="preserve">Harrison, Reema, Adrienne Wai Seung Cohen, and Merrilyn Walton. 2015.</w:t>
       </w:r>
       <w:r>
         <w:t xml:space="preserve"> </w:t>
@@ -5299,19 +4884,19 @@
       </w:r>
     </w:p>
     <w:bookmarkEnd w:id="65"/>
-    <w:bookmarkStart w:id="66" w:name="ref-ranson2010priorities"/>
+    <w:bookmarkStart w:id="66" w:name="ref-lilford2025policy"/>
     <w:p>
       <w:pPr>
         <w:pStyle w:val="Bibliography"/>
       </w:pPr>
       <w:r>
-        <w:t xml:space="preserve">Ranson, Michael K, Mickey Chopra, Salla Atkins, Mario R Dal Poz, and Sara Bennett. 2010.</w:t>
-      </w:r>
-      <w:r>
-        <w:t xml:space="preserve"> </w:t>
-      </w:r>
-      <w:r>
-        <w:t xml:space="preserve">“Priorities for Research into Human Resources for Health in Low-and Middle-Income Countries.”</w:t>
+        <w:t xml:space="preserve">Lilford, Richard J, Benjamin Daniels, Barbara McPake, et al. 2025.</w:t>
+      </w:r>
+      <w:r>
+        <w:t xml:space="preserve"> </w:t>
+      </w:r>
+      <w:r>
+        <w:t xml:space="preserve">“Policy and Service Delivery Proposals to Improve Primary Care Services in Low-Income and Middle-Income Country Cities.”</w:t>
       </w:r>
       <w:r>
         <w:t xml:space="preserve"> </w:t>
@@ -5321,62 +4906,29 @@
           <w:iCs/>
           <w:i/>
         </w:rPr>
-        <w:t xml:space="preserve">Bulletin of the World Health Organization</w:t>
-      </w:r>
-      <w:r>
-        <w:t xml:space="preserve"> </w:t>
-      </w:r>
-      <w:r>
-        <w:t xml:space="preserve">88: 435–43.</w:t>
+        <w:t xml:space="preserve">The Lancet Global Health</w:t>
+      </w:r>
+      <w:r>
+        <w:t xml:space="preserve"> </w:t>
+      </w:r>
+      <w:r>
+        <w:t xml:space="preserve">13: e954–66.</w:t>
       </w:r>
     </w:p>
     <w:bookmarkEnd w:id="66"/>
-    <w:bookmarkStart w:id="67" w:name="ref-sassi2024impact"/>
+    <w:bookmarkStart w:id="67" w:name="ref-ranson2010priorities"/>
     <w:p>
       <w:pPr>
         <w:pStyle w:val="Bibliography"/>
       </w:pPr>
       <w:r>
-        <w:t xml:space="preserve">Sassi, Alessandro, Bony Wiem Lestari, Kartika Untari Nuriman El Muna, et al. 2024.</w:t>
-      </w:r>
-      <w:r>
-        <w:t xml:space="preserve"> </w:t>
-      </w:r>
-      <w:r>
-        <w:t xml:space="preserve">“Impact of the</w:t>
-      </w:r>
-      <w:r>
-        <w:t xml:space="preserve"> </w:t>
-      </w:r>
-      <w:r>
-        <w:t xml:space="preserve">COVID-19</w:t>
-      </w:r>
-      <w:r>
-        <w:t xml:space="preserve"> </w:t>
-      </w:r>
-      <w:r>
-        <w:t xml:space="preserve">Pandemic on Quality of Tuberculosis Care in Private Facilities in</w:t>
-      </w:r>
-      <w:r>
-        <w:t xml:space="preserve"> </w:t>
-      </w:r>
-      <w:r>
-        <w:t xml:space="preserve">Bandung, Indonesia</w:t>
-      </w:r>
-      <w:r>
-        <w:t xml:space="preserve">:</w:t>
-      </w:r>
-      <w:r>
-        <w:t xml:space="preserve"> </w:t>
-      </w:r>
-      <w:r>
-        <w:t xml:space="preserve">A</w:t>
-      </w:r>
-      <w:r>
-        <w:t xml:space="preserve"> </w:t>
-      </w:r>
-      <w:r>
-        <w:t xml:space="preserve">Repeated Cross-Sectional Standardized Patients Study.”</w:t>
+        <w:t xml:space="preserve">Ranson, Michael K, Mickey Chopra, Salla Atkins, Mario R Dal Poz, and Sara Bennett. 2010.</w:t>
+      </w:r>
+      <w:r>
+        <w:t xml:space="preserve"> </w:t>
+      </w:r>
+      <w:r>
+        <w:t xml:space="preserve">“Priorities for Research into Human Resources for Health in Low-and Middle-Income Countries.”</w:t>
       </w:r>
       <w:r>
         <w:t xml:space="preserve"> </w:t>
@@ -5386,38 +4938,41 @@
           <w:iCs/>
           <w:i/>
         </w:rPr>
-        <w:t xml:space="preserve">BMC Public Health</w:t>
-      </w:r>
-      <w:r>
-        <w:t xml:space="preserve"> </w:t>
-      </w:r>
-      <w:r>
-        <w:t xml:space="preserve">24: 102.</w:t>
+        <w:t xml:space="preserve">Bulletin of the World Health Organization</w:t>
+      </w:r>
+      <w:r>
+        <w:t xml:space="preserve"> </w:t>
+      </w:r>
+      <w:r>
+        <w:t xml:space="preserve">88: 435–43.</w:t>
       </w:r>
     </w:p>
     <w:bookmarkEnd w:id="67"/>
-    <w:bookmarkStart w:id="68" w:name="ref-zawahir2021standardised"/>
+    <w:bookmarkStart w:id="68" w:name="ref-rowe2018effectiveness"/>
     <w:p>
       <w:pPr>
         <w:pStyle w:val="Bibliography"/>
       </w:pPr>
       <w:r>
-        <w:t xml:space="preserve">Zawahir, Sinthia, Hoa Le, Thi Anh Nguyen, et al. 2021.</w:t>
-      </w:r>
-      <w:r>
-        <w:t xml:space="preserve"> </w:t>
-      </w:r>
-      <w:r>
-        <w:t xml:space="preserve">“Standardised Patient Study to Assess Tuberculosis Case Detection Within the Private Pharmacy Sector in</w:t>
-      </w:r>
-      <w:r>
-        <w:t xml:space="preserve"> </w:t>
-      </w:r>
-      <w:r>
-        <w:t xml:space="preserve">Vietnam</w:t>
-      </w:r>
-      <w:r>
-        <w:t xml:space="preserve">.”</w:t>
+        <w:t xml:space="preserve">Rowe, Alexander K, Samantha Y Rowe, David H Peters, Kathleen A Holloway, John Chalker, and Dennis Ross-Degnan. 2018.</w:t>
+      </w:r>
+      <w:r>
+        <w:t xml:space="preserve"> </w:t>
+      </w:r>
+      <w:r>
+        <w:t xml:space="preserve">“Effectiveness of Strategies to Improve Health-Care Provider Practices in Low-Income and Middle-Income Countries:</w:t>
+      </w:r>
+      <w:r>
+        <w:t xml:space="preserve"> </w:t>
+      </w:r>
+      <w:r>
+        <w:t xml:space="preserve">A</w:t>
+      </w:r>
+      <w:r>
+        <w:t xml:space="preserve"> </w:t>
+      </w:r>
+      <w:r>
+        <w:t xml:space="preserve">Systematic Review.”</w:t>
       </w:r>
       <w:r>
         <w:t xml:space="preserve"> </w:t>
@@ -5427,29 +4982,62 @@
           <w:iCs/>
           <w:i/>
         </w:rPr>
-        <w:t xml:space="preserve">BMJ Global Health</w:t>
-      </w:r>
-      <w:r>
-        <w:t xml:space="preserve"> </w:t>
-      </w:r>
-      <w:r>
-        <w:t xml:space="preserve">6.</w:t>
+        <w:t xml:space="preserve">The Lancet Global Health</w:t>
+      </w:r>
+      <w:r>
+        <w:t xml:space="preserve"> </w:t>
+      </w:r>
+      <w:r>
+        <w:t xml:space="preserve">6 (11): e1163–75.</w:t>
       </w:r>
     </w:p>
     <w:bookmarkEnd w:id="68"/>
-    <w:bookmarkStart w:id="69" w:name="ref-zeng2025embracing"/>
+    <w:bookmarkStart w:id="69" w:name="ref-sassi2024impact"/>
     <w:p>
       <w:pPr>
         <w:pStyle w:val="Bibliography"/>
       </w:pPr>
       <w:r>
-        <w:t xml:space="preserve">Zeng, Jianwen, Wenhao Qi, Shuying Shen, et al. 2025.</w:t>
-      </w:r>
-      <w:r>
-        <w:t xml:space="preserve"> </w:t>
-      </w:r>
-      <w:r>
-        <w:t xml:space="preserve">“Embracing the Future of Medical Education with Large Language Model-Based Virtual Patients: Scoping Review.”</w:t>
+        <w:t xml:space="preserve">Sassi, Angelina, Bony Wiem Lestari, Kartika Untari Nuriman El Muna, et al. 2024.</w:t>
+      </w:r>
+      <w:r>
+        <w:t xml:space="preserve"> </w:t>
+      </w:r>
+      <w:r>
+        <w:t xml:space="preserve">“Impact of the</w:t>
+      </w:r>
+      <w:r>
+        <w:t xml:space="preserve"> </w:t>
+      </w:r>
+      <w:r>
+        <w:t xml:space="preserve">COVID-19</w:t>
+      </w:r>
+      <w:r>
+        <w:t xml:space="preserve"> </w:t>
+      </w:r>
+      <w:r>
+        <w:t xml:space="preserve">Pandemic on Quality of Tuberculosis Care in Private Facilities in</w:t>
+      </w:r>
+      <w:r>
+        <w:t xml:space="preserve"> </w:t>
+      </w:r>
+      <w:r>
+        <w:t xml:space="preserve">Bandung, Indonesia</w:t>
+      </w:r>
+      <w:r>
+        <w:t xml:space="preserve">:</w:t>
+      </w:r>
+      <w:r>
+        <w:t xml:space="preserve"> </w:t>
+      </w:r>
+      <w:r>
+        <w:t xml:space="preserve">A</w:t>
+      </w:r>
+      <w:r>
+        <w:t xml:space="preserve"> </w:t>
+      </w:r>
+      <w:r>
+        <w:t xml:space="preserve">Repeated Cross-Sectional Standardized Patients Study.”</w:t>
       </w:r>
       <w:r>
         <w:t xml:space="preserve"> </w:t>
@@ -5459,53 +5047,120 @@
           <w:iCs/>
           <w:i/>
         </w:rPr>
-        <w:t xml:space="preserve">Journal of Medical Internet Research</w:t>
-      </w:r>
-      <w:r>
-        <w:t xml:space="preserve"> </w:t>
-      </w:r>
-      <w:r>
-        <w:t xml:space="preserve">27: e79091.</w:t>
+        <w:t xml:space="preserve">BMC Public Health</w:t>
+      </w:r>
+      <w:r>
+        <w:t xml:space="preserve"> </w:t>
+      </w:r>
+      <w:r>
+        <w:t xml:space="preserve">24: 102.</w:t>
       </w:r>
     </w:p>
     <w:bookmarkEnd w:id="69"/>
-    <w:bookmarkStart w:id="70" w:name="ref-zhang2024quality"/>
+    <w:bookmarkStart w:id="71" w:name="ref-surveycto2025llm"/>
     <w:p>
       <w:pPr>
         <w:pStyle w:val="Bibliography"/>
       </w:pPr>
       <w:r>
-        <w:t xml:space="preserve">Zhang, Ling, Hao Liang, Hao Luo, et al. 2024.</w:t>
-      </w:r>
-      <w:r>
-        <w:t xml:space="preserve"> </w:t>
-      </w:r>
-      <w:r>
-        <w:t xml:space="preserve">“Quality in Screening and Measuring Blood Pressure in</w:t>
-      </w:r>
-      <w:r>
-        <w:t xml:space="preserve"> </w:t>
-      </w:r>
-      <w:r>
-        <w:t xml:space="preserve">China’s</w:t>
-      </w:r>
-      <w:r>
-        <w:t xml:space="preserve"> </w:t>
-      </w:r>
-      <w:r>
-        <w:t xml:space="preserve">Primary Health Care:</w:t>
-      </w:r>
-      <w:r>
-        <w:t xml:space="preserve"> </w:t>
-      </w:r>
-      <w:r>
-        <w:t xml:space="preserve">A</w:t>
-      </w:r>
-      <w:r>
-        <w:t xml:space="preserve"> </w:t>
-      </w:r>
-      <w:r>
-        <w:t xml:space="preserve">National Cross-Sectional Study Using Unannounced Standardized Patients.”</w:t>
+        <w:t xml:space="preserve">SurveyCTO (Dobility, Inc.). 2025.</w:t>
+      </w:r>
+      <w:r>
+        <w:t xml:space="preserve"> </w:t>
+      </w:r>
+      <w:r>
+        <w:t xml:space="preserve">“</w:t>
+      </w:r>
+      <w:r>
+        <w:t xml:space="preserve">LLM Conversations</w:t>
+      </w:r>
+      <w:r>
+        <w:t xml:space="preserve">:</w:t>
+      </w:r>
+      <w:r>
+        <w:t xml:space="preserve"> </w:t>
+      </w:r>
+      <w:r>
+        <w:t xml:space="preserve">SurveyCTO</w:t>
+      </w:r>
+      <w:r>
+        <w:t xml:space="preserve"> </w:t>
+      </w:r>
+      <w:r>
+        <w:t xml:space="preserve">Field Plugin for Conversational</w:t>
+      </w:r>
+      <w:r>
+        <w:t xml:space="preserve"> </w:t>
+      </w:r>
+      <w:r>
+        <w:t xml:space="preserve">AI</w:t>
+      </w:r>
+      <w:r>
+        <w:t xml:space="preserve"> </w:t>
+      </w:r>
+      <w:r>
+        <w:t xml:space="preserve">Interactions.”</w:t>
+      </w:r>
+      <w:r>
+        <w:t xml:space="preserve"> </w:t>
+      </w:r>
+      <w:hyperlink r:id="rId70">
+        <w:r>
+          <w:rPr>
+            <w:rStyle w:val="Hyperlink"/>
+          </w:rPr>
+          <w:t xml:space="preserve">https://github.com/surveycto/llm-conversations</w:t>
+        </w:r>
+      </w:hyperlink>
+      <w:r>
+        <w:t xml:space="preserve">.</w:t>
+      </w:r>
+    </w:p>
+    <w:bookmarkEnd w:id="71"/>
+    <w:bookmarkStart w:id="72" w:name="ref-who2022global"/>
+    <w:p>
+      <w:pPr>
+        <w:pStyle w:val="Bibliography"/>
+      </w:pPr>
+      <w:r>
+        <w:t xml:space="preserve">World Health Organization. 2022.</w:t>
+      </w:r>
+      <w:r>
+        <w:t xml:space="preserve"> </w:t>
+      </w:r>
+      <w:r>
+        <w:t xml:space="preserve">“Global Competency and Outcomes Framework for Universal Health Coverage.”</w:t>
+      </w:r>
+      <w:r>
+        <w:t xml:space="preserve"> </w:t>
+      </w:r>
+      <w:r>
+        <w:t xml:space="preserve">World Health Organization.</w:t>
+      </w:r>
+    </w:p>
+    <w:bookmarkEnd w:id="72"/>
+    <w:bookmarkStart w:id="73" w:name="ref-zawahir2021standardised"/>
+    <w:p>
+      <w:pPr>
+        <w:pStyle w:val="Bibliography"/>
+      </w:pPr>
+      <w:r>
+        <w:t xml:space="preserve">Zawahir, Sinthia, Hoa Le, Thi Anh Nguyen, et al. 2021.</w:t>
+      </w:r>
+      <w:r>
+        <w:t xml:space="preserve"> </w:t>
+      </w:r>
+      <w:r>
+        <w:t xml:space="preserve">“Standardised Patient Study to Assess Tuberculosis Case Detection Within the Private Pharmacy Sector in</w:t>
+      </w:r>
+      <w:r>
+        <w:t xml:space="preserve"> </w:t>
+      </w:r>
+      <w:r>
+        <w:t xml:space="preserve">Vietnam</w:t>
+      </w:r>
+      <w:r>
+        <w:t xml:space="preserve">.”</w:t>
       </w:r>
       <w:r>
         <w:t xml:space="preserve"> </w:t>
@@ -5515,6 +5170,106 @@
           <w:iCs/>
           <w:i/>
         </w:rPr>
+        <w:t xml:space="preserve">BMJ Global Health</w:t>
+      </w:r>
+      <w:r>
+        <w:t xml:space="preserve"> </w:t>
+      </w:r>
+      <w:r>
+        <w:t xml:space="preserve">6.</w:t>
+      </w:r>
+    </w:p>
+    <w:bookmarkEnd w:id="73"/>
+    <w:bookmarkStart w:id="74" w:name="ref-zeng2025embracing"/>
+    <w:p>
+      <w:pPr>
+        <w:pStyle w:val="Bibliography"/>
+      </w:pPr>
+      <w:r>
+        <w:t xml:space="preserve">Zeng, Jianwen, Wenhao Qi, Shiying Shen, et al. 2025.</w:t>
+      </w:r>
+      <w:r>
+        <w:t xml:space="preserve"> </w:t>
+      </w:r>
+      <w:r>
+        <w:t xml:space="preserve">“Embracing the Future of Medical Education with Large Language Model-Based Virtual Patients:</w:t>
+      </w:r>
+      <w:r>
+        <w:t xml:space="preserve"> </w:t>
+      </w:r>
+      <w:r>
+        <w:t xml:space="preserve">Scoping</w:t>
+      </w:r>
+      <w:r>
+        <w:t xml:space="preserve"> </w:t>
+      </w:r>
+      <w:r>
+        <w:t xml:space="preserve">Review.”</w:t>
+      </w:r>
+      <w:r>
+        <w:t xml:space="preserve"> </w:t>
+      </w:r>
+      <w:r>
+        <w:rPr>
+          <w:iCs/>
+          <w:i/>
+        </w:rPr>
+        <w:t xml:space="preserve">Journal of Medical Internet Research</w:t>
+      </w:r>
+      <w:r>
+        <w:t xml:space="preserve"> </w:t>
+      </w:r>
+      <w:r>
+        <w:t xml:space="preserve">27: e79091.</w:t>
+      </w:r>
+    </w:p>
+    <w:bookmarkEnd w:id="74"/>
+    <w:bookmarkStart w:id="75" w:name="ref-zhang2024quality"/>
+    <w:p>
+      <w:pPr>
+        <w:pStyle w:val="Bibliography"/>
+      </w:pPr>
+      <w:r>
+        <w:t xml:space="preserve">Zhang, Lanping, Huijuan Liang, Huanyuan Luo, et al. 2024.</w:t>
+      </w:r>
+      <w:r>
+        <w:t xml:space="preserve"> </w:t>
+      </w:r>
+      <w:r>
+        <w:t xml:space="preserve">“Quality in Screening and Measuring Blood Pressure in</w:t>
+      </w:r>
+      <w:r>
+        <w:t xml:space="preserve"> </w:t>
+      </w:r>
+      <w:r>
+        <w:t xml:space="preserve">China’s</w:t>
+      </w:r>
+      <w:r>
+        <w:t xml:space="preserve"> </w:t>
+      </w:r>
+      <w:r>
+        <w:t xml:space="preserve">Primary Health Care:</w:t>
+      </w:r>
+      <w:r>
+        <w:t xml:space="preserve"> </w:t>
+      </w:r>
+      <w:r>
+        <w:t xml:space="preserve">A</w:t>
+      </w:r>
+      <w:r>
+        <w:t xml:space="preserve"> </w:t>
+      </w:r>
+      <w:r>
+        <w:t xml:space="preserve">National Cross-Sectional Study Using Unannounced Standardized Patients.”</w:t>
+      </w:r>
+      <w:r>
+        <w:t xml:space="preserve"> </w:t>
+      </w:r>
+      <w:r>
+        <w:rPr>
+          <w:iCs/>
+          <w:i/>
+        </w:rPr>
         <w:t xml:space="preserve">The Lancet Regional Health – Western Pacific</w:t>
       </w:r>
       <w:r>
@@ -5524,9 +5279,64 @@
         <w:t xml:space="preserve">43.</w:t>
       </w:r>
     </w:p>
-    <w:bookmarkEnd w:id="70"/>
-    <w:bookmarkEnd w:id="71"/>
-    <w:bookmarkEnd w:id="72"/>
+    <w:bookmarkEnd w:id="75"/>
+    <w:bookmarkStart w:id="77" w:name="ref-zhang2026scoping"/>
+    <w:p>
+      <w:pPr>
+        <w:pStyle w:val="Bibliography"/>
+      </w:pPr>
+      <w:r>
+        <w:t xml:space="preserve">Zhang, Wenjia(Stella), Benjamin Daniels, Carol Mita, Hoang Nguyen, and David B Duong. 2026.</w:t>
+      </w:r>
+      <w:r>
+        <w:t xml:space="preserve"> </w:t>
+      </w:r>
+      <w:r>
+        <w:t xml:space="preserve">“Artificial Intelligence for Clinical Competency Assessment:</w:t>
+      </w:r>
+      <w:r>
+        <w:t xml:space="preserve"> </w:t>
+      </w:r>
+      <w:r>
+        <w:t xml:space="preserve">A</w:t>
+      </w:r>
+      <w:r>
+        <w:t xml:space="preserve"> </w:t>
+      </w:r>
+      <w:r>
+        <w:t xml:space="preserve">Scoping Review of Methods and Applications.”</w:t>
+      </w:r>
+      <w:r>
+        <w:t xml:space="preserve"> </w:t>
+      </w:r>
+      <w:r>
+        <w:rPr>
+          <w:iCs/>
+          <w:i/>
+        </w:rPr>
+        <w:t xml:space="preserve">JMIR Medical Education</w:t>
+      </w:r>
+      <w:r>
+        <w:t xml:space="preserve">.</w:t>
+      </w:r>
+      <w:r>
+        <w:t xml:space="preserve"> </w:t>
+      </w:r>
+      <w:hyperlink r:id="rId76">
+        <w:r>
+          <w:rPr>
+            <w:rStyle w:val="Hyperlink"/>
+          </w:rPr>
+          <w:t xml:space="preserve">https://doi.org/10.2196/preprints.92826</w:t>
+        </w:r>
+      </w:hyperlink>
+      <w:r>
+        <w:t xml:space="preserve">.</w:t>
+      </w:r>
+    </w:p>
+    <w:bookmarkEnd w:id="77"/>
+    <w:bookmarkEnd w:id="78"/>
+    <w:bookmarkEnd w:id="79"/>
     <w:sectPr/>
   </w:body>
 </w:document>

</xml_diff>

<commit_message>
Remove supporting info listing, trim discussion costing, recompile
Co-Authored-By: Claude Opus 4.6 <noreply@anthropic.com>
</commit_message>
<xml_diff>
--- a/manuscript/main.docx
+++ b/manuscript/main.docx
@@ -3453,7 +3453,7 @@
         <w:t xml:space="preserve">(Das and Hammer 2005)</w:t>
       </w:r>
       <w:r>
-        <w:t xml:space="preserve">. The platform’s practical utility is substantial: 132 clinical interactions were completed at a total chatbot cost of under USD 2, with no in-person support beyond a brief Zoom orientation. Including human coding of transcripts, the total cost of the validation exercise was approximately USD 15 per provider – an order of magnitude less than traditional in-person vignette surveys, which typically require two trained enumerators per interaction plus travel and per diem costs</w:t>
+        <w:t xml:space="preserve">. The platform’s practical utility is substantial: 132 clinical interactions were completed at a total chatbot cost of under USD 2, with no in-person support beyond a brief Zoom orientation – a fraction of the cost of traditional in-person vignette surveys, which typically require two trained enumerators per interaction plus travel and per diem costs</w:t>
       </w:r>
       <w:r>
         <w:t xml:space="preserve"> </w:t>
@@ -4035,7 +4035,7 @@
       </w:r>
     </w:p>
     <w:bookmarkEnd w:id="49"/>
-    <w:bookmarkStart w:id="50" w:name="financial-disclosure"/>
+    <w:bookmarkStart w:id="78" w:name="financial-disclosure"/>
     <w:p>
       <w:pPr>
         <w:pStyle w:val="Heading1"/>
@@ -4052,144 +4052,8 @@
         <w:t xml:space="preserve">This work was supported by the Harvard University Asia Center, the Harvard University Rose Service Learning Fellowship program, the Harvard University Institute for Quantitative Social Science, and Gilead Sciences. The funders had no role in study design, data collection and analysis, decision to publish, or preparation of the manuscript.</w:t>
       </w:r>
     </w:p>
-    <w:bookmarkEnd w:id="50"/>
-    <w:bookmarkStart w:id="79" w:name="supporting-information"/>
-    <w:p>
-      <w:pPr>
-        <w:pStyle w:val="Heading1"/>
-      </w:pPr>
-      <w:r>
-        <w:t xml:space="preserve">Supporting information</w:t>
-      </w:r>
-    </w:p>
-    <w:p>
-      <w:pPr>
-        <w:pStyle w:val="FirstParagraph"/>
-      </w:pPr>
-      <w:r>
-        <w:rPr>
-          <w:bCs/>
-          <w:b/>
-        </w:rPr>
-        <w:t xml:space="preserve">S1 Appendix.</w:t>
-      </w:r>
-      <w:r>
-        <w:t xml:space="preserve"> </w:t>
-      </w:r>
-      <w:r>
-        <w:t xml:space="preserve">Clinical case scenarios and essential diagnostic checklists for all ten vignette cases, supplementary tables, and focus group supplementary results.</w:t>
-      </w:r>
-    </w:p>
-    <w:p>
-      <w:pPr>
-        <w:pStyle w:val="BodyText"/>
-      </w:pPr>
-      <w:r>
-        <w:rPr>
-          <w:bCs/>
-          <w:b/>
-        </w:rPr>
-        <w:t xml:space="preserve">Table S1.</w:t>
-      </w:r>
-      <w:r>
-        <w:t xml:space="preserve"> </w:t>
-      </w:r>
-      <w:r>
-        <w:t xml:space="preserve">Case scenarios and realism ratings from the focus group, including opening statements, recommended treatment, and mean realism ratings across four dimensions.</w:t>
-      </w:r>
-    </w:p>
-    <w:p>
-      <w:pPr>
-        <w:pStyle w:val="BodyText"/>
-      </w:pPr>
-      <w:r>
-        <w:rPr>
-          <w:bCs/>
-          <w:b/>
-        </w:rPr>
-        <w:t xml:space="preserve">Table S2.</w:t>
-      </w:r>
-      <w:r>
-        <w:t xml:space="preserve"> </w:t>
-      </w:r>
-      <w:r>
-        <w:t xml:space="preserve">Summary of provider performance by case in the validation sample, including checklist completion, correct diagnosis rates, and interaction duration.</w:t>
-      </w:r>
-    </w:p>
-    <w:p>
-      <w:pPr>
-        <w:pStyle w:val="BodyText"/>
-      </w:pPr>
-      <w:r>
-        <w:rPr>
-          <w:bCs/>
-          <w:b/>
-        </w:rPr>
-        <w:t xml:space="preserve">Figure S1.</w:t>
-      </w:r>
-      <w:r>
-        <w:t xml:space="preserve"> </w:t>
-      </w:r>
-      <w:r>
-        <w:t xml:space="preserve">Average realism rating by condition and feedback question in the focus group.</w:t>
-      </w:r>
-    </w:p>
-    <w:p>
-      <w:pPr>
-        <w:pStyle w:val="BodyText"/>
-      </w:pPr>
-      <w:r>
-        <w:rPr>
-          <w:bCs/>
-          <w:b/>
-        </w:rPr>
-        <w:t xml:space="preserve">Figure S2.</w:t>
-      </w:r>
-      <w:r>
-        <w:t xml:space="preserve"> </w:t>
-      </w:r>
-      <w:r>
-        <w:t xml:space="preserve">Average case duration by condition in the focus group.</w:t>
-      </w:r>
-    </w:p>
-    <w:p>
-      <w:pPr>
-        <w:pStyle w:val="BodyText"/>
-      </w:pPr>
-      <w:r>
-        <w:rPr>
-          <w:bCs/>
-          <w:b/>
-        </w:rPr>
-        <w:t xml:space="preserve">Figure S3.</w:t>
-      </w:r>
-      <w:r>
-        <w:t xml:space="preserve"> </w:t>
-      </w:r>
-      <w:r>
-        <w:t xml:space="preserve">Distribution of focus group realism ratings by feedback question.</w:t>
-      </w:r>
-    </w:p>
-    <w:p>
-      <w:pPr>
-        <w:pStyle w:val="BodyText"/>
-      </w:pPr>
-      <w:r>
-        <w:rPr>
-          <w:bCs/>
-          <w:b/>
-        </w:rPr>
-        <w:t xml:space="preserve">S1 Checklist.</w:t>
-      </w:r>
-      <w:r>
-        <w:t xml:space="preserve"> </w:t>
-      </w:r>
-      <w:r>
-        <w:t xml:space="preserve">STROBE checklist for observational studies.</w:t>
-      </w:r>
-    </w:p>
-    <w:bookmarkStart w:id="78" w:name="refs"/>
-    <w:bookmarkStart w:id="51" w:name="ref-andrews2021quality"/>
+    <w:bookmarkStart w:id="77" w:name="refs"/>
+    <w:bookmarkStart w:id="50" w:name="ref-andrews2021quality"/>
     <w:p>
       <w:pPr>
         <w:pStyle w:val="Bibliography"/>
@@ -4281,8 +4145,8 @@
         <w:t xml:space="preserve">. World Bank Publications.</w:t>
       </w:r>
     </w:p>
-    <w:bookmarkEnd w:id="51"/>
-    <w:bookmarkStart w:id="52" w:name="ref-cook2025virtual"/>
+    <w:bookmarkEnd w:id="50"/>
+    <w:bookmarkStart w:id="51" w:name="ref-cook2025virtual"/>
     <w:p>
       <w:pPr>
         <w:pStyle w:val="Bibliography"/>
@@ -4322,8 +4186,8 @@
         <w:t xml:space="preserve">27: e68486.</w:t>
       </w:r>
     </w:p>
-    <w:bookmarkEnd w:id="52"/>
-    <w:bookmarkStart w:id="53" w:name="ref-daniels2024medical"/>
+    <w:bookmarkEnd w:id="51"/>
+    <w:bookmarkStart w:id="52" w:name="ref-daniels2024medical"/>
     <w:p>
       <w:pPr>
         <w:pStyle w:val="Bibliography"/>
@@ -4375,8 +4239,8 @@
         <w:t xml:space="preserve">2: qxae066.</w:t>
       </w:r>
     </w:p>
-    <w:bookmarkEnd w:id="53"/>
-    <w:bookmarkStart w:id="54" w:name="ref-das2022two"/>
+    <w:bookmarkEnd w:id="52"/>
+    <w:bookmarkStart w:id="53" w:name="ref-das2022two"/>
     <w:p>
       <w:pPr>
         <w:pStyle w:val="Bibliography"/>
@@ -4437,8 +4301,8 @@
         <w:t xml:space="preserve">301: 112799.</w:t>
       </w:r>
     </w:p>
-    <w:bookmarkEnd w:id="54"/>
-    <w:bookmarkStart w:id="55" w:name="ref-das2023prices"/>
+    <w:bookmarkEnd w:id="53"/>
+    <w:bookmarkStart w:id="54" w:name="ref-das2023prices"/>
     <w:p>
       <w:pPr>
         <w:pStyle w:val="Bibliography"/>
@@ -4478,8 +4342,8 @@
         <w:t xml:space="preserve">37 (2): 123–52.</w:t>
       </w:r>
     </w:p>
-    <w:bookmarkEnd w:id="55"/>
-    <w:bookmarkStart w:id="56" w:name="ref-das2005which"/>
+    <w:bookmarkEnd w:id="54"/>
+    <w:bookmarkStart w:id="55" w:name="ref-das2005which"/>
     <w:p>
       <w:pPr>
         <w:pStyle w:val="Bibliography"/>
@@ -4519,8 +4383,8 @@
         <w:t xml:space="preserve">78 (2): 348–83.</w:t>
       </w:r>
     </w:p>
-    <w:bookmarkEnd w:id="56"/>
-    <w:bookmarkStart w:id="57" w:name="ref-das2007money"/>
+    <w:bookmarkEnd w:id="55"/>
+    <w:bookmarkStart w:id="56" w:name="ref-das2007money"/>
     <w:p>
       <w:pPr>
         <w:pStyle w:val="Bibliography"/>
@@ -4569,57 +4433,57 @@
         <w:t xml:space="preserve">83 (1): 1–36.</w:t>
       </w:r>
     </w:p>
+    <w:bookmarkEnd w:id="56"/>
+    <w:bookmarkStart w:id="57" w:name="ref-demombynes2016quality"/>
+    <w:p>
+      <w:pPr>
+        <w:pStyle w:val="Bibliography"/>
+      </w:pPr>
+      <w:r>
+        <w:t xml:space="preserve">Demombynes, Gabriel, Kari Hurt, Jishnu Das, Obert Pimhidzai, Huong Lan Dao, Ha Thi Ngoc Tran, and Benjamin Daniels. 2016.</w:t>
+      </w:r>
+      <w:r>
+        <w:t xml:space="preserve"> </w:t>
+      </w:r>
+      <w:r>
+        <w:t xml:space="preserve">“Quality and Equity in Basic Health Care Services in</w:t>
+      </w:r>
+      <w:r>
+        <w:t xml:space="preserve"> </w:t>
+      </w:r>
+      <w:r>
+        <w:t xml:space="preserve">Vietnam</w:t>
+      </w:r>
+      <w:r>
+        <w:t xml:space="preserve">:</w:t>
+      </w:r>
+      <w:r>
+        <w:t xml:space="preserve"> </w:t>
+      </w:r>
+      <w:r>
+        <w:t xml:space="preserve">F</w:t>
+      </w:r>
+      <w:r>
+        <w:t xml:space="preserve">indings from the</w:t>
+      </w:r>
+      <w:r>
+        <w:t xml:space="preserve"> </w:t>
+      </w:r>
+      <w:r>
+        <w:t xml:space="preserve">Vietnam District and Commune Health Facility Survey</w:t>
+      </w:r>
+      <w:r>
+        <w:t xml:space="preserve">.”</w:t>
+      </w:r>
+      <w:r>
+        <w:t xml:space="preserve"> </w:t>
+      </w:r>
+      <w:r>
+        <w:t xml:space="preserve">World Bank.</w:t>
+      </w:r>
+    </w:p>
     <w:bookmarkEnd w:id="57"/>
-    <w:bookmarkStart w:id="58" w:name="ref-demombynes2016quality"/>
-    <w:p>
-      <w:pPr>
-        <w:pStyle w:val="Bibliography"/>
-      </w:pPr>
-      <w:r>
-        <w:t xml:space="preserve">Demombynes, Gabriel, Kari Hurt, Jishnu Das, Obert Pimhidzai, Huong Lan Dao, Ha Thi Ngoc Tran, and Benjamin Daniels. 2016.</w:t>
-      </w:r>
-      <w:r>
-        <w:t xml:space="preserve"> </w:t>
-      </w:r>
-      <w:r>
-        <w:t xml:space="preserve">“Quality and Equity in Basic Health Care Services in</w:t>
-      </w:r>
-      <w:r>
-        <w:t xml:space="preserve"> </w:t>
-      </w:r>
-      <w:r>
-        <w:t xml:space="preserve">Vietnam</w:t>
-      </w:r>
-      <w:r>
-        <w:t xml:space="preserve">:</w:t>
-      </w:r>
-      <w:r>
-        <w:t xml:space="preserve"> </w:t>
-      </w:r>
-      <w:r>
-        <w:t xml:space="preserve">F</w:t>
-      </w:r>
-      <w:r>
-        <w:t xml:space="preserve">indings from the</w:t>
-      </w:r>
-      <w:r>
-        <w:t xml:space="preserve"> </w:t>
-      </w:r>
-      <w:r>
-        <w:t xml:space="preserve">Vietnam District and Commune Health Facility Survey</w:t>
-      </w:r>
-      <w:r>
-        <w:t xml:space="preserve">.”</w:t>
-      </w:r>
-      <w:r>
-        <w:t xml:space="preserve"> </w:t>
-      </w:r>
-      <w:r>
-        <w:t xml:space="preserve">World Bank.</w:t>
-      </w:r>
-    </w:p>
-    <w:bookmarkEnd w:id="58"/>
-    <w:bookmarkStart w:id="60" w:name="ref-geathers2025benchmarking"/>
+    <w:bookmarkStart w:id="59" w:name="ref-geathers2025benchmarking"/>
     <w:p>
       <w:pPr>
         <w:pStyle w:val="Bibliography"/>
@@ -4673,7 +4537,7 @@
       <w:r>
         <w:t xml:space="preserve"> </w:t>
       </w:r>
-      <w:hyperlink r:id="rId59">
+      <w:hyperlink r:id="rId58">
         <w:r>
           <w:rPr>
             <w:rStyle w:val="Hyperlink"/>
@@ -4685,8 +4549,8 @@
         <w:t xml:space="preserve">.</w:t>
       </w:r>
     </w:p>
-    <w:bookmarkEnd w:id="60"/>
-    <w:bookmarkStart w:id="61" w:name="ref-geiecke2024conversations"/>
+    <w:bookmarkEnd w:id="59"/>
+    <w:bookmarkStart w:id="60" w:name="ref-geiecke2024conversations"/>
     <w:p>
       <w:pPr>
         <w:pStyle w:val="Bibliography"/>
@@ -4732,8 +4596,8 @@
         <w:t xml:space="preserve">, Forthcoming.</w:t>
       </w:r>
     </w:p>
-    <w:bookmarkEnd w:id="61"/>
-    <w:bookmarkStart w:id="62" w:name="ref-harrison2015patient"/>
+    <w:bookmarkEnd w:id="60"/>
+    <w:bookmarkStart w:id="61" w:name="ref-harrison2015patient"/>
     <w:p>
       <w:pPr>
         <w:pStyle w:val="Bibliography"/>
@@ -4785,30 +4649,30 @@
         <w:t xml:space="preserve">27 (4): 240–54.</w:t>
       </w:r>
     </w:p>
+    <w:bookmarkEnd w:id="61"/>
+    <w:bookmarkStart w:id="62" w:name="ref-ibnat2019three"/>
+    <w:p>
+      <w:pPr>
+        <w:pStyle w:val="Bibliography"/>
+      </w:pPr>
+      <w:r>
+        <w:t xml:space="preserve">Ibnat, Farwa, Kenneth L Leonard, Luke Bawo, and Rosemond L Mohammed-Roberts. 2019.</w:t>
+      </w:r>
+      <w:r>
+        <w:t xml:space="preserve"> </w:t>
+      </w:r>
+      <w:r>
+        <w:t xml:space="preserve">“The Three-Gap Model of Health Worker Performance.”</w:t>
+      </w:r>
+      <w:r>
+        <w:t xml:space="preserve"> </w:t>
+      </w:r>
+      <w:r>
+        <w:t xml:space="preserve">World Bank Policy Research Working Paper.</w:t>
+      </w:r>
+    </w:p>
     <w:bookmarkEnd w:id="62"/>
-    <w:bookmarkStart w:id="63" w:name="ref-ibnat2019three"/>
-    <w:p>
-      <w:pPr>
-        <w:pStyle w:val="Bibliography"/>
-      </w:pPr>
-      <w:r>
-        <w:t xml:space="preserve">Ibnat, Farwa, Kenneth L Leonard, Luke Bawo, and Rosemond L Mohammed-Roberts. 2019.</w:t>
-      </w:r>
-      <w:r>
-        <w:t xml:space="preserve"> </w:t>
-      </w:r>
-      <w:r>
-        <w:t xml:space="preserve">“The Three-Gap Model of Health Worker Performance.”</w:t>
-      </w:r>
-      <w:r>
-        <w:t xml:space="preserve"> </w:t>
-      </w:r>
-      <w:r>
-        <w:t xml:space="preserve">World Bank Policy Research Working Paper.</w:t>
-      </w:r>
-    </w:p>
-    <w:bookmarkEnd w:id="63"/>
-    <w:bookmarkStart w:id="64" w:name="ref-kuling2026assessment"/>
+    <w:bookmarkStart w:id="63" w:name="ref-kuling2026assessment"/>
     <w:p>
       <w:pPr>
         <w:pStyle w:val="Bibliography"/>
@@ -4851,8 +4715,8 @@
         <w:t xml:space="preserve">3 (2).</w:t>
       </w:r>
     </w:p>
-    <w:bookmarkEnd w:id="64"/>
-    <w:bookmarkStart w:id="65" w:name="ref-leonard2005use"/>
+    <w:bookmarkEnd w:id="63"/>
+    <w:bookmarkStart w:id="64" w:name="ref-leonard2005use"/>
     <w:p>
       <w:pPr>
         <w:pStyle w:val="Bibliography"/>
@@ -4883,8 +4747,8 @@
         <w:t xml:space="preserve">61 (9): 1944–51.</w:t>
       </w:r>
     </w:p>
-    <w:bookmarkEnd w:id="65"/>
-    <w:bookmarkStart w:id="66" w:name="ref-lilford2025policy"/>
+    <w:bookmarkEnd w:id="64"/>
+    <w:bookmarkStart w:id="65" w:name="ref-lilford2025policy"/>
     <w:p>
       <w:pPr>
         <w:pStyle w:val="Bibliography"/>
@@ -4915,8 +4779,8 @@
         <w:t xml:space="preserve">13: e954–66.</w:t>
       </w:r>
     </w:p>
-    <w:bookmarkEnd w:id="66"/>
-    <w:bookmarkStart w:id="67" w:name="ref-ranson2010priorities"/>
+    <w:bookmarkEnd w:id="65"/>
+    <w:bookmarkStart w:id="66" w:name="ref-ranson2010priorities"/>
     <w:p>
       <w:pPr>
         <w:pStyle w:val="Bibliography"/>
@@ -4947,8 +4811,8 @@
         <w:t xml:space="preserve">88: 435–43.</w:t>
       </w:r>
     </w:p>
-    <w:bookmarkEnd w:id="67"/>
-    <w:bookmarkStart w:id="68" w:name="ref-rowe2018effectiveness"/>
+    <w:bookmarkEnd w:id="66"/>
+    <w:bookmarkStart w:id="67" w:name="ref-rowe2018effectiveness"/>
     <w:p>
       <w:pPr>
         <w:pStyle w:val="Bibliography"/>
@@ -4991,8 +4855,8 @@
         <w:t xml:space="preserve">6 (11): e1163–75.</w:t>
       </w:r>
     </w:p>
-    <w:bookmarkEnd w:id="68"/>
-    <w:bookmarkStart w:id="69" w:name="ref-sassi2024impact"/>
+    <w:bookmarkEnd w:id="67"/>
+    <w:bookmarkStart w:id="68" w:name="ref-sassi2024impact"/>
     <w:p>
       <w:pPr>
         <w:pStyle w:val="Bibliography"/>
@@ -5056,8 +4920,8 @@
         <w:t xml:space="preserve">24: 102.</w:t>
       </w:r>
     </w:p>
-    <w:bookmarkEnd w:id="69"/>
-    <w:bookmarkStart w:id="71" w:name="ref-surveycto2025llm"/>
+    <w:bookmarkEnd w:id="68"/>
+    <w:bookmarkStart w:id="70" w:name="ref-surveycto2025llm"/>
     <w:p>
       <w:pPr>
         <w:pStyle w:val="Bibliography"/>
@@ -5104,7 +4968,7 @@
       <w:r>
         <w:t xml:space="preserve"> </w:t>
       </w:r>
-      <w:hyperlink r:id="rId70">
+      <w:hyperlink r:id="rId69">
         <w:r>
           <w:rPr>
             <w:rStyle w:val="Hyperlink"/>
@@ -5116,30 +4980,30 @@
         <w:t xml:space="preserve">.</w:t>
       </w:r>
     </w:p>
+    <w:bookmarkEnd w:id="70"/>
+    <w:bookmarkStart w:id="71" w:name="ref-who2022global"/>
+    <w:p>
+      <w:pPr>
+        <w:pStyle w:val="Bibliography"/>
+      </w:pPr>
+      <w:r>
+        <w:t xml:space="preserve">World Health Organization. 2022.</w:t>
+      </w:r>
+      <w:r>
+        <w:t xml:space="preserve"> </w:t>
+      </w:r>
+      <w:r>
+        <w:t xml:space="preserve">“Global Competency and Outcomes Framework for Universal Health Coverage.”</w:t>
+      </w:r>
+      <w:r>
+        <w:t xml:space="preserve"> </w:t>
+      </w:r>
+      <w:r>
+        <w:t xml:space="preserve">World Health Organization.</w:t>
+      </w:r>
+    </w:p>
     <w:bookmarkEnd w:id="71"/>
-    <w:bookmarkStart w:id="72" w:name="ref-who2022global"/>
-    <w:p>
-      <w:pPr>
-        <w:pStyle w:val="Bibliography"/>
-      </w:pPr>
-      <w:r>
-        <w:t xml:space="preserve">World Health Organization. 2022.</w:t>
-      </w:r>
-      <w:r>
-        <w:t xml:space="preserve"> </w:t>
-      </w:r>
-      <w:r>
-        <w:t xml:space="preserve">“Global Competency and Outcomes Framework for Universal Health Coverage.”</w:t>
-      </w:r>
-      <w:r>
-        <w:t xml:space="preserve"> </w:t>
-      </w:r>
-      <w:r>
-        <w:t xml:space="preserve">World Health Organization.</w:t>
-      </w:r>
-    </w:p>
-    <w:bookmarkEnd w:id="72"/>
-    <w:bookmarkStart w:id="73" w:name="ref-zawahir2021standardised"/>
+    <w:bookmarkStart w:id="72" w:name="ref-zawahir2021standardised"/>
     <w:p>
       <w:pPr>
         <w:pStyle w:val="Bibliography"/>
@@ -5179,8 +5043,8 @@
         <w:t xml:space="preserve">6.</w:t>
       </w:r>
     </w:p>
-    <w:bookmarkEnd w:id="73"/>
-    <w:bookmarkStart w:id="74" w:name="ref-zeng2025embracing"/>
+    <w:bookmarkEnd w:id="72"/>
+    <w:bookmarkStart w:id="73" w:name="ref-zeng2025embracing"/>
     <w:p>
       <w:pPr>
         <w:pStyle w:val="Bibliography"/>
@@ -5223,8 +5087,8 @@
         <w:t xml:space="preserve">27: e79091.</w:t>
       </w:r>
     </w:p>
-    <w:bookmarkEnd w:id="74"/>
-    <w:bookmarkStart w:id="75" w:name="ref-zhang2024quality"/>
+    <w:bookmarkEnd w:id="73"/>
+    <w:bookmarkStart w:id="74" w:name="ref-zhang2024quality"/>
     <w:p>
       <w:pPr>
         <w:pStyle w:val="Bibliography"/>
@@ -5279,8 +5143,8 @@
         <w:t xml:space="preserve">43.</w:t>
       </w:r>
     </w:p>
-    <w:bookmarkEnd w:id="75"/>
-    <w:bookmarkStart w:id="77" w:name="ref-zhang2026scoping"/>
+    <w:bookmarkEnd w:id="74"/>
+    <w:bookmarkStart w:id="76" w:name="ref-zhang2026scoping"/>
     <w:p>
       <w:pPr>
         <w:pStyle w:val="Bibliography"/>
@@ -5322,7 +5186,7 @@
       <w:r>
         <w:t xml:space="preserve"> </w:t>
       </w:r>
-      <w:hyperlink r:id="rId76">
+      <w:hyperlink r:id="rId75">
         <w:r>
           <w:rPr>
             <w:rStyle w:val="Hyperlink"/>
@@ -5334,9 +5198,9 @@
         <w:t xml:space="preserve">.</w:t>
       </w:r>
     </w:p>
+    <w:bookmarkEnd w:id="76"/>
     <w:bookmarkEnd w:id="77"/>
     <w:bookmarkEnd w:id="78"/>
-    <w:bookmarkEnd w:id="79"/>
     <w:sectPr/>
   </w:body>
 </w:document>

</xml_diff>